<commit_message>
Überarbeitung von Kapitel 10 abgeschlossen
</commit_message>
<xml_diff>
--- a/Doc/Arbeitsblaetter_2026.docx
+++ b/Doc/Arbeitsblaetter_2026.docx
@@ -380,7 +380,7 @@
       <w:r>
         <w:fldChar w:fldCharType="separate"/>
       </w:r>
-      <w:hyperlink w:anchor="_Toc236167767" w:history="1">
+      <w:hyperlink w:anchor="_Toc236246091" w:history="1">
         <w:r>
           <w:rPr>
             <w:rStyle w:val="Hyperlink"/>
@@ -407,7 +407,7 @@
             <w:noProof/>
             <w:webHidden/>
           </w:rPr>
-          <w:instrText xml:space="preserve"> PAGEREF _Toc236167767 \h </w:instrText>
+          <w:instrText xml:space="preserve"> PAGEREF _Toc236246091 \h </w:instrText>
         </w:r>
         <w:r>
           <w:rPr>
@@ -449,7 +449,7 @@
           <w:lang w:eastAsia="de-DE"/>
         </w:rPr>
       </w:pPr>
-      <w:hyperlink w:anchor="_Toc236167768" w:history="1">
+      <w:hyperlink w:anchor="_Toc236246092" w:history="1">
         <w:r>
           <w:rPr>
             <w:rStyle w:val="Hyperlink"/>
@@ -476,7 +476,7 @@
             <w:noProof/>
             <w:webHidden/>
           </w:rPr>
-          <w:instrText xml:space="preserve"> PAGEREF _Toc236167768 \h </w:instrText>
+          <w:instrText xml:space="preserve"> PAGEREF _Toc236246092 \h </w:instrText>
         </w:r>
         <w:r>
           <w:rPr>
@@ -518,7 +518,7 @@
           <w:lang w:eastAsia="de-DE"/>
         </w:rPr>
       </w:pPr>
-      <w:hyperlink w:anchor="_Toc236167769" w:history="1">
+      <w:hyperlink w:anchor="_Toc236246093" w:history="1">
         <w:r>
           <w:rPr>
             <w:rStyle w:val="Hyperlink"/>
@@ -545,7 +545,7 @@
             <w:noProof/>
             <w:webHidden/>
           </w:rPr>
-          <w:instrText xml:space="preserve"> PAGEREF _Toc236167769 \h </w:instrText>
+          <w:instrText xml:space="preserve"> PAGEREF _Toc236246093 \h </w:instrText>
         </w:r>
         <w:r>
           <w:rPr>
@@ -587,7 +587,7 @@
           <w:lang w:eastAsia="de-DE"/>
         </w:rPr>
       </w:pPr>
-      <w:hyperlink w:anchor="_Toc236167770" w:history="1">
+      <w:hyperlink w:anchor="_Toc236246094" w:history="1">
         <w:r>
           <w:rPr>
             <w:rStyle w:val="Hyperlink"/>
@@ -614,7 +614,7 @@
             <w:noProof/>
             <w:webHidden/>
           </w:rPr>
-          <w:instrText xml:space="preserve"> PAGEREF _Toc236167770 \h </w:instrText>
+          <w:instrText xml:space="preserve"> PAGEREF _Toc236246094 \h </w:instrText>
         </w:r>
         <w:r>
           <w:rPr>
@@ -656,7 +656,7 @@
           <w:lang w:eastAsia="de-DE"/>
         </w:rPr>
       </w:pPr>
-      <w:hyperlink w:anchor="_Toc236167771" w:history="1">
+      <w:hyperlink w:anchor="_Toc236246095" w:history="1">
         <w:r>
           <w:rPr>
             <w:rStyle w:val="Hyperlink"/>
@@ -683,7 +683,7 @@
             <w:noProof/>
             <w:webHidden/>
           </w:rPr>
-          <w:instrText xml:space="preserve"> PAGEREF _Toc236167771 \h </w:instrText>
+          <w:instrText xml:space="preserve"> PAGEREF _Toc236246095 \h </w:instrText>
         </w:r>
         <w:r>
           <w:rPr>
@@ -725,7 +725,7 @@
           <w:lang w:eastAsia="de-DE"/>
         </w:rPr>
       </w:pPr>
-      <w:hyperlink w:anchor="_Toc236167772" w:history="1">
+      <w:hyperlink w:anchor="_Toc236246096" w:history="1">
         <w:r>
           <w:rPr>
             <w:rStyle w:val="Hyperlink"/>
@@ -752,7 +752,7 @@
             <w:noProof/>
             <w:webHidden/>
           </w:rPr>
-          <w:instrText xml:space="preserve"> PAGEREF _Toc236167772 \h </w:instrText>
+          <w:instrText xml:space="preserve"> PAGEREF _Toc236246096 \h </w:instrText>
         </w:r>
         <w:r>
           <w:rPr>
@@ -794,7 +794,7 @@
           <w:lang w:eastAsia="de-DE"/>
         </w:rPr>
       </w:pPr>
-      <w:hyperlink w:anchor="_Toc236167773" w:history="1">
+      <w:hyperlink w:anchor="_Toc236246097" w:history="1">
         <w:r>
           <w:rPr>
             <w:rStyle w:val="Hyperlink"/>
@@ -821,7 +821,7 @@
             <w:noProof/>
             <w:webHidden/>
           </w:rPr>
-          <w:instrText xml:space="preserve"> PAGEREF _Toc236167773 \h </w:instrText>
+          <w:instrText xml:space="preserve"> PAGEREF _Toc236246097 \h </w:instrText>
         </w:r>
         <w:r>
           <w:rPr>
@@ -863,7 +863,7 @@
           <w:lang w:eastAsia="de-DE"/>
         </w:rPr>
       </w:pPr>
-      <w:hyperlink w:anchor="_Toc236167774" w:history="1">
+      <w:hyperlink w:anchor="_Toc236246098" w:history="1">
         <w:r>
           <w:rPr>
             <w:rStyle w:val="Hyperlink"/>
@@ -890,7 +890,7 @@
             <w:noProof/>
             <w:webHidden/>
           </w:rPr>
-          <w:instrText xml:space="preserve"> PAGEREF _Toc236167774 \h </w:instrText>
+          <w:instrText xml:space="preserve"> PAGEREF _Toc236246098 \h </w:instrText>
         </w:r>
         <w:r>
           <w:rPr>
@@ -932,7 +932,7 @@
           <w:lang w:eastAsia="de-DE"/>
         </w:rPr>
       </w:pPr>
-      <w:hyperlink w:anchor="_Toc236167775" w:history="1">
+      <w:hyperlink w:anchor="_Toc236246099" w:history="1">
         <w:r>
           <w:rPr>
             <w:rStyle w:val="Hyperlink"/>
@@ -959,7 +959,7 @@
             <w:noProof/>
             <w:webHidden/>
           </w:rPr>
-          <w:instrText xml:space="preserve"> PAGEREF _Toc236167775 \h </w:instrText>
+          <w:instrText xml:space="preserve"> PAGEREF _Toc236246099 \h </w:instrText>
         </w:r>
         <w:r>
           <w:rPr>
@@ -1001,7 +1001,7 @@
           <w:lang w:eastAsia="de-DE"/>
         </w:rPr>
       </w:pPr>
-      <w:hyperlink w:anchor="_Toc236167776" w:history="1">
+      <w:hyperlink w:anchor="_Toc236246100" w:history="1">
         <w:r>
           <w:rPr>
             <w:rStyle w:val="Hyperlink"/>
@@ -1028,7 +1028,7 @@
             <w:noProof/>
             <w:webHidden/>
           </w:rPr>
-          <w:instrText xml:space="preserve"> PAGEREF _Toc236167776 \h </w:instrText>
+          <w:instrText xml:space="preserve"> PAGEREF _Toc236246100 \h </w:instrText>
         </w:r>
         <w:r>
           <w:rPr>
@@ -1070,7 +1070,7 @@
           <w:lang w:eastAsia="de-DE"/>
         </w:rPr>
       </w:pPr>
-      <w:hyperlink w:anchor="_Toc236167777" w:history="1">
+      <w:hyperlink w:anchor="_Toc236246101" w:history="1">
         <w:r>
           <w:rPr>
             <w:rStyle w:val="Hyperlink"/>
@@ -1097,7 +1097,7 @@
             <w:noProof/>
             <w:webHidden/>
           </w:rPr>
-          <w:instrText xml:space="preserve"> PAGEREF _Toc236167777 \h </w:instrText>
+          <w:instrText xml:space="preserve"> PAGEREF _Toc236246101 \h </w:instrText>
         </w:r>
         <w:r>
           <w:rPr>
@@ -1139,7 +1139,7 @@
           <w:lang w:eastAsia="de-DE"/>
         </w:rPr>
       </w:pPr>
-      <w:hyperlink w:anchor="_Toc236167778" w:history="1">
+      <w:hyperlink w:anchor="_Toc236246102" w:history="1">
         <w:r>
           <w:rPr>
             <w:rStyle w:val="Hyperlink"/>
@@ -1166,7 +1166,7 @@
             <w:noProof/>
             <w:webHidden/>
           </w:rPr>
-          <w:instrText xml:space="preserve"> PAGEREF _Toc236167778 \h </w:instrText>
+          <w:instrText xml:space="preserve"> PAGEREF _Toc236246102 \h </w:instrText>
         </w:r>
         <w:r>
           <w:rPr>
@@ -1208,7 +1208,7 @@
           <w:lang w:eastAsia="de-DE"/>
         </w:rPr>
       </w:pPr>
-      <w:hyperlink w:anchor="_Toc236167779" w:history="1">
+      <w:hyperlink w:anchor="_Toc236246103" w:history="1">
         <w:r>
           <w:rPr>
             <w:rStyle w:val="Hyperlink"/>
@@ -1235,7 +1235,7 @@
             <w:noProof/>
             <w:webHidden/>
           </w:rPr>
-          <w:instrText xml:space="preserve"> PAGEREF _Toc236167779 \h </w:instrText>
+          <w:instrText xml:space="preserve"> PAGEREF _Toc236246103 \h </w:instrText>
         </w:r>
         <w:r>
           <w:rPr>
@@ -1277,7 +1277,7 @@
           <w:lang w:eastAsia="de-DE"/>
         </w:rPr>
       </w:pPr>
-      <w:hyperlink w:anchor="_Toc236167780" w:history="1">
+      <w:hyperlink w:anchor="_Toc236246104" w:history="1">
         <w:r>
           <w:rPr>
             <w:rStyle w:val="Hyperlink"/>
@@ -1304,7 +1304,7 @@
             <w:noProof/>
             <w:webHidden/>
           </w:rPr>
-          <w:instrText xml:space="preserve"> PAGEREF _Toc236167780 \h </w:instrText>
+          <w:instrText xml:space="preserve"> PAGEREF _Toc236246104 \h </w:instrText>
         </w:r>
         <w:r>
           <w:rPr>
@@ -1346,7 +1346,7 @@
           <w:lang w:eastAsia="de-DE"/>
         </w:rPr>
       </w:pPr>
-      <w:hyperlink w:anchor="_Toc236167781" w:history="1">
+      <w:hyperlink w:anchor="_Toc236246105" w:history="1">
         <w:r>
           <w:rPr>
             <w:rStyle w:val="Hyperlink"/>
@@ -1373,7 +1373,7 @@
             <w:noProof/>
             <w:webHidden/>
           </w:rPr>
-          <w:instrText xml:space="preserve"> PAGEREF _Toc236167781 \h </w:instrText>
+          <w:instrText xml:space="preserve"> PAGEREF _Toc236246105 \h </w:instrText>
         </w:r>
         <w:r>
           <w:rPr>
@@ -1415,7 +1415,7 @@
           <w:lang w:eastAsia="de-DE"/>
         </w:rPr>
       </w:pPr>
-      <w:hyperlink w:anchor="_Toc236167782" w:history="1">
+      <w:hyperlink w:anchor="_Toc236246106" w:history="1">
         <w:r>
           <w:rPr>
             <w:rStyle w:val="Hyperlink"/>
@@ -1442,7 +1442,7 @@
             <w:noProof/>
             <w:webHidden/>
           </w:rPr>
-          <w:instrText xml:space="preserve"> PAGEREF _Toc236167782 \h </w:instrText>
+          <w:instrText xml:space="preserve"> PAGEREF _Toc236246106 \h </w:instrText>
         </w:r>
         <w:r>
           <w:rPr>
@@ -1484,7 +1484,7 @@
           <w:lang w:eastAsia="de-DE"/>
         </w:rPr>
       </w:pPr>
-      <w:hyperlink w:anchor="_Toc236167783" w:history="1">
+      <w:hyperlink w:anchor="_Toc236246107" w:history="1">
         <w:r>
           <w:rPr>
             <w:rStyle w:val="Hyperlink"/>
@@ -1511,7 +1511,7 @@
             <w:noProof/>
             <w:webHidden/>
           </w:rPr>
-          <w:instrText xml:space="preserve"> PAGEREF _Toc236167783 \h </w:instrText>
+          <w:instrText xml:space="preserve"> PAGEREF _Toc236246107 \h </w:instrText>
         </w:r>
         <w:r>
           <w:rPr>
@@ -1553,7 +1553,7 @@
           <w:lang w:eastAsia="de-DE"/>
         </w:rPr>
       </w:pPr>
-      <w:hyperlink w:anchor="_Toc236167784" w:history="1">
+      <w:hyperlink w:anchor="_Toc236246108" w:history="1">
         <w:r>
           <w:rPr>
             <w:rStyle w:val="Hyperlink"/>
@@ -1580,7 +1580,7 @@
             <w:noProof/>
             <w:webHidden/>
           </w:rPr>
-          <w:instrText xml:space="preserve"> PAGEREF _Toc236167784 \h </w:instrText>
+          <w:instrText xml:space="preserve"> PAGEREF _Toc236246108 \h </w:instrText>
         </w:r>
         <w:r>
           <w:rPr>
@@ -1622,7 +1622,7 @@
           <w:lang w:eastAsia="de-DE"/>
         </w:rPr>
       </w:pPr>
-      <w:hyperlink w:anchor="_Toc236167785" w:history="1">
+      <w:hyperlink w:anchor="_Toc236246109" w:history="1">
         <w:r>
           <w:rPr>
             <w:rStyle w:val="Hyperlink"/>
@@ -1649,7 +1649,7 @@
             <w:noProof/>
             <w:webHidden/>
           </w:rPr>
-          <w:instrText xml:space="preserve"> PAGEREF _Toc236167785 \h </w:instrText>
+          <w:instrText xml:space="preserve"> PAGEREF _Toc236246109 \h </w:instrText>
         </w:r>
         <w:r>
           <w:rPr>
@@ -1691,7 +1691,7 @@
           <w:lang w:eastAsia="de-DE"/>
         </w:rPr>
       </w:pPr>
-      <w:hyperlink w:anchor="_Toc236167786" w:history="1">
+      <w:hyperlink w:anchor="_Toc236246110" w:history="1">
         <w:r>
           <w:rPr>
             <w:rStyle w:val="Hyperlink"/>
@@ -1718,7 +1718,7 @@
             <w:noProof/>
             <w:webHidden/>
           </w:rPr>
-          <w:instrText xml:space="preserve"> PAGEREF _Toc236167786 \h </w:instrText>
+          <w:instrText xml:space="preserve"> PAGEREF _Toc236246110 \h </w:instrText>
         </w:r>
         <w:r>
           <w:rPr>
@@ -1738,7 +1738,14 @@
             <w:noProof/>
             <w:webHidden/>
           </w:rPr>
-          <w:t>25</w:t>
+          <w:t>2</w:t>
+        </w:r>
+        <w:r>
+          <w:rPr>
+            <w:noProof/>
+            <w:webHidden/>
+          </w:rPr>
+          <w:t>5</w:t>
         </w:r>
         <w:r>
           <w:rPr>
@@ -1760,7 +1767,7 @@
           <w:lang w:eastAsia="de-DE"/>
         </w:rPr>
       </w:pPr>
-      <w:hyperlink w:anchor="_Toc236167787" w:history="1">
+      <w:hyperlink w:anchor="_Toc236246111" w:history="1">
         <w:r>
           <w:rPr>
             <w:rStyle w:val="Hyperlink"/>
@@ -1787,145 +1794,7 @@
             <w:noProof/>
             <w:webHidden/>
           </w:rPr>
-          <w:instrText xml:space="preserve"> PAGEREF _Toc236167787 \h </w:instrText>
-        </w:r>
-        <w:r>
-          <w:rPr>
-            <w:noProof/>
-            <w:webHidden/>
-          </w:rPr>
-        </w:r>
-        <w:r>
-          <w:rPr>
-            <w:noProof/>
-            <w:webHidden/>
-          </w:rPr>
-          <w:fldChar w:fldCharType="separate"/>
-        </w:r>
-        <w:r>
-          <w:rPr>
-            <w:noProof/>
-            <w:webHidden/>
-          </w:rPr>
-          <w:t>26</w:t>
-        </w:r>
-        <w:r>
-          <w:rPr>
-            <w:noProof/>
-            <w:webHidden/>
-          </w:rPr>
-          <w:fldChar w:fldCharType="end"/>
-        </w:r>
-      </w:hyperlink>
-    </w:p>
-    <w:p>
-      <w:pPr>
-        <w:pStyle w:val="Verzeichnis1"/>
-        <w:rPr>
-          <w:rFonts w:eastAsiaTheme="minorEastAsia"/>
-          <w:noProof/>
-          <w:sz w:val="24"/>
-          <w:szCs w:val="24"/>
-          <w:lang w:eastAsia="de-DE"/>
-        </w:rPr>
-      </w:pPr>
-      <w:hyperlink w:anchor="_Toc236167788" w:history="1">
-        <w:r>
-          <w:rPr>
-            <w:rStyle w:val="Hyperlink"/>
-            <w:noProof/>
-          </w:rPr>
-          <w:t>Die Eltern-Klasse vererbt – die Kind-Klasse erbt</w:t>
-        </w:r>
-        <w:r>
-          <w:rPr>
-            <w:noProof/>
-            <w:webHidden/>
-          </w:rPr>
-          <w:tab/>
-        </w:r>
-        <w:r>
-          <w:rPr>
-            <w:noProof/>
-            <w:webHidden/>
-          </w:rPr>
-          <w:fldChar w:fldCharType="begin"/>
-        </w:r>
-        <w:r>
-          <w:rPr>
-            <w:noProof/>
-            <w:webHidden/>
-          </w:rPr>
-          <w:instrText xml:space="preserve"> PAGEREF _Toc236167788 \h </w:instrText>
-        </w:r>
-        <w:r>
-          <w:rPr>
-            <w:noProof/>
-            <w:webHidden/>
-          </w:rPr>
-        </w:r>
-        <w:r>
-          <w:rPr>
-            <w:noProof/>
-            <w:webHidden/>
-          </w:rPr>
-          <w:fldChar w:fldCharType="separate"/>
-        </w:r>
-        <w:r>
-          <w:rPr>
-            <w:noProof/>
-            <w:webHidden/>
-          </w:rPr>
-          <w:t>27</w:t>
-        </w:r>
-        <w:r>
-          <w:rPr>
-            <w:noProof/>
-            <w:webHidden/>
-          </w:rPr>
-          <w:fldChar w:fldCharType="end"/>
-        </w:r>
-      </w:hyperlink>
-    </w:p>
-    <w:p>
-      <w:pPr>
-        <w:pStyle w:val="Verzeichnis1"/>
-        <w:rPr>
-          <w:rFonts w:eastAsiaTheme="minorEastAsia"/>
-          <w:noProof/>
-          <w:sz w:val="24"/>
-          <w:szCs w:val="24"/>
-          <w:lang w:eastAsia="de-DE"/>
-        </w:rPr>
-      </w:pPr>
-      <w:hyperlink w:anchor="_Toc236167789" w:history="1">
-        <w:r>
-          <w:rPr>
-            <w:rStyle w:val="Hyperlink"/>
-            <w:noProof/>
-          </w:rPr>
-          <w:t>Roboter im Irrgarten: Wände bauen</w:t>
-        </w:r>
-        <w:r>
-          <w:rPr>
-            <w:noProof/>
-            <w:webHidden/>
-          </w:rPr>
-          <w:tab/>
-        </w:r>
-        <w:r>
-          <w:rPr>
-            <w:noProof/>
-            <w:webHidden/>
-          </w:rPr>
-          <w:fldChar w:fldCharType="begin"/>
-        </w:r>
-        <w:r>
-          <w:rPr>
-            <w:noProof/>
-            <w:webHidden/>
-          </w:rPr>
-          <w:instrText xml:space="preserve"> PAGEREF _Toc236167789 \h </w:instrText>
+          <w:instrText xml:space="preserve"> PAGEREF _Toc236246111 \h </w:instrText>
         </w:r>
         <w:r>
           <w:rPr>
@@ -1967,13 +1836,13 @@
           <w:lang w:eastAsia="de-DE"/>
         </w:rPr>
       </w:pPr>
-      <w:hyperlink w:anchor="_Toc236167790" w:history="1">
+      <w:hyperlink w:anchor="_Toc236246112" w:history="1">
         <w:r>
           <w:rPr>
             <w:rStyle w:val="Hyperlink"/>
             <w:noProof/>
           </w:rPr>
-          <w:t>Roboter im Irrgarten: Wände ablegen</w:t>
+          <w:t>Die Eltern-Klasse vererbt – die Kind-Klasse erbt</w:t>
         </w:r>
         <w:r>
           <w:rPr>
@@ -1994,7 +1863,7 @@
             <w:noProof/>
             <w:webHidden/>
           </w:rPr>
-          <w:instrText xml:space="preserve"> PAGEREF _Toc236167790 \h </w:instrText>
+          <w:instrText xml:space="preserve"> PAGEREF _Toc236246112 \h </w:instrText>
         </w:r>
         <w:r>
           <w:rPr>
@@ -2036,13 +1905,13 @@
           <w:lang w:eastAsia="de-DE"/>
         </w:rPr>
       </w:pPr>
-      <w:hyperlink w:anchor="_Toc236167791" w:history="1">
+      <w:hyperlink w:anchor="_Toc236246113" w:history="1">
         <w:r>
           <w:rPr>
             <w:rStyle w:val="Hyperlink"/>
             <w:noProof/>
           </w:rPr>
-          <w:t>Roboter im Irrgarten: Wände aus Datei lesen</w:t>
+          <w:t>Roboter im Irrgarten: Wände bauen</w:t>
         </w:r>
         <w:r>
           <w:rPr>
@@ -2063,7 +1932,7 @@
             <w:noProof/>
             <w:webHidden/>
           </w:rPr>
-          <w:instrText xml:space="preserve"> PAGEREF _Toc236167791 \h </w:instrText>
+          <w:instrText xml:space="preserve"> PAGEREF _Toc236246113 \h </w:instrText>
         </w:r>
         <w:r>
           <w:rPr>
@@ -2105,13 +1974,13 @@
           <w:lang w:eastAsia="de-DE"/>
         </w:rPr>
       </w:pPr>
-      <w:hyperlink w:anchor="_Toc236167792" w:history="1">
+      <w:hyperlink w:anchor="_Toc236246114" w:history="1">
         <w:r>
           <w:rPr>
             <w:rStyle w:val="Hyperlink"/>
             <w:noProof/>
           </w:rPr>
-          <w:t>Roboter im Irrgarten: Schildkröte bewegen</w:t>
+          <w:t>Roboter im Irrgarten: Wände ablegen</w:t>
         </w:r>
         <w:r>
           <w:rPr>
@@ -2132,7 +2001,7 @@
             <w:noProof/>
             <w:webHidden/>
           </w:rPr>
-          <w:instrText xml:space="preserve"> PAGEREF _Toc236167792 \h </w:instrText>
+          <w:instrText xml:space="preserve"> PAGEREF _Toc236246114 \h </w:instrText>
         </w:r>
         <w:r>
           <w:rPr>
@@ -2174,13 +2043,13 @@
           <w:lang w:eastAsia="de-DE"/>
         </w:rPr>
       </w:pPr>
-      <w:hyperlink w:anchor="_Toc236167793" w:history="1">
+      <w:hyperlink w:anchor="_Toc236246115" w:history="1">
         <w:r>
           <w:rPr>
             <w:rStyle w:val="Hyperlink"/>
             <w:noProof/>
           </w:rPr>
-          <w:t>Roboter im Irrgarten: Schauen, gehen, drehen</w:t>
+          <w:t>Roboter im Irrgarten: Wände aus Datei lesen</w:t>
         </w:r>
         <w:r>
           <w:rPr>
@@ -2201,7 +2070,7 @@
             <w:noProof/>
             <w:webHidden/>
           </w:rPr>
-          <w:instrText xml:space="preserve"> PAGEREF _Toc236167793 \h </w:instrText>
+          <w:instrText xml:space="preserve"> PAGEREF _Toc236246115 \h </w:instrText>
         </w:r>
         <w:r>
           <w:rPr>
@@ -2243,7 +2112,145 @@
           <w:lang w:eastAsia="de-DE"/>
         </w:rPr>
       </w:pPr>
-      <w:hyperlink w:anchor="_Toc236167794" w:history="1">
+      <w:hyperlink w:anchor="_Toc236246116" w:history="1">
+        <w:r>
+          <w:rPr>
+            <w:rStyle w:val="Hyperlink"/>
+            <w:noProof/>
+          </w:rPr>
+          <w:t>Roboter im Irrgarten: Schildkröte bewegen</w:t>
+        </w:r>
+        <w:r>
+          <w:rPr>
+            <w:noProof/>
+            <w:webHidden/>
+          </w:rPr>
+          <w:tab/>
+        </w:r>
+        <w:r>
+          <w:rPr>
+            <w:noProof/>
+            <w:webHidden/>
+          </w:rPr>
+          <w:fldChar w:fldCharType="begin"/>
+        </w:r>
+        <w:r>
+          <w:rPr>
+            <w:noProof/>
+            <w:webHidden/>
+          </w:rPr>
+          <w:instrText xml:space="preserve"> PAGEREF _Toc236246116 \h </w:instrText>
+        </w:r>
+        <w:r>
+          <w:rPr>
+            <w:noProof/>
+            <w:webHidden/>
+          </w:rPr>
+        </w:r>
+        <w:r>
+          <w:rPr>
+            <w:noProof/>
+            <w:webHidden/>
+          </w:rPr>
+          <w:fldChar w:fldCharType="separate"/>
+        </w:r>
+        <w:r>
+          <w:rPr>
+            <w:noProof/>
+            <w:webHidden/>
+          </w:rPr>
+          <w:t>33</w:t>
+        </w:r>
+        <w:r>
+          <w:rPr>
+            <w:noProof/>
+            <w:webHidden/>
+          </w:rPr>
+          <w:fldChar w:fldCharType="end"/>
+        </w:r>
+      </w:hyperlink>
+    </w:p>
+    <w:p>
+      <w:pPr>
+        <w:pStyle w:val="Verzeichnis1"/>
+        <w:rPr>
+          <w:rFonts w:eastAsiaTheme="minorEastAsia"/>
+          <w:noProof/>
+          <w:sz w:val="24"/>
+          <w:szCs w:val="24"/>
+          <w:lang w:eastAsia="de-DE"/>
+        </w:rPr>
+      </w:pPr>
+      <w:hyperlink w:anchor="_Toc236246117" w:history="1">
+        <w:r>
+          <w:rPr>
+            <w:rStyle w:val="Hyperlink"/>
+            <w:noProof/>
+          </w:rPr>
+          <w:t>Roboter im Irrgarten: Schauen, gehen, drehen</w:t>
+        </w:r>
+        <w:r>
+          <w:rPr>
+            <w:noProof/>
+            <w:webHidden/>
+          </w:rPr>
+          <w:tab/>
+        </w:r>
+        <w:r>
+          <w:rPr>
+            <w:noProof/>
+            <w:webHidden/>
+          </w:rPr>
+          <w:fldChar w:fldCharType="begin"/>
+        </w:r>
+        <w:r>
+          <w:rPr>
+            <w:noProof/>
+            <w:webHidden/>
+          </w:rPr>
+          <w:instrText xml:space="preserve"> PAGEREF _Toc236246117 \h </w:instrText>
+        </w:r>
+        <w:r>
+          <w:rPr>
+            <w:noProof/>
+            <w:webHidden/>
+          </w:rPr>
+        </w:r>
+        <w:r>
+          <w:rPr>
+            <w:noProof/>
+            <w:webHidden/>
+          </w:rPr>
+          <w:fldChar w:fldCharType="separate"/>
+        </w:r>
+        <w:r>
+          <w:rPr>
+            <w:noProof/>
+            <w:webHidden/>
+          </w:rPr>
+          <w:t>34</w:t>
+        </w:r>
+        <w:r>
+          <w:rPr>
+            <w:noProof/>
+            <w:webHidden/>
+          </w:rPr>
+          <w:fldChar w:fldCharType="end"/>
+        </w:r>
+      </w:hyperlink>
+    </w:p>
+    <w:p>
+      <w:pPr>
+        <w:pStyle w:val="Verzeichnis1"/>
+        <w:rPr>
+          <w:rFonts w:eastAsiaTheme="minorEastAsia"/>
+          <w:noProof/>
+          <w:sz w:val="24"/>
+          <w:szCs w:val="24"/>
+          <w:lang w:eastAsia="de-DE"/>
+        </w:rPr>
+      </w:pPr>
+      <w:hyperlink w:anchor="_Toc236246118" w:history="1">
         <w:r>
           <w:rPr>
             <w:rStyle w:val="Hyperlink"/>
@@ -2270,7 +2277,7 @@
             <w:noProof/>
             <w:webHidden/>
           </w:rPr>
-          <w:instrText xml:space="preserve"> PAGEREF _Toc236167794 \h </w:instrText>
+          <w:instrText xml:space="preserve"> PAGEREF _Toc236246118 \h </w:instrText>
         </w:r>
         <w:r>
           <w:rPr>
@@ -2290,7 +2297,7 @@
             <w:noProof/>
             <w:webHidden/>
           </w:rPr>
-          <w:t>35</w:t>
+          <w:t>37</w:t>
         </w:r>
         <w:r>
           <w:rPr>
@@ -2312,7 +2319,7 @@
           <w:lang w:eastAsia="de-DE"/>
         </w:rPr>
       </w:pPr>
-      <w:hyperlink w:anchor="_Toc236167795" w:history="1">
+      <w:hyperlink w:anchor="_Toc236246119" w:history="1">
         <w:r>
           <w:rPr>
             <w:rStyle w:val="Hyperlink"/>
@@ -2339,76 +2346,7 @@
             <w:noProof/>
             <w:webHidden/>
           </w:rPr>
-          <w:instrText xml:space="preserve"> PAGEREF _Toc236167795 \h </w:instrText>
-        </w:r>
-        <w:r>
-          <w:rPr>
-            <w:noProof/>
-            <w:webHidden/>
-          </w:rPr>
-        </w:r>
-        <w:r>
-          <w:rPr>
-            <w:noProof/>
-            <w:webHidden/>
-          </w:rPr>
-          <w:fldChar w:fldCharType="separate"/>
-        </w:r>
-        <w:r>
-          <w:rPr>
-            <w:noProof/>
-            <w:webHidden/>
-          </w:rPr>
-          <w:t>36</w:t>
-        </w:r>
-        <w:r>
-          <w:rPr>
-            <w:noProof/>
-            <w:webHidden/>
-          </w:rPr>
-          <w:fldChar w:fldCharType="end"/>
-        </w:r>
-      </w:hyperlink>
-    </w:p>
-    <w:p>
-      <w:pPr>
-        <w:pStyle w:val="Verzeichnis1"/>
-        <w:rPr>
-          <w:rFonts w:eastAsiaTheme="minorEastAsia"/>
-          <w:noProof/>
-          <w:sz w:val="24"/>
-          <w:szCs w:val="24"/>
-          <w:lang w:eastAsia="de-DE"/>
-        </w:rPr>
-      </w:pPr>
-      <w:hyperlink w:anchor="_Toc236167796" w:history="1">
-        <w:r>
-          <w:rPr>
-            <w:rStyle w:val="Hyperlink"/>
-            <w:noProof/>
-          </w:rPr>
-          <w:t>Auto im Gegenverkehr: Auto steuern</w:t>
-        </w:r>
-        <w:r>
-          <w:rPr>
-            <w:noProof/>
-            <w:webHidden/>
-          </w:rPr>
-          <w:tab/>
-        </w:r>
-        <w:r>
-          <w:rPr>
-            <w:noProof/>
-            <w:webHidden/>
-          </w:rPr>
-          <w:fldChar w:fldCharType="begin"/>
-        </w:r>
-        <w:r>
-          <w:rPr>
-            <w:noProof/>
-            <w:webHidden/>
-          </w:rPr>
-          <w:instrText xml:space="preserve"> PAGEREF _Toc236167796 \h </w:instrText>
+          <w:instrText xml:space="preserve"> PAGEREF _Toc236246119 \h </w:instrText>
         </w:r>
         <w:r>
           <w:rPr>
@@ -2450,13 +2388,13 @@
           <w:lang w:eastAsia="de-DE"/>
         </w:rPr>
       </w:pPr>
-      <w:hyperlink w:anchor="_Toc236167797" w:history="1">
+      <w:hyperlink w:anchor="_Toc236246120" w:history="1">
         <w:r>
           <w:rPr>
             <w:rStyle w:val="Hyperlink"/>
             <w:noProof/>
           </w:rPr>
-          <w:t>Auto im Gegenverkehr: Gegenverkehr kommt</w:t>
+          <w:t>Auto im Gegenverkehr: Auto steuern</w:t>
         </w:r>
         <w:r>
           <w:rPr>
@@ -2477,7 +2415,7 @@
             <w:noProof/>
             <w:webHidden/>
           </w:rPr>
-          <w:instrText xml:space="preserve"> PAGEREF _Toc236167797 \h </w:instrText>
+          <w:instrText xml:space="preserve"> PAGEREF _Toc236246120 \h </w:instrText>
         </w:r>
         <w:r>
           <w:rPr>
@@ -2519,7 +2457,76 @@
           <w:lang w:eastAsia="de-DE"/>
         </w:rPr>
       </w:pPr>
-      <w:hyperlink w:anchor="_Toc236167798" w:history="1">
+      <w:hyperlink w:anchor="_Toc236246121" w:history="1">
+        <w:r>
+          <w:rPr>
+            <w:rStyle w:val="Hyperlink"/>
+            <w:noProof/>
+          </w:rPr>
+          <w:t>Auto im Gegenverkehr: Gegenverkehr kommt</w:t>
+        </w:r>
+        <w:r>
+          <w:rPr>
+            <w:noProof/>
+            <w:webHidden/>
+          </w:rPr>
+          <w:tab/>
+        </w:r>
+        <w:r>
+          <w:rPr>
+            <w:noProof/>
+            <w:webHidden/>
+          </w:rPr>
+          <w:fldChar w:fldCharType="begin"/>
+        </w:r>
+        <w:r>
+          <w:rPr>
+            <w:noProof/>
+            <w:webHidden/>
+          </w:rPr>
+          <w:instrText xml:space="preserve"> PAGEREF _Toc236246121 \h </w:instrText>
+        </w:r>
+        <w:r>
+          <w:rPr>
+            <w:noProof/>
+            <w:webHidden/>
+          </w:rPr>
+        </w:r>
+        <w:r>
+          <w:rPr>
+            <w:noProof/>
+            <w:webHidden/>
+          </w:rPr>
+          <w:fldChar w:fldCharType="separate"/>
+        </w:r>
+        <w:r>
+          <w:rPr>
+            <w:noProof/>
+            <w:webHidden/>
+          </w:rPr>
+          <w:t>42</w:t>
+        </w:r>
+        <w:r>
+          <w:rPr>
+            <w:noProof/>
+            <w:webHidden/>
+          </w:rPr>
+          <w:fldChar w:fldCharType="end"/>
+        </w:r>
+      </w:hyperlink>
+    </w:p>
+    <w:p>
+      <w:pPr>
+        <w:pStyle w:val="Verzeichnis1"/>
+        <w:rPr>
+          <w:rFonts w:eastAsiaTheme="minorEastAsia"/>
+          <w:noProof/>
+          <w:sz w:val="24"/>
+          <w:szCs w:val="24"/>
+          <w:lang w:eastAsia="de-DE"/>
+        </w:rPr>
+      </w:pPr>
+      <w:hyperlink w:anchor="_Toc236246122" w:history="1">
         <w:r>
           <w:rPr>
             <w:rStyle w:val="Hyperlink"/>
@@ -2546,76 +2553,7 @@
             <w:noProof/>
             <w:webHidden/>
           </w:rPr>
-          <w:instrText xml:space="preserve"> PAGEREF _Toc236167798 \h </w:instrText>
-        </w:r>
-        <w:r>
-          <w:rPr>
-            <w:noProof/>
-            <w:webHidden/>
-          </w:rPr>
-        </w:r>
-        <w:r>
-          <w:rPr>
-            <w:noProof/>
-            <w:webHidden/>
-          </w:rPr>
-          <w:fldChar w:fldCharType="separate"/>
-        </w:r>
-        <w:r>
-          <w:rPr>
-            <w:noProof/>
-            <w:webHidden/>
-          </w:rPr>
-          <w:t>41</w:t>
-        </w:r>
-        <w:r>
-          <w:rPr>
-            <w:noProof/>
-            <w:webHidden/>
-          </w:rPr>
-          <w:fldChar w:fldCharType="end"/>
-        </w:r>
-      </w:hyperlink>
-    </w:p>
-    <w:p>
-      <w:pPr>
-        <w:pStyle w:val="Verzeichnis1"/>
-        <w:rPr>
-          <w:rFonts w:eastAsiaTheme="minorEastAsia"/>
-          <w:noProof/>
-          <w:sz w:val="24"/>
-          <w:szCs w:val="24"/>
-          <w:lang w:eastAsia="de-DE"/>
-        </w:rPr>
-      </w:pPr>
-      <w:hyperlink w:anchor="_Toc236167799" w:history="1">
-        <w:r>
-          <w:rPr>
-            <w:rStyle w:val="Hyperlink"/>
-            <w:noProof/>
-          </w:rPr>
-          <w:t>Auto im Gegenverkehr: Gegenverkehr wird schneller</w:t>
-        </w:r>
-        <w:r>
-          <w:rPr>
-            <w:noProof/>
-            <w:webHidden/>
-          </w:rPr>
-          <w:tab/>
-        </w:r>
-        <w:r>
-          <w:rPr>
-            <w:noProof/>
-            <w:webHidden/>
-          </w:rPr>
-          <w:fldChar w:fldCharType="begin"/>
-        </w:r>
-        <w:r>
-          <w:rPr>
-            <w:noProof/>
-            <w:webHidden/>
-          </w:rPr>
-          <w:instrText xml:space="preserve"> PAGEREF _Toc236167799 \h </w:instrText>
+          <w:instrText xml:space="preserve"> PAGEREF _Toc236246122 \h </w:instrText>
         </w:r>
         <w:r>
           <w:rPr>
@@ -2657,13 +2595,13 @@
           <w:lang w:eastAsia="de-DE"/>
         </w:rPr>
       </w:pPr>
-      <w:hyperlink w:anchor="_Toc236167800" w:history="1">
+      <w:hyperlink w:anchor="_Toc236246123" w:history="1">
         <w:r>
           <w:rPr>
             <w:rStyle w:val="Hyperlink"/>
             <w:noProof/>
           </w:rPr>
-          <w:t>Auto im Gegenverkehr: Straße und Sound</w:t>
+          <w:t>Auto im Gegenverkehr: Gegenverkehr wird schneller</w:t>
         </w:r>
         <w:r>
           <w:rPr>
@@ -2684,76 +2622,7 @@
             <w:noProof/>
             <w:webHidden/>
           </w:rPr>
-          <w:instrText xml:space="preserve"> PAGEREF _Toc236167800 \h </w:instrText>
-        </w:r>
-        <w:r>
-          <w:rPr>
-            <w:noProof/>
-            <w:webHidden/>
-          </w:rPr>
-        </w:r>
-        <w:r>
-          <w:rPr>
-            <w:noProof/>
-            <w:webHidden/>
-          </w:rPr>
-          <w:fldChar w:fldCharType="separate"/>
-        </w:r>
-        <w:r>
-          <w:rPr>
-            <w:noProof/>
-            <w:webHidden/>
-          </w:rPr>
-          <w:t>44</w:t>
-        </w:r>
-        <w:r>
-          <w:rPr>
-            <w:noProof/>
-            <w:webHidden/>
-          </w:rPr>
-          <w:fldChar w:fldCharType="end"/>
-        </w:r>
-      </w:hyperlink>
-    </w:p>
-    <w:p>
-      <w:pPr>
-        <w:pStyle w:val="Verzeichnis1"/>
-        <w:rPr>
-          <w:rFonts w:eastAsiaTheme="minorEastAsia"/>
-          <w:noProof/>
-          <w:sz w:val="24"/>
-          <w:szCs w:val="24"/>
-          <w:lang w:eastAsia="de-DE"/>
-        </w:rPr>
-      </w:pPr>
-      <w:hyperlink w:anchor="_Toc236167801" w:history="1">
-        <w:r>
-          <w:rPr>
-            <w:rStyle w:val="Hyperlink"/>
-            <w:noProof/>
-          </w:rPr>
-          <w:t>Ein Dinosaurier überquert die Straße</w:t>
-        </w:r>
-        <w:r>
-          <w:rPr>
-            <w:noProof/>
-            <w:webHidden/>
-          </w:rPr>
-          <w:tab/>
-        </w:r>
-        <w:r>
-          <w:rPr>
-            <w:noProof/>
-            <w:webHidden/>
-          </w:rPr>
-          <w:fldChar w:fldCharType="begin"/>
-        </w:r>
-        <w:r>
-          <w:rPr>
-            <w:noProof/>
-            <w:webHidden/>
-          </w:rPr>
-          <w:instrText xml:space="preserve"> PAGEREF _Toc236167801 \h </w:instrText>
+          <w:instrText xml:space="preserve"> PAGEREF _Toc236246123 \h </w:instrText>
         </w:r>
         <w:r>
           <w:rPr>
@@ -2795,13 +2664,13 @@
           <w:lang w:eastAsia="de-DE"/>
         </w:rPr>
       </w:pPr>
-      <w:hyperlink w:anchor="_Toc236167802" w:history="1">
+      <w:hyperlink w:anchor="_Toc236246124" w:history="1">
         <w:r>
           <w:rPr>
             <w:rStyle w:val="Hyperlink"/>
             <w:noProof/>
           </w:rPr>
-          <w:t>MicroPython und ESP32: Hardware und Software</w:t>
+          <w:t>Auto im Gegenverkehr: Straße und Sound</w:t>
         </w:r>
         <w:r>
           <w:rPr>
@@ -2822,7 +2691,7 @@
             <w:noProof/>
             <w:webHidden/>
           </w:rPr>
-          <w:instrText xml:space="preserve"> PAGEREF _Toc236167802 \h </w:instrText>
+          <w:instrText xml:space="preserve"> PAGEREF _Toc236246124 \h </w:instrText>
         </w:r>
         <w:r>
           <w:rPr>
@@ -2864,13 +2733,13 @@
           <w:lang w:eastAsia="de-DE"/>
         </w:rPr>
       </w:pPr>
-      <w:hyperlink w:anchor="_Toc236167803" w:history="1">
+      <w:hyperlink w:anchor="_Toc236246125" w:history="1">
         <w:r>
           <w:rPr>
             <w:rStyle w:val="Hyperlink"/>
             <w:noProof/>
           </w:rPr>
-          <w:t>Displays, Töne, Aktoren</w:t>
+          <w:t>Ein Dinosaurier überquert die Straße</w:t>
         </w:r>
         <w:r>
           <w:rPr>
@@ -2891,7 +2760,7 @@
             <w:noProof/>
             <w:webHidden/>
           </w:rPr>
-          <w:instrText xml:space="preserve"> PAGEREF _Toc236167803 \h </w:instrText>
+          <w:instrText xml:space="preserve"> PAGEREF _Toc236246125 \h </w:instrText>
         </w:r>
         <w:r>
           <w:rPr>
@@ -2933,13 +2802,13 @@
           <w:lang w:eastAsia="de-DE"/>
         </w:rPr>
       </w:pPr>
-      <w:hyperlink w:anchor="_Toc236167804" w:history="1">
+      <w:hyperlink w:anchor="_Toc236246126" w:history="1">
         <w:r>
           <w:rPr>
             <w:rStyle w:val="Hyperlink"/>
             <w:noProof/>
           </w:rPr>
-          <w:t>Sensoren</w:t>
+          <w:t>MicroPython und ESP32: Hardware und Software</w:t>
         </w:r>
         <w:r>
           <w:rPr>
@@ -2960,7 +2829,7 @@
             <w:noProof/>
             <w:webHidden/>
           </w:rPr>
-          <w:instrText xml:space="preserve"> PAGEREF _Toc236167804 \h </w:instrText>
+          <w:instrText xml:space="preserve"> PAGEREF _Toc236246126 \h </w:instrText>
         </w:r>
         <w:r>
           <w:rPr>
@@ -3002,13 +2871,13 @@
           <w:lang w:eastAsia="de-DE"/>
         </w:rPr>
       </w:pPr>
-      <w:hyperlink w:anchor="_Toc236167805" w:history="1">
+      <w:hyperlink w:anchor="_Toc236246127" w:history="1">
         <w:r>
           <w:rPr>
             <w:rStyle w:val="Hyperlink"/>
             <w:noProof/>
           </w:rPr>
-          <w:t>Einparkhilfe</w:t>
+          <w:t>Displays, Töne, Aktoren</w:t>
         </w:r>
         <w:r>
           <w:rPr>
@@ -3029,7 +2898,7 @@
             <w:noProof/>
             <w:webHidden/>
           </w:rPr>
-          <w:instrText xml:space="preserve"> PAGEREF _Toc236167805 \h </w:instrText>
+          <w:instrText xml:space="preserve"> PAGEREF _Toc236246127 \h </w:instrText>
         </w:r>
         <w:r>
           <w:rPr>
@@ -3071,13 +2940,13 @@
           <w:lang w:eastAsia="de-DE"/>
         </w:rPr>
       </w:pPr>
-      <w:hyperlink w:anchor="_Toc236167806" w:history="1">
+      <w:hyperlink w:anchor="_Toc236246128" w:history="1">
         <w:r>
           <w:rPr>
             <w:rStyle w:val="Hyperlink"/>
             <w:noProof/>
           </w:rPr>
-          <w:t>Quellen</w:t>
+          <w:t>Sensoren</w:t>
         </w:r>
         <w:r>
           <w:rPr>
@@ -3098,7 +2967,7 @@
             <w:noProof/>
             <w:webHidden/>
           </w:rPr>
-          <w:instrText xml:space="preserve"> PAGEREF _Toc236167806 \h </w:instrText>
+          <w:instrText xml:space="preserve"> PAGEREF _Toc236246128 \h </w:instrText>
         </w:r>
         <w:r>
           <w:rPr>
@@ -3130,6 +2999,144 @@
       </w:hyperlink>
     </w:p>
     <w:p>
+      <w:pPr>
+        <w:pStyle w:val="Verzeichnis1"/>
+        <w:rPr>
+          <w:rFonts w:eastAsiaTheme="minorEastAsia"/>
+          <w:noProof/>
+          <w:sz w:val="24"/>
+          <w:szCs w:val="24"/>
+          <w:lang w:eastAsia="de-DE"/>
+        </w:rPr>
+      </w:pPr>
+      <w:hyperlink w:anchor="_Toc236246129" w:history="1">
+        <w:r>
+          <w:rPr>
+            <w:rStyle w:val="Hyperlink"/>
+            <w:noProof/>
+          </w:rPr>
+          <w:t>Einparkhilfe</w:t>
+        </w:r>
+        <w:r>
+          <w:rPr>
+            <w:noProof/>
+            <w:webHidden/>
+          </w:rPr>
+          <w:tab/>
+        </w:r>
+        <w:r>
+          <w:rPr>
+            <w:noProof/>
+            <w:webHidden/>
+          </w:rPr>
+          <w:fldChar w:fldCharType="begin"/>
+        </w:r>
+        <w:r>
+          <w:rPr>
+            <w:noProof/>
+            <w:webHidden/>
+          </w:rPr>
+          <w:instrText xml:space="preserve"> PAGEREF _Toc236246129 \h </w:instrText>
+        </w:r>
+        <w:r>
+          <w:rPr>
+            <w:noProof/>
+            <w:webHidden/>
+          </w:rPr>
+        </w:r>
+        <w:r>
+          <w:rPr>
+            <w:noProof/>
+            <w:webHidden/>
+          </w:rPr>
+          <w:fldChar w:fldCharType="separate"/>
+        </w:r>
+        <w:r>
+          <w:rPr>
+            <w:noProof/>
+            <w:webHidden/>
+          </w:rPr>
+          <w:t>51</w:t>
+        </w:r>
+        <w:r>
+          <w:rPr>
+            <w:noProof/>
+            <w:webHidden/>
+          </w:rPr>
+          <w:fldChar w:fldCharType="end"/>
+        </w:r>
+      </w:hyperlink>
+    </w:p>
+    <w:p>
+      <w:pPr>
+        <w:pStyle w:val="Verzeichnis1"/>
+        <w:rPr>
+          <w:rFonts w:eastAsiaTheme="minorEastAsia"/>
+          <w:noProof/>
+          <w:sz w:val="24"/>
+          <w:szCs w:val="24"/>
+          <w:lang w:eastAsia="de-DE"/>
+        </w:rPr>
+      </w:pPr>
+      <w:hyperlink w:anchor="_Toc236246130" w:history="1">
+        <w:r>
+          <w:rPr>
+            <w:rStyle w:val="Hyperlink"/>
+            <w:noProof/>
+          </w:rPr>
+          <w:t>Quellen</w:t>
+        </w:r>
+        <w:r>
+          <w:rPr>
+            <w:noProof/>
+            <w:webHidden/>
+          </w:rPr>
+          <w:tab/>
+        </w:r>
+        <w:r>
+          <w:rPr>
+            <w:noProof/>
+            <w:webHidden/>
+          </w:rPr>
+          <w:fldChar w:fldCharType="begin"/>
+        </w:r>
+        <w:r>
+          <w:rPr>
+            <w:noProof/>
+            <w:webHidden/>
+          </w:rPr>
+          <w:instrText xml:space="preserve"> PAGEREF _Toc236246130 \h </w:instrText>
+        </w:r>
+        <w:r>
+          <w:rPr>
+            <w:noProof/>
+            <w:webHidden/>
+          </w:rPr>
+        </w:r>
+        <w:r>
+          <w:rPr>
+            <w:noProof/>
+            <w:webHidden/>
+          </w:rPr>
+          <w:fldChar w:fldCharType="separate"/>
+        </w:r>
+        <w:r>
+          <w:rPr>
+            <w:noProof/>
+            <w:webHidden/>
+          </w:rPr>
+          <w:t>52</w:t>
+        </w:r>
+        <w:r>
+          <w:rPr>
+            <w:noProof/>
+            <w:webHidden/>
+          </w:rPr>
+          <w:fldChar w:fldCharType="end"/>
+        </w:r>
+      </w:hyperlink>
+    </w:p>
+    <w:p>
       <w:r>
         <w:fldChar w:fldCharType="end"/>
       </w:r>
@@ -3151,7 +3158,7 @@
       <w:pPr>
         <w:pStyle w:val="berschrift1"/>
       </w:pPr>
-      <w:bookmarkStart w:id="65" w:name="_Toc236167767"/>
+      <w:bookmarkStart w:id="65" w:name="_Toc236246091"/>
       <w:r>
         <w:lastRenderedPageBreak/>
         <w:t xml:space="preserve">Programmzeilen </w:t>
@@ -4580,7 +4587,7 @@
       </w:pPr>
       <w:bookmarkStart w:id="77" w:name="_Toc196339509"/>
       <w:bookmarkStart w:id="78" w:name="_Toc196339878"/>
-      <w:bookmarkStart w:id="79" w:name="_Toc236167768"/>
+      <w:bookmarkStart w:id="79" w:name="_Toc236246092"/>
       <w:r>
         <w:lastRenderedPageBreak/>
         <w:t>Mit der IDLE Shell rechnen</w:t>
@@ -6161,7 +6168,7 @@
       </w:pPr>
       <w:bookmarkStart w:id="88" w:name="_Toc196339514"/>
       <w:bookmarkStart w:id="89" w:name="_Toc196339883"/>
-      <w:bookmarkStart w:id="90" w:name="_Toc236167769"/>
+      <w:bookmarkStart w:id="90" w:name="_Toc236246093"/>
       <w:r>
         <w:lastRenderedPageBreak/>
         <w:t>M</w:t>
@@ -7179,7 +7186,7 @@
       <w:pPr>
         <w:pStyle w:val="berschrift1"/>
       </w:pPr>
-      <w:bookmarkStart w:id="97" w:name="_Toc236167770"/>
+      <w:bookmarkStart w:id="97" w:name="_Toc236246094"/>
       <w:r>
         <w:lastRenderedPageBreak/>
         <w:t xml:space="preserve">Mit dem IDLE Editor ein </w:t>
@@ -7828,7 +7835,7 @@
       </w:pPr>
       <w:bookmarkStart w:id="98" w:name="_Toc196339519"/>
       <w:bookmarkStart w:id="99" w:name="_Toc196339888"/>
-      <w:bookmarkStart w:id="100" w:name="_Toc236167771"/>
+      <w:bookmarkStart w:id="100" w:name="_Toc236246095"/>
       <w:r>
         <w:lastRenderedPageBreak/>
         <w:t>E</w:t>
@@ -8932,7 +8939,7 @@
       </w:pPr>
       <w:bookmarkStart w:id="111" w:name="_Toc196339525"/>
       <w:bookmarkStart w:id="112" w:name="_Toc196339894"/>
-      <w:bookmarkStart w:id="113" w:name="_Toc236167772"/>
+      <w:bookmarkStart w:id="113" w:name="_Toc236246096"/>
       <w:r>
         <w:t xml:space="preserve">Ein </w:t>
       </w:r>
@@ -9414,7 +9421,7 @@
       <w:pPr>
         <w:pStyle w:val="berschrift1"/>
       </w:pPr>
-      <w:bookmarkStart w:id="118" w:name="_Toc236167773"/>
+      <w:bookmarkStart w:id="118" w:name="_Toc236246097"/>
       <w:r>
         <w:lastRenderedPageBreak/>
         <w:t>Ein Dictionary speichert Paare von Schlüssel und Wert</w:t>
@@ -10520,7 +10527,7 @@
       <w:pPr>
         <w:pStyle w:val="berschrift1"/>
       </w:pPr>
-      <w:bookmarkStart w:id="119" w:name="_Toc236167774"/>
+      <w:bookmarkStart w:id="119" w:name="_Toc236246098"/>
       <w:r>
         <w:lastRenderedPageBreak/>
         <w:t>Der Computer fragt …</w:t>
@@ -11513,7 +11520,7 @@
       <w:pPr>
         <w:pStyle w:val="berschrift1"/>
       </w:pPr>
-      <w:bookmarkStart w:id="120" w:name="_Toc236167775"/>
+      <w:bookmarkStart w:id="120" w:name="_Toc236246099"/>
       <w:r>
         <w:lastRenderedPageBreak/>
         <w:t>Dein Wörterbuch lernt …</w:t>
@@ -12248,7 +12255,7 @@
       <w:pPr>
         <w:pStyle w:val="berschrift1"/>
       </w:pPr>
-      <w:bookmarkStart w:id="121" w:name="_Toc236167776"/>
+      <w:bookmarkStart w:id="121" w:name="_Toc236246100"/>
       <w:r>
         <w:lastRenderedPageBreak/>
         <w:t>Der Computer unterscheidet zwischen "wahr" und "falsch"</w:t>
@@ -13315,7 +13322,7 @@
       <w:pPr>
         <w:pStyle w:val="berschrift1"/>
       </w:pPr>
-      <w:bookmarkStart w:id="122" w:name="_Toc236167777"/>
+      <w:bookmarkStart w:id="122" w:name="_Toc236246101"/>
       <w:r>
         <w:lastRenderedPageBreak/>
         <w:t>Der Computer unterscheidet Fälle</w:t>
@@ -14105,7 +14112,7 @@
       <w:pPr>
         <w:pStyle w:val="berschrift1"/>
       </w:pPr>
-      <w:bookmarkStart w:id="123" w:name="_Toc236167778"/>
+      <w:bookmarkStart w:id="123" w:name="_Toc236246102"/>
       <w:r>
         <w:lastRenderedPageBreak/>
         <w:t>Solange die Beding</w:t>
@@ -15563,7 +15570,7 @@
       <w:pPr>
         <w:pStyle w:val="berschrift1"/>
       </w:pPr>
-      <w:bookmarkStart w:id="124" w:name="_Toc236167779"/>
+      <w:bookmarkStart w:id="124" w:name="_Toc236246103"/>
       <w:r>
         <w:rPr>
           <w:noProof/>
@@ -16506,7 +16513,7 @@
       <w:pPr>
         <w:pStyle w:val="berschrift1"/>
       </w:pPr>
-      <w:bookmarkStart w:id="125" w:name="_Toc236167780"/>
+      <w:bookmarkStart w:id="125" w:name="_Toc236246104"/>
       <w:r>
         <w:lastRenderedPageBreak/>
         <w:t xml:space="preserve">Funktionen </w:t>
@@ -16910,7 +16917,7 @@
       <w:pPr>
         <w:pStyle w:val="berschrift1"/>
       </w:pPr>
-      <w:bookmarkStart w:id="126" w:name="_Toc236167781"/>
+      <w:bookmarkStart w:id="126" w:name="_Toc236246105"/>
       <w:r>
         <w:lastRenderedPageBreak/>
         <w:t xml:space="preserve">Funktionen </w:t>
@@ -18610,7 +18617,7 @@
       <w:pPr>
         <w:pStyle w:val="berschrift1"/>
       </w:pPr>
-      <w:bookmarkStart w:id="127" w:name="_Toc236167782"/>
+      <w:bookmarkStart w:id="127" w:name="_Toc236246106"/>
       <w:r>
         <w:lastRenderedPageBreak/>
         <w:t xml:space="preserve">Funktionen </w:t>
@@ -20269,7 +20276,7 @@
       <w:pPr>
         <w:pStyle w:val="berschrift1"/>
       </w:pPr>
-      <w:bookmarkStart w:id="128" w:name="_Toc236167783"/>
+      <w:bookmarkStart w:id="128" w:name="_Toc236246107"/>
       <w:r>
         <w:rPr>
           <w:noProof/>
@@ -20756,7 +20763,7 @@
       <w:pPr>
         <w:pStyle w:val="berschrift1"/>
       </w:pPr>
-      <w:bookmarkStart w:id="129" w:name="_Toc236167784"/>
+      <w:bookmarkStart w:id="129" w:name="_Toc236246108"/>
       <w:r>
         <w:lastRenderedPageBreak/>
         <w:t>Funktion konstruieren</w:t>
@@ -21679,7 +21686,13 @@
         <w:t xml:space="preserve">. </w:t>
       </w:r>
       <w:r>
-        <w:t xml:space="preserve">Damit würden wir die Funktion mit Input-Daten und erwarteten Output-Daten testen. Dieser Punkt entfällt hier. </w:t>
+        <w:t xml:space="preserve">Damit würden wir die Funktion mit Input-Daten und erwarteten Output-Daten testen. </w:t>
+      </w:r>
+      <w:r>
+        <w:t>Diesen Punkt lassen wir hier weg.</w:t>
+      </w:r>
+      <w:r>
+        <w:t xml:space="preserve"> </w:t>
       </w:r>
     </w:p>
     <w:p>
@@ -21706,7 +21719,10 @@
         <w:t xml:space="preserve"> unter dem Dateinamen "saetze_bauen" im Ordner Python/</w:t>
       </w:r>
       <w:r>
-        <w:t xml:space="preserve"> 10_Aufgaben_mit_Funktionen_loesen</w:t>
+        <w:t xml:space="preserve"> </w:t>
+      </w:r>
+      <w:r>
+        <w:t>10_Funktionen_konstruieren</w:t>
       </w:r>
     </w:p>
     <w:p>
@@ -21810,7 +21826,7 @@
       <w:pPr>
         <w:pStyle w:val="berschrift1"/>
       </w:pPr>
-      <w:bookmarkStart w:id="130" w:name="_Toc236167785"/>
+      <w:bookmarkStart w:id="130" w:name="_Toc236246109"/>
       <w:r>
         <w:lastRenderedPageBreak/>
         <w:t xml:space="preserve">Funktion </w:t>
@@ -22033,13 +22049,7 @@
         <w:t xml:space="preserve">In der Tabelle stehen links die Preise in GBP und rechts die zugehörigen Preise in EUR. </w:t>
       </w:r>
       <w:r>
-        <w:t xml:space="preserve">Die Tabelle </w:t>
-      </w:r>
-      <w:r>
-        <w:t>geht</w:t>
-      </w:r>
-      <w:r>
-        <w:t xml:space="preserve"> von 0 GBP bis 10 GBP in Schritten von 0.50 GBP.</w:t>
+        <w:t>Die Tabelle geht von 0 GBP bis 10 GBP in Schritten von 0.50 GBP.</w:t>
       </w:r>
     </w:p>
     <w:p>
@@ -22053,13 +22063,7 @@
         <w:spacing w:before="240"/>
       </w:pPr>
       <w:r>
-        <w:t xml:space="preserve">Der Umrechnungskurs ist </w:t>
-      </w:r>
-      <w:r>
-        <w:t>1 GBP = 1,17 EUR</w:t>
-      </w:r>
-      <w:r>
-        <w:t>.</w:t>
+        <w:t>Der Umrechnungskurs ist 1 GBP = 1,17 EUR.</w:t>
       </w:r>
     </w:p>
     <w:p>
@@ -22120,6 +22124,9 @@
     </w:p>
     <w:p>
       <w:r>
+        <w:rPr>
+          <w:noProof/>
+        </w:rPr>
         <w:drawing>
           <wp:inline distT="0" distB="0" distL="0" distR="0" wp14:anchorId="20E81DC1" wp14:editId="4A1DCDCC">
             <wp:extent cx="6645910" cy="151130"/>
@@ -22169,13 +22176,7 @@
         <w:contextualSpacing w:val="0"/>
       </w:pPr>
       <w:r>
-        <w:t xml:space="preserve">Du schreibst eine Funktion, die </w:t>
-      </w:r>
-      <w:r>
-        <w:t>GBP in EUR umrechnet</w:t>
-      </w:r>
-      <w:r>
-        <w:t xml:space="preserve">. Beginne mit </w:t>
+        <w:t xml:space="preserve">Du schreibst eine Funktion, die GBP in EUR umrechnet. Beginne mit </w:t>
       </w:r>
       <w:r>
         <w:rPr>
@@ -22206,6 +22207,9 @@
     </w:p>
     <w:p>
       <w:r>
+        <w:rPr>
+          <w:noProof/>
+        </w:rPr>
         <w:drawing>
           <wp:inline distT="0" distB="0" distL="0" distR="0" wp14:anchorId="60920DE9" wp14:editId="7656CE8C">
             <wp:extent cx="6645910" cy="309880"/>
@@ -22276,6 +22280,9 @@
     </w:p>
     <w:p>
       <w:r>
+        <w:rPr>
+          <w:noProof/>
+        </w:rPr>
         <w:drawing>
           <wp:inline distT="0" distB="0" distL="0" distR="0" wp14:anchorId="01D39F40" wp14:editId="1EB3192A">
             <wp:extent cx="6645910" cy="507365"/>
@@ -22371,6 +22378,9 @@
     </w:p>
     <w:p>
       <w:r>
+        <w:rPr>
+          <w:noProof/>
+        </w:rPr>
         <w:drawing>
           <wp:inline distT="0" distB="0" distL="0" distR="0" wp14:anchorId="53D68AD4" wp14:editId="11411F0F">
             <wp:extent cx="6645910" cy="300990"/>
@@ -22442,6 +22452,9 @@
     </w:p>
     <w:p>
       <w:r>
+        <w:rPr>
+          <w:noProof/>
+        </w:rPr>
         <w:drawing>
           <wp:inline distT="0" distB="0" distL="0" distR="0" wp14:anchorId="56150044" wp14:editId="34D9D956">
             <wp:extent cx="6645910" cy="271145"/>
@@ -22514,10 +22527,7 @@
         <w:br/>
       </w:r>
       <w:r>
-        <w:t>Dazu</w:t>
-      </w:r>
-      <w:r>
-        <w:t xml:space="preserve"> leg</w:t>
+        <w:t>Dazu leg</w:t>
       </w:r>
       <w:r>
         <w:t xml:space="preserve">st </w:t>
@@ -22565,6 +22575,9 @@
     </w:p>
     <w:p>
       <w:r>
+        <w:rPr>
+          <w:noProof/>
+        </w:rPr>
         <w:drawing>
           <wp:inline distT="0" distB="0" distL="0" distR="0" wp14:anchorId="3B0AE5FC" wp14:editId="215C61F5">
             <wp:extent cx="6645910" cy="1005205"/>
@@ -22640,6 +22653,9 @@
         <w:spacing w:before="120"/>
       </w:pPr>
       <w:r>
+        <w:rPr>
+          <w:noProof/>
+        </w:rPr>
         <w:drawing>
           <wp:inline distT="0" distB="0" distL="0" distR="0" wp14:anchorId="6587937A" wp14:editId="60F4A047">
             <wp:extent cx="6645910" cy="405130"/>
@@ -22686,7 +22702,13 @@
       </w:pPr>
       <w:r>
         <w:lastRenderedPageBreak/>
-        <w:t xml:space="preserve">Dann musst du noch die Tabelle drucken. Zuerst druckst du die Überschrift. Danach nimmst du mit </w:t>
+        <w:t xml:space="preserve">Dann musst du noch die Tabelle drucken. Zuerst druckst du die Überschrift. Danach </w:t>
+      </w:r>
+      <w:r>
+        <w:t>bildest</w:t>
+      </w:r>
+      <w:r>
+        <w:t xml:space="preserve"> du mit </w:t>
       </w:r>
       <w:r>
         <w:rPr>
@@ -22701,17 +22723,14 @@
         <w:t>jeder</w:t>
       </w:r>
       <w:r>
-        <w:t xml:space="preserve"> Liste</w:t>
-      </w:r>
-      <w:r>
-        <w:t>F</w:t>
-      </w:r>
-      <w:r>
-        <w:t xml:space="preserve"> und druckst es. </w:t>
-      </w:r>
-    </w:p>
-    <w:p>
-      <w:r>
+        <w:t xml:space="preserve"> Liste und druckst es. </w:t>
+      </w:r>
+    </w:p>
+    <w:p>
+      <w:r>
+        <w:rPr>
+          <w:noProof/>
+        </w:rPr>
         <w:drawing>
           <wp:inline distT="0" distB="0" distL="0" distR="0" wp14:anchorId="3025A7FD" wp14:editId="3F6245BC">
             <wp:extent cx="6645910" cy="554355"/>
@@ -22770,16 +22789,13 @@
         <w:t>File/ Save</w:t>
       </w:r>
       <w:r>
-        <w:t xml:space="preserve"> unter dem Dateinamen "</w:t>
-      </w:r>
-      <w:r>
-        <w:t>gbp_in_eur</w:t>
-      </w:r>
-      <w:r>
-        <w:t>" im Ordner Python/</w:t>
-      </w:r>
-      <w:r>
-        <w:t xml:space="preserve"> 10_Aufgaben_mit_Funktionen_loesen</w:t>
+        <w:t xml:space="preserve"> unter dem Dateinamen "gbp_in_eur" im Ordner Python/</w:t>
+      </w:r>
+      <w:r>
+        <w:t xml:space="preserve"> </w:t>
+      </w:r>
+      <w:r>
+        <w:t>10_Funktionen_konstruieren</w:t>
       </w:r>
     </w:p>
     <w:p>
@@ -23020,6 +23036,9 @@
     </w:p>
     <w:p>
       <w:r>
+        <w:rPr>
+          <w:noProof/>
+        </w:rPr>
         <w:drawing>
           <wp:inline distT="0" distB="0" distL="0" distR="0" wp14:anchorId="5DD9DDB5" wp14:editId="3E966C95">
             <wp:extent cx="6645910" cy="548640"/>
@@ -23089,10 +23108,7 @@
       </w:r>
       <w:r>
         <w:br/>
-        <w:t>Die Format-Strings</w:t>
-      </w:r>
-      <w:r>
-        <w:t xml:space="preserve"> {:</w:t>
+        <w:t>Die Format-Strings {:</w:t>
       </w:r>
       <w:r>
         <w:rPr>
@@ -23134,13 +23150,7 @@
         <w:t>2</w:t>
       </w:r>
       <w:r>
-        <w:t xml:space="preserve"> </w:t>
-      </w:r>
-      <w:r>
-        <w:t xml:space="preserve">Stellen nach dem Komma </w:t>
-      </w:r>
-      <w:r>
-        <w:t xml:space="preserve">als </w:t>
+        <w:t xml:space="preserve"> Stellen nach dem Komma als </w:t>
       </w:r>
       <w:r>
         <w:rPr>
@@ -23149,10 +23159,7 @@
         <w:t>F</w:t>
       </w:r>
       <w:r>
-        <w:t>ließkommazahl ausgegeben werden</w:t>
-      </w:r>
-      <w:r>
-        <w:t>.</w:t>
+        <w:t>ließkommazahl ausgegeben werden.</w:t>
       </w:r>
     </w:p>
     <w:p>
@@ -23227,11 +23234,37 @@
         <w:t>du</w:t>
       </w:r>
       <w:r>
-        <w:t xml:space="preserve"> die Funktion gbp_in_eur mit den Input-Daten </w:t>
+        <w:t xml:space="preserve"> die Funktion </w:t>
+      </w:r>
+      <w:r>
+        <w:rPr>
+          <w:rFonts w:ascii="Courier New" w:hAnsi="Courier New" w:cs="Courier New"/>
+        </w:rPr>
+        <w:t>gbp_in_eur</w:t>
+      </w:r>
+      <w:r>
+        <w:t xml:space="preserve"> mit den Input-Daten </w:t>
       </w:r>
       <w:r>
         <w:br/>
-        <w:t>0, 1, 6.5, 7.5, 9.5, 10, 50, 100 oder -1 aufruf</w:t>
+      </w:r>
+      <w:r>
+        <w:rPr>
+          <w:rFonts w:ascii="Courier New" w:hAnsi="Courier New" w:cs="Courier New"/>
+        </w:rPr>
+        <w:t>0, 1, 6.5, 7.5, 9.5, 10, 50, 100</w:t>
+      </w:r>
+      <w:r>
+        <w:t xml:space="preserve"> oder </w:t>
+      </w:r>
+      <w:r>
+        <w:rPr>
+          <w:rFonts w:ascii="Courier New" w:hAnsi="Courier New" w:cs="Courier New"/>
+        </w:rPr>
+        <w:t>-1</w:t>
+      </w:r>
+      <w:r>
+        <w:t xml:space="preserve"> aufruf</w:t>
       </w:r>
       <w:r>
         <w:t>st</w:t>
@@ -23249,11 +23282,23 @@
         <w:ind w:left="708"/>
       </w:pPr>
       <w:r>
-        <w:t>Wenn du einmal einen Unittest geschrieben hast, muss du die Tabelle nicht selbst checken, sondern kannst das den Computer machen lassen. Du benötigst dazu die Bibliothek unittest:</w:t>
-      </w:r>
-    </w:p>
-    <w:p>
-      <w:r>
+        <w:t xml:space="preserve">Wenn du einmal einen Unittest geschrieben hast, muss du die Tabelle nicht selbst checken, sondern kannst das den Computer machen lassen. Du benötigst dazu die Bibliothek </w:t>
+      </w:r>
+      <w:r>
+        <w:rPr>
+          <w:rFonts w:ascii="Courier New" w:hAnsi="Courier New" w:cs="Courier New"/>
+        </w:rPr>
+        <w:t>unittest</w:t>
+      </w:r>
+      <w:r>
+        <w:t>:</w:t>
+      </w:r>
+    </w:p>
+    <w:p>
+      <w:r>
+        <w:rPr>
+          <w:noProof/>
+        </w:rPr>
         <w:drawing>
           <wp:inline distT="0" distB="0" distL="0" distR="0" wp14:anchorId="366B3887" wp14:editId="7389B20B">
             <wp:extent cx="6645910" cy="269240"/>
@@ -23368,6 +23413,9 @@
     </w:p>
     <w:p>
       <w:r>
+        <w:rPr>
+          <w:noProof/>
+        </w:rPr>
         <w:drawing>
           <wp:inline distT="0" distB="0" distL="0" distR="0" wp14:anchorId="59A0BD0E" wp14:editId="095EB8E4">
             <wp:extent cx="6225235" cy="1677352"/>
@@ -23415,6 +23463,9 @@
     </w:p>
     <w:p>
       <w:r>
+        <w:rPr>
+          <w:noProof/>
+        </w:rPr>
         <w:drawing>
           <wp:inline distT="0" distB="0" distL="0" distR="0" wp14:anchorId="36EFE6A1" wp14:editId="0A7F16E4">
             <wp:extent cx="6247180" cy="391568"/>
@@ -23495,7 +23546,7 @@
       <w:pPr>
         <w:pStyle w:val="berschrift1"/>
       </w:pPr>
-      <w:bookmarkStart w:id="131" w:name="_Toc236167786"/>
+      <w:bookmarkStart w:id="131" w:name="_Toc236246110"/>
       <w:r>
         <w:rPr>
           <w:noProof/>
@@ -23504,7 +23555,7 @@
         <mc:AlternateContent>
           <mc:Choice Requires="wps">
             <w:drawing>
-              <wp:anchor distT="45720" distB="45720" distL="114300" distR="114300" simplePos="0" relativeHeight="251708416" behindDoc="0" locked="0" layoutInCell="1" allowOverlap="1" wp14:anchorId="4D9D2665" wp14:editId="7C4BF777">
+              <wp:anchor distT="45720" distB="45720" distL="114300" distR="114300" simplePos="0" relativeHeight="251708416" behindDoc="0" locked="0" layoutInCell="1" allowOverlap="1" wp14:anchorId="4D9D2665" wp14:editId="559D1E70">
                 <wp:simplePos x="0" y="0"/>
                 <wp:positionH relativeFrom="margin">
                   <wp:posOffset>843923</wp:posOffset>
@@ -23608,6 +23659,9 @@
       <w:bookmarkEnd w:id="131"/>
     </w:p>
     <w:p>
+      <w:pPr>
+        <w:spacing w:after="240"/>
+      </w:pPr>
       <w:r>
         <w:rPr>
           <w:noProof/>
@@ -23659,12 +23713,12 @@
       <w:tblPr>
         <w:tblW w:w="10000" w:type="dxa"/>
         <w:tblBorders>
-          <w:top w:val="single" w:sz="4" w:space="0" w:color="auto"/>
-          <w:left w:val="single" w:sz="4" w:space="0" w:color="auto"/>
-          <w:bottom w:val="single" w:sz="4" w:space="0" w:color="auto"/>
-          <w:right w:val="single" w:sz="4" w:space="0" w:color="auto"/>
-          <w:insideH w:val="single" w:sz="4" w:space="0" w:color="auto"/>
-          <w:insideV w:val="single" w:sz="4" w:space="0" w:color="auto"/>
+          <w:top w:val="single" w:sz="8" w:space="0" w:color="auto"/>
+          <w:left w:val="single" w:sz="8" w:space="0" w:color="auto"/>
+          <w:bottom w:val="single" w:sz="8" w:space="0" w:color="auto"/>
+          <w:right w:val="single" w:sz="8" w:space="0" w:color="auto"/>
+          <w:insideH w:val="single" w:sz="8" w:space="0" w:color="auto"/>
+          <w:insideV w:val="single" w:sz="8" w:space="0" w:color="auto"/>
         </w:tblBorders>
         <w:tblCellMar>
           <w:left w:w="10" w:type="dxa"/>
@@ -23927,7 +23981,7 @@
           <w:bottom w:val="single" w:sz="4" w:space="1" w:color="auto"/>
           <w:right w:val="single" w:sz="4" w:space="4" w:color="auto"/>
         </w:pBdr>
-        <w:spacing w:after="120"/>
+        <w:spacing w:before="120" w:after="120"/>
       </w:pPr>
       <w:r>
         <w:t xml:space="preserve">Du möchtest Tennisunterricht nehmen. Dazu prüfst du zwei Angebote. Du rechnest mit mindestens </w:t>
@@ -23953,25 +24007,7 @@
         <w:t xml:space="preserve">Schreibe ein Programm, das eine Vergleichstabelle druckt. In der Tabelle stehen links die Trainerstunden, rechts daneben die Kosten für das Angebot Tennis Pro, rechts daneben die Kosten für das Angebot Go-Tennis. </w:t>
       </w:r>
       <w:r>
-        <w:t xml:space="preserve">Die Tabelle geht von 0 bis </w:t>
-      </w:r>
-      <w:r>
-        <w:t>12</w:t>
-      </w:r>
-      <w:r>
-        <w:t xml:space="preserve"> </w:t>
-      </w:r>
-      <w:r>
-        <w:t>Trainerstunden</w:t>
-      </w:r>
-      <w:r>
-        <w:t xml:space="preserve"> in Schritten von </w:t>
-      </w:r>
-      <w:r>
-        <w:t>1 Trainerstunde</w:t>
-      </w:r>
-      <w:r>
-        <w:t>.</w:t>
+        <w:t>Die Tabelle geht von 0 bis 12 Trainerstunden in Schritten von 1 Trainerstunde.</w:t>
       </w:r>
     </w:p>
     <w:p>
@@ -24001,9 +24037,10 @@
         <w:pStyle w:val="Listenabsatz"/>
         <w:numPr>
           <w:ilvl w:val="0"/>
-          <w:numId w:val="39"/>
+          <w:numId w:val="34"/>
         </w:numPr>
-        <w:spacing w:before="120"/>
+        <w:spacing w:before="240"/>
+        <w:ind w:left="714" w:hanging="357"/>
         <w:contextualSpacing w:val="0"/>
       </w:pPr>
       <w:r>
@@ -24028,30 +24065,1487 @@
         <w:pStyle w:val="Listenabsatz"/>
         <w:numPr>
           <w:ilvl w:val="0"/>
-          <w:numId w:val="39"/>
+          <w:numId w:val="34"/>
+        </w:numPr>
+        <w:spacing w:before="240"/>
+        <w:ind w:left="714" w:hanging="357"/>
+        <w:contextualSpacing w:val="0"/>
+      </w:pPr>
+      <w:r>
+        <w:t>Die erste Zeile im Editor-Fenster beschreibt, was das Programm tut:</w:t>
+      </w:r>
+    </w:p>
+    <w:p>
+      <w:r>
+        <w:drawing>
+          <wp:inline distT="0" distB="0" distL="0" distR="0" wp14:anchorId="28A2DB1D" wp14:editId="66ADDF9B">
+            <wp:extent cx="6645910" cy="154940"/>
+            <wp:effectExtent l="0" t="0" r="2540" b="0"/>
+            <wp:docPr id="512232938" name="Grafik 1"/>
+            <wp:cNvGraphicFramePr>
+              <a:graphicFrameLocks xmlns:a="http://schemas.openxmlformats.org/drawingml/2006/main" noChangeAspect="1"/>
+            </wp:cNvGraphicFramePr>
+            <a:graphic xmlns:a="http://schemas.openxmlformats.org/drawingml/2006/main">
+              <a:graphicData uri="http://schemas.openxmlformats.org/drawingml/2006/picture">
+                <pic:pic xmlns:pic="http://schemas.openxmlformats.org/drawingml/2006/picture">
+                  <pic:nvPicPr>
+                    <pic:cNvPr id="512232938" name=""/>
+                    <pic:cNvPicPr/>
+                  </pic:nvPicPr>
+                  <pic:blipFill>
+                    <a:blip r:embed="rId62"/>
+                    <a:stretch>
+                      <a:fillRect/>
+                    </a:stretch>
+                  </pic:blipFill>
+                  <pic:spPr>
+                    <a:xfrm>
+                      <a:off x="0" y="0"/>
+                      <a:ext cx="6645910" cy="154940"/>
+                    </a:xfrm>
+                    <a:prstGeom prst="rect">
+                      <a:avLst/>
+                    </a:prstGeom>
+                  </pic:spPr>
+                </pic:pic>
+              </a:graphicData>
+            </a:graphic>
+          </wp:inline>
+        </w:drawing>
+      </w:r>
+    </w:p>
+    <w:p>
+      <w:pPr>
+        <w:pStyle w:val="Listenabsatz"/>
+        <w:numPr>
+          <w:ilvl w:val="0"/>
+          <w:numId w:val="34"/>
+        </w:numPr>
+        <w:spacing w:before="240"/>
+        <w:ind w:left="714" w:hanging="357"/>
+        <w:contextualSpacing w:val="0"/>
+      </w:pPr>
+      <w:r>
+        <w:t xml:space="preserve">Für die zwei Angebote brauchst du zwei Funktionen. Beginne mit </w:t>
+      </w:r>
+      <w:r>
+        <w:rPr>
+          <w:b/>
+          <w:bCs/>
+        </w:rPr>
+        <w:t>Punkt 1</w:t>
+      </w:r>
+      <w:r>
+        <w:t xml:space="preserve"> der </w:t>
+      </w:r>
+      <w:r>
+        <w:t>Konstruktionsanleitung</w:t>
+      </w:r>
+      <w:r>
+        <w:t xml:space="preserve"> von </w:t>
+      </w:r>
+      <w:r>
+        <w:t>Tennis Pro</w:t>
+      </w:r>
+      <w:r>
+        <w:t>:</w:t>
+      </w:r>
+      <w:r>
+        <w:t xml:space="preserve"> </w:t>
+      </w:r>
+      <w:r>
+        <w:rPr>
+          <w:b/>
+          <w:bCs/>
+        </w:rPr>
+        <w:t>Kurzbeschreibung</w:t>
+      </w:r>
+      <w:r>
+        <w:t>.</w:t>
+      </w:r>
+    </w:p>
+    <w:p>
+      <w:r>
+        <w:drawing>
+          <wp:inline distT="0" distB="0" distL="0" distR="0" wp14:anchorId="73CEAE78" wp14:editId="32E0323D">
+            <wp:extent cx="6645910" cy="294005"/>
+            <wp:effectExtent l="0" t="0" r="2540" b="0"/>
+            <wp:docPr id="2036444646" name="Grafik 1"/>
+            <wp:cNvGraphicFramePr>
+              <a:graphicFrameLocks xmlns:a="http://schemas.openxmlformats.org/drawingml/2006/main" noChangeAspect="1"/>
+            </wp:cNvGraphicFramePr>
+            <a:graphic xmlns:a="http://schemas.openxmlformats.org/drawingml/2006/main">
+              <a:graphicData uri="http://schemas.openxmlformats.org/drawingml/2006/picture">
+                <pic:pic xmlns:pic="http://schemas.openxmlformats.org/drawingml/2006/picture">
+                  <pic:nvPicPr>
+                    <pic:cNvPr id="2036444646" name=""/>
+                    <pic:cNvPicPr/>
+                  </pic:nvPicPr>
+                  <pic:blipFill>
+                    <a:blip r:embed="rId63"/>
+                    <a:stretch>
+                      <a:fillRect/>
+                    </a:stretch>
+                  </pic:blipFill>
+                  <pic:spPr>
+                    <a:xfrm>
+                      <a:off x="0" y="0"/>
+                      <a:ext cx="6645910" cy="294005"/>
+                    </a:xfrm>
+                    <a:prstGeom prst="rect">
+                      <a:avLst/>
+                    </a:prstGeom>
+                  </pic:spPr>
+                </pic:pic>
+              </a:graphicData>
+            </a:graphic>
+          </wp:inline>
+        </w:drawing>
+      </w:r>
+    </w:p>
+    <w:p>
+      <w:pPr>
+        <w:pStyle w:val="Listenabsatz"/>
+        <w:numPr>
+          <w:ilvl w:val="0"/>
+          <w:numId w:val="34"/>
+        </w:numPr>
+        <w:spacing w:before="240"/>
+        <w:ind w:left="714" w:hanging="357"/>
+        <w:contextualSpacing w:val="0"/>
+      </w:pPr>
+      <w:r>
+        <w:rPr>
+          <w:b/>
+          <w:bCs/>
+        </w:rPr>
+        <w:t xml:space="preserve">Punkt 2 </w:t>
+      </w:r>
+      <w:r>
+        <w:t xml:space="preserve">der Konstruktionsanleitung </w:t>
+      </w:r>
+      <w:r>
+        <w:t xml:space="preserve">von </w:t>
+      </w:r>
+      <w:r>
+        <w:t>Tennis Pro</w:t>
+      </w:r>
+      <w:r>
+        <w:t xml:space="preserve"> i</w:t>
+      </w:r>
+      <w:r>
+        <w:t xml:space="preserve">st die </w:t>
+      </w:r>
+      <w:r>
+        <w:rPr>
+          <w:b/>
+          <w:bCs/>
+        </w:rPr>
+        <w:t>Datenanalyse</w:t>
+      </w:r>
+      <w:r>
+        <w:t>. Was ist der Input der Funktion, was ist der Output der Funktion:</w:t>
+      </w:r>
+    </w:p>
+    <w:p>
+      <w:r>
+        <w:drawing>
+          <wp:inline distT="0" distB="0" distL="0" distR="0" wp14:anchorId="0C447B70" wp14:editId="62F6F8D5">
+            <wp:extent cx="6645910" cy="543560"/>
+            <wp:effectExtent l="0" t="0" r="2540" b="8890"/>
+            <wp:docPr id="56574138" name="Grafik 1"/>
+            <wp:cNvGraphicFramePr>
+              <a:graphicFrameLocks xmlns:a="http://schemas.openxmlformats.org/drawingml/2006/main" noChangeAspect="1"/>
+            </wp:cNvGraphicFramePr>
+            <a:graphic xmlns:a="http://schemas.openxmlformats.org/drawingml/2006/main">
+              <a:graphicData uri="http://schemas.openxmlformats.org/drawingml/2006/picture">
+                <pic:pic xmlns:pic="http://schemas.openxmlformats.org/drawingml/2006/picture">
+                  <pic:nvPicPr>
+                    <pic:cNvPr id="56574138" name=""/>
+                    <pic:cNvPicPr/>
+                  </pic:nvPicPr>
+                  <pic:blipFill>
+                    <a:blip r:embed="rId64"/>
+                    <a:stretch>
+                      <a:fillRect/>
+                    </a:stretch>
+                  </pic:blipFill>
+                  <pic:spPr>
+                    <a:xfrm>
+                      <a:off x="0" y="0"/>
+                      <a:ext cx="6645910" cy="543560"/>
+                    </a:xfrm>
+                    <a:prstGeom prst="rect">
+                      <a:avLst/>
+                    </a:prstGeom>
+                  </pic:spPr>
+                </pic:pic>
+              </a:graphicData>
+            </a:graphic>
+          </wp:inline>
+        </w:drawing>
+      </w:r>
+    </w:p>
+    <w:p>
+      <w:pPr>
+        <w:spacing w:before="120"/>
+        <w:ind w:left="708"/>
+      </w:pPr>
+      <w:r>
+        <w:t>Hinweis: Die Preise der Angebote sind ganzzahlig. Du könntest</w:t>
+      </w:r>
+      <w:r>
+        <w:t xml:space="preserve"> Input</w:t>
+      </w:r>
+      <w:r>
+        <w:t xml:space="preserve"> und Output als</w:t>
+      </w:r>
+      <w:r>
+        <w:t xml:space="preserve"> Ganzzahl </w:t>
+      </w:r>
+      <w:r>
+        <w:rPr>
+          <w:rFonts w:ascii="Courier New" w:hAnsi="Courier New" w:cs="Courier New"/>
+        </w:rPr>
+        <w:t>(int)</w:t>
+      </w:r>
+      <w:r>
+        <w:t xml:space="preserve"> </w:t>
+      </w:r>
+      <w:r>
+        <w:t xml:space="preserve">angeben. Gib </w:t>
+      </w:r>
+      <w:r>
+        <w:t>Input und</w:t>
+      </w:r>
+      <w:r>
+        <w:t xml:space="preserve"> Output als </w:t>
+      </w:r>
+      <w:r>
+        <w:rPr>
+          <w:rFonts w:ascii="Courier New" w:hAnsi="Courier New" w:cs="Courier New"/>
+        </w:rPr>
+        <w:t>float</w:t>
+      </w:r>
+      <w:r>
+        <w:t xml:space="preserve"> an, denn die Preise können sich ändern! Die Funktion soll auch mit Dezimalzahlen arbeiten können. </w:t>
+      </w:r>
+    </w:p>
+    <w:p>
+      <w:pPr>
+        <w:pStyle w:val="Listenabsatz"/>
+        <w:numPr>
+          <w:ilvl w:val="0"/>
+          <w:numId w:val="34"/>
+        </w:numPr>
+        <w:spacing w:before="240"/>
+        <w:ind w:left="714" w:hanging="357"/>
+        <w:contextualSpacing w:val="0"/>
+      </w:pPr>
+      <w:r>
+        <w:rPr>
+          <w:b/>
+          <w:bCs/>
+        </w:rPr>
+        <w:t xml:space="preserve">Punkt 3 </w:t>
+      </w:r>
+      <w:r>
+        <w:t xml:space="preserve">der Konstruktionsanleitung </w:t>
+      </w:r>
+      <w:r>
+        <w:t xml:space="preserve">von Tennis Pro </w:t>
+      </w:r>
+      <w:r>
+        <w:t xml:space="preserve">ist: </w:t>
+      </w:r>
+      <w:r>
+        <w:br/>
+      </w:r>
+      <w:r>
+        <w:rPr>
+          <w:b/>
+          <w:bCs/>
+        </w:rPr>
+        <w:t>Funktion definieren</w:t>
+      </w:r>
+      <w:r>
+        <w:t xml:space="preserve"> </w:t>
+      </w:r>
+      <w:r>
+        <w:rPr>
+          <w:highlight w:val="cyan"/>
+        </w:rPr>
+        <w:t>Name</w:t>
+      </w:r>
+      <w:r>
+        <w:t xml:space="preserve"> – </w:t>
+      </w:r>
+      <w:r>
+        <w:rPr>
+          <w:highlight w:val="yellow"/>
+        </w:rPr>
+        <w:t>Input: Datentyp</w:t>
+      </w:r>
+      <w:r>
+        <w:t xml:space="preserve"> – </w:t>
+      </w:r>
+      <w:r>
+        <w:rPr>
+          <w:highlight w:val="green"/>
+        </w:rPr>
+        <w:t>Output: Datentyp</w:t>
+      </w:r>
+    </w:p>
+    <w:p>
+      <w:r>
+        <w:drawing>
+          <wp:inline distT="0" distB="0" distL="0" distR="0" wp14:anchorId="5656A6CD" wp14:editId="5C9CE5CC">
+            <wp:extent cx="6645910" cy="283845"/>
+            <wp:effectExtent l="0" t="0" r="2540" b="1905"/>
+            <wp:docPr id="1410427255" name="Grafik 1"/>
+            <wp:cNvGraphicFramePr>
+              <a:graphicFrameLocks xmlns:a="http://schemas.openxmlformats.org/drawingml/2006/main" noChangeAspect="1"/>
+            </wp:cNvGraphicFramePr>
+            <a:graphic xmlns:a="http://schemas.openxmlformats.org/drawingml/2006/main">
+              <a:graphicData uri="http://schemas.openxmlformats.org/drawingml/2006/picture">
+                <pic:pic xmlns:pic="http://schemas.openxmlformats.org/drawingml/2006/picture">
+                  <pic:nvPicPr>
+                    <pic:cNvPr id="1410427255" name=""/>
+                    <pic:cNvPicPr/>
+                  </pic:nvPicPr>
+                  <pic:blipFill>
+                    <a:blip r:embed="rId65"/>
+                    <a:stretch>
+                      <a:fillRect/>
+                    </a:stretch>
+                  </pic:blipFill>
+                  <pic:spPr>
+                    <a:xfrm>
+                      <a:off x="0" y="0"/>
+                      <a:ext cx="6645910" cy="283845"/>
+                    </a:xfrm>
+                    <a:prstGeom prst="rect">
+                      <a:avLst/>
+                    </a:prstGeom>
+                  </pic:spPr>
+                </pic:pic>
+              </a:graphicData>
+            </a:graphic>
+          </wp:inline>
+        </w:drawing>
+      </w:r>
+    </w:p>
+    <w:p>
+      <w:pPr>
+        <w:pStyle w:val="Listenabsatz"/>
+        <w:numPr>
+          <w:ilvl w:val="0"/>
+          <w:numId w:val="34"/>
+        </w:numPr>
+        <w:spacing w:before="240"/>
+        <w:ind w:left="714" w:hanging="357"/>
+        <w:contextualSpacing w:val="0"/>
+      </w:pPr>
+      <w:r>
+        <w:rPr>
+          <w:b/>
+          <w:bCs/>
+        </w:rPr>
+        <w:t>Punkt 4</w:t>
+      </w:r>
+      <w:r>
+        <w:t xml:space="preserve"> der Konstruktionsanleitung </w:t>
+      </w:r>
+      <w:r>
+        <w:t xml:space="preserve">von Tennis Pro </w:t>
+      </w:r>
+      <w:r>
+        <w:t xml:space="preserve">ist der </w:t>
+      </w:r>
+      <w:r>
+        <w:rPr>
+          <w:b/>
+          <w:bCs/>
+        </w:rPr>
+        <w:t>Funktionsrumpf</w:t>
+      </w:r>
+      <w:r>
+        <w:t xml:space="preserve">: </w:t>
+      </w:r>
+    </w:p>
+    <w:p>
+      <w:r>
+        <w:drawing>
+          <wp:inline distT="0" distB="0" distL="0" distR="0" wp14:anchorId="57C89A77" wp14:editId="2A58D3EA">
+            <wp:extent cx="6645910" cy="260350"/>
+            <wp:effectExtent l="0" t="0" r="2540" b="6350"/>
+            <wp:docPr id="1564958357" name="Grafik 1"/>
+            <wp:cNvGraphicFramePr>
+              <a:graphicFrameLocks xmlns:a="http://schemas.openxmlformats.org/drawingml/2006/main" noChangeAspect="1"/>
+            </wp:cNvGraphicFramePr>
+            <a:graphic xmlns:a="http://schemas.openxmlformats.org/drawingml/2006/main">
+              <a:graphicData uri="http://schemas.openxmlformats.org/drawingml/2006/picture">
+                <pic:pic xmlns:pic="http://schemas.openxmlformats.org/drawingml/2006/picture">
+                  <pic:nvPicPr>
+                    <pic:cNvPr id="1564958357" name=""/>
+                    <pic:cNvPicPr/>
+                  </pic:nvPicPr>
+                  <pic:blipFill>
+                    <a:blip r:embed="rId66"/>
+                    <a:stretch>
+                      <a:fillRect/>
+                    </a:stretch>
+                  </pic:blipFill>
+                  <pic:spPr>
+                    <a:xfrm>
+                      <a:off x="0" y="0"/>
+                      <a:ext cx="6645910" cy="260350"/>
+                    </a:xfrm>
+                    <a:prstGeom prst="rect">
+                      <a:avLst/>
+                    </a:prstGeom>
+                  </pic:spPr>
+                </pic:pic>
+              </a:graphicData>
+            </a:graphic>
+          </wp:inline>
+        </w:drawing>
+      </w:r>
+    </w:p>
+    <w:p/>
+    <w:p>
+      <w:pPr>
+        <w:pStyle w:val="Listenabsatz"/>
+        <w:numPr>
+          <w:ilvl w:val="0"/>
+          <w:numId w:val="34"/>
+        </w:numPr>
+        <w:spacing w:before="240"/>
+        <w:ind w:left="714" w:hanging="357"/>
+        <w:contextualSpacing w:val="0"/>
+      </w:pPr>
+      <w:r>
+        <w:lastRenderedPageBreak/>
+        <w:t>Es geht weiter</w:t>
+      </w:r>
+      <w:r>
+        <w:t xml:space="preserve"> mit </w:t>
+      </w:r>
+      <w:r>
+        <w:rPr>
+          <w:b/>
+          <w:bCs/>
+        </w:rPr>
+        <w:t>Punkt 1</w:t>
+      </w:r>
+      <w:r>
+        <w:t xml:space="preserve"> der </w:t>
+      </w:r>
+      <w:r>
+        <w:t>Konstruktionsanleitung</w:t>
+      </w:r>
+      <w:r>
+        <w:t xml:space="preserve"> von </w:t>
+      </w:r>
+      <w:r>
+        <w:t>Go-</w:t>
+      </w:r>
+      <w:r>
+        <w:t>Tennis:</w:t>
+      </w:r>
+      <w:r>
+        <w:t xml:space="preserve"> </w:t>
+      </w:r>
+      <w:r>
+        <w:rPr>
+          <w:b/>
+          <w:bCs/>
+        </w:rPr>
+        <w:t>Kurzbeschreibung</w:t>
+      </w:r>
+      <w:r>
+        <w:t>.</w:t>
+      </w:r>
+    </w:p>
+    <w:p>
+      <w:r>
+        <w:drawing>
+          <wp:inline distT="0" distB="0" distL="0" distR="0" wp14:anchorId="0C38CB3B" wp14:editId="5C4181FC">
+            <wp:extent cx="6645910" cy="269875"/>
+            <wp:effectExtent l="0" t="0" r="2540" b="0"/>
+            <wp:docPr id="38991977" name="Grafik 1"/>
+            <wp:cNvGraphicFramePr>
+              <a:graphicFrameLocks xmlns:a="http://schemas.openxmlformats.org/drawingml/2006/main" noChangeAspect="1"/>
+            </wp:cNvGraphicFramePr>
+            <a:graphic xmlns:a="http://schemas.openxmlformats.org/drawingml/2006/main">
+              <a:graphicData uri="http://schemas.openxmlformats.org/drawingml/2006/picture">
+                <pic:pic xmlns:pic="http://schemas.openxmlformats.org/drawingml/2006/picture">
+                  <pic:nvPicPr>
+                    <pic:cNvPr id="38991977" name=""/>
+                    <pic:cNvPicPr/>
+                  </pic:nvPicPr>
+                  <pic:blipFill>
+                    <a:blip r:embed="rId67"/>
+                    <a:stretch>
+                      <a:fillRect/>
+                    </a:stretch>
+                  </pic:blipFill>
+                  <pic:spPr>
+                    <a:xfrm>
+                      <a:off x="0" y="0"/>
+                      <a:ext cx="6645910" cy="269875"/>
+                    </a:xfrm>
+                    <a:prstGeom prst="rect">
+                      <a:avLst/>
+                    </a:prstGeom>
+                  </pic:spPr>
+                </pic:pic>
+              </a:graphicData>
+            </a:graphic>
+          </wp:inline>
+        </w:drawing>
+      </w:r>
+    </w:p>
+    <w:p>
+      <w:pPr>
+        <w:pStyle w:val="Listenabsatz"/>
+        <w:numPr>
+          <w:ilvl w:val="0"/>
+          <w:numId w:val="34"/>
+        </w:numPr>
+        <w:spacing w:before="240"/>
+        <w:ind w:left="714" w:hanging="357"/>
+        <w:contextualSpacing w:val="0"/>
+      </w:pPr>
+      <w:r>
+        <w:rPr>
+          <w:b/>
+          <w:bCs/>
+        </w:rPr>
+        <w:t xml:space="preserve">Punkt 2 </w:t>
+      </w:r>
+      <w:r>
+        <w:t xml:space="preserve">der Konstruktionsanleitung von </w:t>
+      </w:r>
+      <w:r>
+        <w:t>Go-</w:t>
+      </w:r>
+      <w:r>
+        <w:t xml:space="preserve">Tennis </w:t>
+      </w:r>
+      <w:r>
+        <w:t xml:space="preserve">ist die </w:t>
+      </w:r>
+      <w:r>
+        <w:rPr>
+          <w:b/>
+          <w:bCs/>
+        </w:rPr>
+        <w:t>Datenanalyse</w:t>
+      </w:r>
+      <w:r>
+        <w:t>. Was ist der Input der Funktion, was ist der Output der Funktion:</w:t>
+      </w:r>
+    </w:p>
+    <w:p>
+      <w:r>
+        <w:drawing>
+          <wp:inline distT="0" distB="0" distL="0" distR="0" wp14:anchorId="0AD45F2A" wp14:editId="2A768D43">
+            <wp:extent cx="6645910" cy="546735"/>
+            <wp:effectExtent l="0" t="0" r="2540" b="5715"/>
+            <wp:docPr id="1170797155" name="Grafik 1"/>
+            <wp:cNvGraphicFramePr>
+              <a:graphicFrameLocks xmlns:a="http://schemas.openxmlformats.org/drawingml/2006/main" noChangeAspect="1"/>
+            </wp:cNvGraphicFramePr>
+            <a:graphic xmlns:a="http://schemas.openxmlformats.org/drawingml/2006/main">
+              <a:graphicData uri="http://schemas.openxmlformats.org/drawingml/2006/picture">
+                <pic:pic xmlns:pic="http://schemas.openxmlformats.org/drawingml/2006/picture">
+                  <pic:nvPicPr>
+                    <pic:cNvPr id="1170797155" name=""/>
+                    <pic:cNvPicPr/>
+                  </pic:nvPicPr>
+                  <pic:blipFill>
+                    <a:blip r:embed="rId68"/>
+                    <a:stretch>
+                      <a:fillRect/>
+                    </a:stretch>
+                  </pic:blipFill>
+                  <pic:spPr>
+                    <a:xfrm>
+                      <a:off x="0" y="0"/>
+                      <a:ext cx="6645910" cy="546735"/>
+                    </a:xfrm>
+                    <a:prstGeom prst="rect">
+                      <a:avLst/>
+                    </a:prstGeom>
+                  </pic:spPr>
+                </pic:pic>
+              </a:graphicData>
+            </a:graphic>
+          </wp:inline>
+        </w:drawing>
+      </w:r>
+    </w:p>
+    <w:p>
+      <w:pPr>
+        <w:pStyle w:val="Listenabsatz"/>
+        <w:numPr>
+          <w:ilvl w:val="0"/>
+          <w:numId w:val="34"/>
+        </w:numPr>
+        <w:spacing w:before="240"/>
+        <w:ind w:left="714" w:hanging="357"/>
+        <w:contextualSpacing w:val="0"/>
+      </w:pPr>
+      <w:r>
+        <w:rPr>
+          <w:b/>
+          <w:bCs/>
+        </w:rPr>
+        <w:t xml:space="preserve">Punkt 3 </w:t>
+      </w:r>
+      <w:r>
+        <w:t xml:space="preserve">der Konstruktionsanleitung von </w:t>
+      </w:r>
+      <w:r>
+        <w:t>Go-</w:t>
+      </w:r>
+      <w:r>
+        <w:t xml:space="preserve">Tennis ist: </w:t>
+      </w:r>
+      <w:r>
+        <w:br/>
+      </w:r>
+      <w:r>
+        <w:rPr>
+          <w:b/>
+          <w:bCs/>
+        </w:rPr>
+        <w:t>Funktion definieren</w:t>
+      </w:r>
+      <w:r>
+        <w:t xml:space="preserve"> </w:t>
+      </w:r>
+      <w:r>
+        <w:rPr>
+          <w:highlight w:val="cyan"/>
+        </w:rPr>
+        <w:t>Name</w:t>
+      </w:r>
+      <w:r>
+        <w:t xml:space="preserve"> – </w:t>
+      </w:r>
+      <w:r>
+        <w:rPr>
+          <w:highlight w:val="yellow"/>
+        </w:rPr>
+        <w:t>Input: Datentyp</w:t>
+      </w:r>
+      <w:r>
+        <w:t xml:space="preserve"> – </w:t>
+      </w:r>
+      <w:r>
+        <w:rPr>
+          <w:highlight w:val="green"/>
+        </w:rPr>
+        <w:t>Output: Datentyp</w:t>
+      </w:r>
+    </w:p>
+    <w:p>
+      <w:r>
+        <w:drawing>
+          <wp:inline distT="0" distB="0" distL="0" distR="0" wp14:anchorId="15563489" wp14:editId="7D4962B7">
+            <wp:extent cx="6645910" cy="281940"/>
+            <wp:effectExtent l="0" t="0" r="2540" b="3810"/>
+            <wp:docPr id="2018843506" name="Grafik 1"/>
+            <wp:cNvGraphicFramePr>
+              <a:graphicFrameLocks xmlns:a="http://schemas.openxmlformats.org/drawingml/2006/main" noChangeAspect="1"/>
+            </wp:cNvGraphicFramePr>
+            <a:graphic xmlns:a="http://schemas.openxmlformats.org/drawingml/2006/main">
+              <a:graphicData uri="http://schemas.openxmlformats.org/drawingml/2006/picture">
+                <pic:pic xmlns:pic="http://schemas.openxmlformats.org/drawingml/2006/picture">
+                  <pic:nvPicPr>
+                    <pic:cNvPr id="2018843506" name=""/>
+                    <pic:cNvPicPr/>
+                  </pic:nvPicPr>
+                  <pic:blipFill>
+                    <a:blip r:embed="rId69"/>
+                    <a:stretch>
+                      <a:fillRect/>
+                    </a:stretch>
+                  </pic:blipFill>
+                  <pic:spPr>
+                    <a:xfrm>
+                      <a:off x="0" y="0"/>
+                      <a:ext cx="6645910" cy="281940"/>
+                    </a:xfrm>
+                    <a:prstGeom prst="rect">
+                      <a:avLst/>
+                    </a:prstGeom>
+                  </pic:spPr>
+                </pic:pic>
+              </a:graphicData>
+            </a:graphic>
+          </wp:inline>
+        </w:drawing>
+      </w:r>
+    </w:p>
+    <w:p>
+      <w:pPr>
+        <w:pStyle w:val="Listenabsatz"/>
+        <w:numPr>
+          <w:ilvl w:val="0"/>
+          <w:numId w:val="34"/>
+        </w:numPr>
+        <w:spacing w:before="240"/>
+        <w:ind w:left="714" w:hanging="357"/>
+        <w:contextualSpacing w:val="0"/>
+      </w:pPr>
+      <w:r>
+        <w:rPr>
+          <w:b/>
+          <w:bCs/>
+        </w:rPr>
+        <w:t>Punkt 4</w:t>
+      </w:r>
+      <w:r>
+        <w:t xml:space="preserve"> der Konstruktionsanleitung von </w:t>
+      </w:r>
+      <w:r>
+        <w:t>Go-</w:t>
+      </w:r>
+      <w:r>
+        <w:t xml:space="preserve">Tennis ist der </w:t>
+      </w:r>
+      <w:r>
+        <w:rPr>
+          <w:b/>
+          <w:bCs/>
+        </w:rPr>
+        <w:t>Funktionsrumpf</w:t>
+      </w:r>
+      <w:r>
+        <w:t xml:space="preserve">: </w:t>
+      </w:r>
+    </w:p>
+    <w:p>
+      <w:r>
+        <w:drawing>
+          <wp:inline distT="0" distB="0" distL="0" distR="0" wp14:anchorId="0E8C2389" wp14:editId="7465864C">
+            <wp:extent cx="6645910" cy="268605"/>
+            <wp:effectExtent l="0" t="0" r="2540" b="0"/>
+            <wp:docPr id="1770893674" name="Grafik 1"/>
+            <wp:cNvGraphicFramePr>
+              <a:graphicFrameLocks xmlns:a="http://schemas.openxmlformats.org/drawingml/2006/main" noChangeAspect="1"/>
+            </wp:cNvGraphicFramePr>
+            <a:graphic xmlns:a="http://schemas.openxmlformats.org/drawingml/2006/main">
+              <a:graphicData uri="http://schemas.openxmlformats.org/drawingml/2006/picture">
+                <pic:pic xmlns:pic="http://schemas.openxmlformats.org/drawingml/2006/picture">
+                  <pic:nvPicPr>
+                    <pic:cNvPr id="1770893674" name=""/>
+                    <pic:cNvPicPr/>
+                  </pic:nvPicPr>
+                  <pic:blipFill>
+                    <a:blip r:embed="rId70"/>
+                    <a:stretch>
+                      <a:fillRect/>
+                    </a:stretch>
+                  </pic:blipFill>
+                  <pic:spPr>
+                    <a:xfrm>
+                      <a:off x="0" y="0"/>
+                      <a:ext cx="6645910" cy="268605"/>
+                    </a:xfrm>
+                    <a:prstGeom prst="rect">
+                      <a:avLst/>
+                    </a:prstGeom>
+                  </pic:spPr>
+                </pic:pic>
+              </a:graphicData>
+            </a:graphic>
+          </wp:inline>
+        </w:drawing>
+      </w:r>
+    </w:p>
+    <w:p>
+      <w:pPr>
+        <w:pStyle w:val="Listenabsatz"/>
+        <w:numPr>
+          <w:ilvl w:val="0"/>
+          <w:numId w:val="34"/>
+        </w:numPr>
+        <w:spacing w:before="240"/>
+        <w:ind w:left="714" w:hanging="357"/>
+        <w:contextualSpacing w:val="0"/>
+      </w:pPr>
+      <w:r>
+        <w:rPr>
+          <w:b/>
+          <w:bCs/>
+        </w:rPr>
+        <w:t>Punkt 5</w:t>
+      </w:r>
+      <w:r>
+        <w:t xml:space="preserve"> der Konstruktionsanleitung ist: </w:t>
+      </w:r>
+      <w:r>
+        <w:rPr>
+          <w:b/>
+          <w:bCs/>
+        </w:rPr>
+        <w:t>Ergebnisse prüfen.</w:t>
+      </w:r>
+      <w:r>
+        <w:t xml:space="preserve"> </w:t>
+      </w:r>
+      <w:r>
+        <w:br/>
+      </w:r>
+      <w:r>
+        <w:t xml:space="preserve">Dazu legst du die Input-Liste </w:t>
+      </w:r>
+      <w:r>
+        <w:rPr>
+          <w:rFonts w:ascii="Courier New" w:hAnsi="Courier New" w:cs="Courier New"/>
+        </w:rPr>
+        <w:t>trainerstunden</w:t>
+      </w:r>
+      <w:r>
+        <w:rPr>
+          <w:rFonts w:ascii="Courier New" w:hAnsi="Courier New" w:cs="Courier New"/>
+        </w:rPr>
+        <w:t>_liste</w:t>
+      </w:r>
+      <w:r>
+        <w:t xml:space="preserve"> an und füllst sie mit Zahlen von 0 bis </w:t>
+      </w:r>
+      <w:r>
+        <w:t>12</w:t>
+      </w:r>
+      <w:r>
+        <w:t xml:space="preserve">. </w:t>
+      </w:r>
+      <w:r>
+        <w:br/>
+      </w:r>
+      <w:r>
+        <w:t xml:space="preserve">Für jedes Angebot </w:t>
+      </w:r>
+      <w:r>
+        <w:t>legst eine leere Output-Liste an</w:t>
+      </w:r>
+      <w:r>
+        <w:t xml:space="preserve">: </w:t>
+      </w:r>
+      <w:r>
+        <w:br/>
+      </w:r>
+      <w:r>
+        <w:rPr>
+          <w:rFonts w:ascii="Courier New" w:hAnsi="Courier New" w:cs="Courier New"/>
+        </w:rPr>
+        <w:t>tennis_pro_kosten_liste</w:t>
+      </w:r>
+      <w:r>
+        <w:t xml:space="preserve"> und </w:t>
+      </w:r>
+      <w:r>
+        <w:rPr>
+          <w:rFonts w:ascii="Courier New" w:hAnsi="Courier New" w:cs="Courier New"/>
+        </w:rPr>
+        <w:t>go_tennis_kosten_liste</w:t>
+      </w:r>
+    </w:p>
+    <w:p>
+      <w:r>
+        <w:drawing>
+          <wp:inline distT="0" distB="0" distL="0" distR="0" wp14:anchorId="02C3BB6F" wp14:editId="68A1C02C">
+            <wp:extent cx="6645910" cy="991870"/>
+            <wp:effectExtent l="0" t="0" r="2540" b="0"/>
+            <wp:docPr id="1702617558" name="Grafik 1"/>
+            <wp:cNvGraphicFramePr>
+              <a:graphicFrameLocks xmlns:a="http://schemas.openxmlformats.org/drawingml/2006/main" noChangeAspect="1"/>
+            </wp:cNvGraphicFramePr>
+            <a:graphic xmlns:a="http://schemas.openxmlformats.org/drawingml/2006/main">
+              <a:graphicData uri="http://schemas.openxmlformats.org/drawingml/2006/picture">
+                <pic:pic xmlns:pic="http://schemas.openxmlformats.org/drawingml/2006/picture">
+                  <pic:nvPicPr>
+                    <pic:cNvPr id="1702617558" name=""/>
+                    <pic:cNvPicPr/>
+                  </pic:nvPicPr>
+                  <pic:blipFill>
+                    <a:blip r:embed="rId71"/>
+                    <a:stretch>
+                      <a:fillRect/>
+                    </a:stretch>
+                  </pic:blipFill>
+                  <pic:spPr>
+                    <a:xfrm>
+                      <a:off x="0" y="0"/>
+                      <a:ext cx="6645910" cy="991870"/>
+                    </a:xfrm>
+                    <a:prstGeom prst="rect">
+                      <a:avLst/>
+                    </a:prstGeom>
+                  </pic:spPr>
+                </pic:pic>
+              </a:graphicData>
+            </a:graphic>
+          </wp:inline>
+        </w:drawing>
+      </w:r>
+    </w:p>
+    <w:p>
+      <w:pPr>
+        <w:spacing w:before="120"/>
+        <w:ind w:left="709"/>
+      </w:pPr>
+      <w:r>
+        <w:t xml:space="preserve">Danach rufst du beide Funktionen für jedes Element in </w:t>
+      </w:r>
+      <w:r>
+        <w:rPr>
+          <w:rFonts w:ascii="Courier New" w:hAnsi="Courier New" w:cs="Courier New"/>
+        </w:rPr>
+        <w:t>trainerstunden</w:t>
+      </w:r>
+      <w:r>
+        <w:rPr>
+          <w:rFonts w:ascii="Courier New" w:hAnsi="Courier New" w:cs="Courier New"/>
+        </w:rPr>
+        <w:t>_liste</w:t>
+      </w:r>
+      <w:r>
+        <w:t xml:space="preserve"> au</w:t>
+      </w:r>
+      <w:r>
+        <w:t xml:space="preserve">f. </w:t>
+      </w:r>
+      <w:r>
+        <w:br/>
+        <w:t xml:space="preserve">Den Output der Funktion </w:t>
+      </w:r>
+      <w:r>
+        <w:rPr>
+          <w:rFonts w:ascii="Courier New" w:hAnsi="Courier New" w:cs="Courier New"/>
+        </w:rPr>
+        <w:t>tennis_pro</w:t>
+      </w:r>
+      <w:r>
+        <w:t xml:space="preserve"> hängst du an die Output-Liste </w:t>
+      </w:r>
+      <w:r>
+        <w:rPr>
+          <w:rFonts w:ascii="Courier New" w:hAnsi="Courier New" w:cs="Courier New"/>
+        </w:rPr>
+        <w:t>tennis_pro_kosten_liste</w:t>
+      </w:r>
+      <w:r>
+        <w:t xml:space="preserve"> an.</w:t>
+      </w:r>
+      <w:r>
+        <w:br/>
+      </w:r>
+      <w:r>
+        <w:t xml:space="preserve">Den Output der Funktion </w:t>
+      </w:r>
+      <w:r>
+        <w:rPr>
+          <w:rFonts w:ascii="Courier New" w:hAnsi="Courier New" w:cs="Courier New"/>
+        </w:rPr>
+        <w:t>go_</w:t>
+      </w:r>
+      <w:r>
+        <w:rPr>
+          <w:rFonts w:ascii="Courier New" w:hAnsi="Courier New" w:cs="Courier New"/>
+        </w:rPr>
+        <w:t>tennis</w:t>
+      </w:r>
+      <w:r>
+        <w:t xml:space="preserve"> </w:t>
+      </w:r>
+      <w:r>
+        <w:t>h</w:t>
+      </w:r>
+      <w:r>
+        <w:t xml:space="preserve">ängst du an die Output-Liste </w:t>
+      </w:r>
+      <w:r>
+        <w:rPr>
+          <w:rFonts w:ascii="Courier New" w:hAnsi="Courier New" w:cs="Courier New"/>
+        </w:rPr>
+        <w:t>go_</w:t>
+      </w:r>
+      <w:r>
+        <w:rPr>
+          <w:rFonts w:ascii="Courier New" w:hAnsi="Courier New" w:cs="Courier New"/>
+        </w:rPr>
+        <w:t>tennis_kosten_liste</w:t>
+      </w:r>
+      <w:r>
+        <w:t xml:space="preserve"> an.</w:t>
+      </w:r>
+    </w:p>
+    <w:p>
+      <w:r>
+        <w:drawing>
+          <wp:inline distT="0" distB="0" distL="0" distR="0" wp14:anchorId="69C0E39A" wp14:editId="58D97F41">
+            <wp:extent cx="6645910" cy="562610"/>
+            <wp:effectExtent l="0" t="0" r="2540" b="8890"/>
+            <wp:docPr id="1729616655" name="Grafik 1"/>
+            <wp:cNvGraphicFramePr>
+              <a:graphicFrameLocks xmlns:a="http://schemas.openxmlformats.org/drawingml/2006/main" noChangeAspect="1"/>
+            </wp:cNvGraphicFramePr>
+            <a:graphic xmlns:a="http://schemas.openxmlformats.org/drawingml/2006/main">
+              <a:graphicData uri="http://schemas.openxmlformats.org/drawingml/2006/picture">
+                <pic:pic xmlns:pic="http://schemas.openxmlformats.org/drawingml/2006/picture">
+                  <pic:nvPicPr>
+                    <pic:cNvPr id="1729616655" name=""/>
+                    <pic:cNvPicPr/>
+                  </pic:nvPicPr>
+                  <pic:blipFill>
+                    <a:blip r:embed="rId72"/>
+                    <a:stretch>
+                      <a:fillRect/>
+                    </a:stretch>
+                  </pic:blipFill>
+                  <pic:spPr>
+                    <a:xfrm>
+                      <a:off x="0" y="0"/>
+                      <a:ext cx="6645910" cy="562610"/>
+                    </a:xfrm>
+                    <a:prstGeom prst="rect">
+                      <a:avLst/>
+                    </a:prstGeom>
+                  </pic:spPr>
+                </pic:pic>
+              </a:graphicData>
+            </a:graphic>
+          </wp:inline>
+        </w:drawing>
+      </w:r>
+    </w:p>
+    <w:p>
+      <w:pPr>
+        <w:spacing w:before="120"/>
+        <w:ind w:left="709"/>
+      </w:pPr>
+      <w:r>
+        <w:t xml:space="preserve">Dann musst du noch die Tabelle drucken. Zuerst druckst du die Überschrift. Danach bildest du mit </w:t>
+      </w:r>
+      <w:r>
+        <w:rPr>
+          <w:rFonts w:ascii="Courier New" w:hAnsi="Courier New" w:cs="Courier New"/>
+        </w:rPr>
+        <w:t>zip(trainerstunden_liste,tennis_pro_kosten_liste,go_tennis_kosten_liste)</w:t>
+      </w:r>
+      <w:r>
+        <w:rPr>
+          <w:rFonts w:ascii="Courier New" w:hAnsi="Courier New" w:cs="Courier New"/>
+        </w:rPr>
+        <w:t xml:space="preserve"> </w:t>
+      </w:r>
+      <w:r>
+        <w:t xml:space="preserve">ein Tupel mit einem Element aus jeder Liste und druckst es. </w:t>
+      </w:r>
+      <w:r>
+        <w:t xml:space="preserve">Mit </w:t>
+      </w:r>
+      <w:r>
+        <w:rPr>
+          <w:b/>
+          <w:bCs/>
+        </w:rPr>
+        <w:t>Format-Strings</w:t>
+      </w:r>
+      <w:r>
+        <w:t xml:space="preserve"> </w:t>
+      </w:r>
+      <w:r>
+        <w:t>wird es</w:t>
+      </w:r>
+      <w:r>
+        <w:t xml:space="preserve"> eine schöne Tabelle</w:t>
+      </w:r>
+      <w:r>
+        <w:t xml:space="preserve">. </w:t>
+      </w:r>
+    </w:p>
+    <w:p>
+      <w:r>
+        <w:drawing>
+          <wp:inline distT="0" distB="0" distL="0" distR="0" wp14:anchorId="5BCCC74F" wp14:editId="548628E0">
+            <wp:extent cx="6645910" cy="511175"/>
+            <wp:effectExtent l="0" t="0" r="2540" b="3175"/>
+            <wp:docPr id="1913563818" name="Grafik 1"/>
+            <wp:cNvGraphicFramePr>
+              <a:graphicFrameLocks xmlns:a="http://schemas.openxmlformats.org/drawingml/2006/main" noChangeAspect="1"/>
+            </wp:cNvGraphicFramePr>
+            <a:graphic xmlns:a="http://schemas.openxmlformats.org/drawingml/2006/main">
+              <a:graphicData uri="http://schemas.openxmlformats.org/drawingml/2006/picture">
+                <pic:pic xmlns:pic="http://schemas.openxmlformats.org/drawingml/2006/picture">
+                  <pic:nvPicPr>
+                    <pic:cNvPr id="1913563818" name=""/>
+                    <pic:cNvPicPr/>
+                  </pic:nvPicPr>
+                  <pic:blipFill>
+                    <a:blip r:embed="rId73"/>
+                    <a:stretch>
+                      <a:fillRect/>
+                    </a:stretch>
+                  </pic:blipFill>
+                  <pic:spPr>
+                    <a:xfrm>
+                      <a:off x="0" y="0"/>
+                      <a:ext cx="6645910" cy="511175"/>
+                    </a:xfrm>
+                    <a:prstGeom prst="rect">
+                      <a:avLst/>
+                    </a:prstGeom>
+                  </pic:spPr>
+                </pic:pic>
+              </a:graphicData>
+            </a:graphic>
+          </wp:inline>
+        </w:drawing>
+      </w:r>
+    </w:p>
+    <w:p>
+      <w:pPr>
+        <w:pStyle w:val="Listenabsatz"/>
+        <w:numPr>
+          <w:ilvl w:val="0"/>
+          <w:numId w:val="34"/>
+        </w:numPr>
+        <w:spacing w:before="240"/>
+        <w:ind w:left="714" w:hanging="357"/>
+        <w:contextualSpacing w:val="0"/>
+      </w:pPr>
+      <w:r>
+        <w:t xml:space="preserve">Speichere den Inhalt mit dem Menüpunkt </w:t>
+      </w:r>
+      <w:r>
+        <w:rPr>
+          <w:b/>
+          <w:bCs/>
+        </w:rPr>
+        <w:t>File/ Save</w:t>
+      </w:r>
+      <w:r>
+        <w:t xml:space="preserve"> unter dem Dateinamen "</w:t>
+      </w:r>
+      <w:r>
+        <w:t>tennisunterricht_kosten</w:t>
+      </w:r>
+      <w:r>
+        <w:t>" im Ordner Python/</w:t>
+      </w:r>
+      <w:r>
+        <w:t xml:space="preserve"> </w:t>
+      </w:r>
+      <w:r>
+        <w:t>10_Funktionen_konstruieren</w:t>
+      </w:r>
+    </w:p>
+    <w:p>
+      <w:pPr>
+        <w:pStyle w:val="Listenabsatz"/>
+        <w:numPr>
+          <w:ilvl w:val="0"/>
+          <w:numId w:val="34"/>
+        </w:numPr>
+        <w:spacing w:before="240"/>
+        <w:ind w:left="714" w:hanging="357"/>
+        <w:contextualSpacing w:val="0"/>
+      </w:pPr>
+      <w:r>
+        <w:rPr>
+          <w:b/>
+          <w:bCs/>
+        </w:rPr>
+        <w:t>Starte</w:t>
+      </w:r>
+      <w:r>
+        <w:t xml:space="preserve"> das Programm mit dem Menüpunkt </w:t>
+      </w:r>
+      <w:r>
+        <w:rPr>
+          <w:b/>
+          <w:bCs/>
+        </w:rPr>
+        <w:t>Run/ Run Module</w:t>
+      </w:r>
+      <w:r>
+        <w:t xml:space="preserve">. </w:t>
+      </w:r>
+      <w:r>
+        <w:br/>
+        <w:t>Betrachte die print-Ausgaben.</w:t>
+      </w:r>
+    </w:p>
+    <w:p>
+      <w:pPr>
+        <w:pStyle w:val="Listenabsatz"/>
+        <w:numPr>
+          <w:ilvl w:val="0"/>
+          <w:numId w:val="34"/>
+        </w:numPr>
+        <w:spacing w:before="240"/>
+        <w:ind w:left="714" w:hanging="357"/>
+        <w:contextualSpacing w:val="0"/>
+      </w:pPr>
+      <w:r>
+        <w:rPr>
+          <w:b/>
+          <w:bCs/>
+        </w:rPr>
+        <w:t>Punkt 6</w:t>
+      </w:r>
+      <w:r>
+        <w:t xml:space="preserve"> der Konstruktionsanleitung ist: </w:t>
+      </w:r>
+      <w:r>
+        <w:rPr>
+          <w:b/>
+          <w:bCs/>
+        </w:rPr>
+        <w:t>Unittest</w:t>
+      </w:r>
+      <w:r>
+        <w:rPr>
+          <w:b/>
+          <w:bCs/>
+        </w:rPr>
+        <w:t xml:space="preserve">. </w:t>
+      </w:r>
+      <w:r>
+        <w:t>Damit würden wir die Funktion mit Input-Daten und erwarteten Output-Daten testen. Diese</w:t>
+      </w:r>
+      <w:r>
+        <w:t>n Punkt</w:t>
+      </w:r>
+      <w:r>
+        <w:t xml:space="preserve"> </w:t>
+      </w:r>
+      <w:r>
+        <w:t>lasse</w:t>
+      </w:r>
+      <w:r>
+        <w:t xml:space="preserve">n </w:t>
+      </w:r>
+      <w:r>
+        <w:t>wir</w:t>
+      </w:r>
+      <w:r>
+        <w:t xml:space="preserve"> hier</w:t>
+      </w:r>
+      <w:r>
+        <w:t xml:space="preserve"> weg. </w:t>
+      </w:r>
+      <w:r>
+        <w:t xml:space="preserve"> </w:t>
+      </w:r>
+    </w:p>
+    <w:p>
+      <w:pPr>
+        <w:pStyle w:val="Listenabsatz"/>
+        <w:numPr>
+          <w:ilvl w:val="0"/>
+          <w:numId w:val="34"/>
         </w:numPr>
         <w:spacing w:before="120"/>
         <w:ind w:left="714" w:hanging="357"/>
         <w:contextualSpacing w:val="0"/>
       </w:pPr>
       <w:r>
-        <w:t>Die erste Zeile im Editor-Fenster beschreibt, was das Programm tut:</w:t>
-      </w:r>
-    </w:p>
-    <w:p>
-      <w:pPr>
-        <w:spacing w:after="120"/>
-      </w:pPr>
-    </w:p>
-    <w:p>
-      <w:pPr>
-        <w:spacing w:after="120"/>
-      </w:pPr>
-    </w:p>
+        <w:lastRenderedPageBreak/>
+        <w:t xml:space="preserve">Die Kosten sollen in einem Diagramm gezeigt werden. </w:t>
+      </w:r>
+      <w:r>
+        <w:t>Du benötigst dazu die Bibliothek</w:t>
+      </w:r>
+      <w:r>
+        <w:t xml:space="preserve"> </w:t>
+      </w:r>
+      <w:r>
+        <w:rPr>
+          <w:rFonts w:ascii="Courier New" w:hAnsi="Courier New" w:cs="Courier New"/>
+        </w:rPr>
+        <w:t>matplotlib.pyplot</w:t>
+      </w:r>
+      <w:r>
+        <w:rPr>
+          <w:rFonts w:cstheme="minorHAnsi"/>
+        </w:rPr>
+        <w:t xml:space="preserve">. Der Name wird mit </w:t>
+      </w:r>
+      <w:r>
+        <w:rPr>
+          <w:rFonts w:ascii="Courier New" w:hAnsi="Courier New" w:cs="Courier New"/>
+        </w:rPr>
+        <w:t>plt</w:t>
+      </w:r>
+      <w:r>
+        <w:rPr>
+          <w:rFonts w:cstheme="minorHAnsi"/>
+        </w:rPr>
+        <w:t xml:space="preserve"> abgekürzt.</w:t>
+      </w:r>
+    </w:p>
+    <w:p>
+      <w:r>
+        <w:drawing>
+          <wp:inline distT="0" distB="0" distL="0" distR="0" wp14:anchorId="65BD41CD" wp14:editId="2536EE67">
+            <wp:extent cx="6645910" cy="248285"/>
+            <wp:effectExtent l="0" t="0" r="2540" b="0"/>
+            <wp:docPr id="1391022176" name="Grafik 1"/>
+            <wp:cNvGraphicFramePr>
+              <a:graphicFrameLocks xmlns:a="http://schemas.openxmlformats.org/drawingml/2006/main" noChangeAspect="1"/>
+            </wp:cNvGraphicFramePr>
+            <a:graphic xmlns:a="http://schemas.openxmlformats.org/drawingml/2006/main">
+              <a:graphicData uri="http://schemas.openxmlformats.org/drawingml/2006/picture">
+                <pic:pic xmlns:pic="http://schemas.openxmlformats.org/drawingml/2006/picture">
+                  <pic:nvPicPr>
+                    <pic:cNvPr id="1391022176" name=""/>
+                    <pic:cNvPicPr/>
+                  </pic:nvPicPr>
+                  <pic:blipFill>
+                    <a:blip r:embed="rId74"/>
+                    <a:stretch>
+                      <a:fillRect/>
+                    </a:stretch>
+                  </pic:blipFill>
+                  <pic:spPr>
+                    <a:xfrm>
+                      <a:off x="0" y="0"/>
+                      <a:ext cx="6645910" cy="248285"/>
+                    </a:xfrm>
+                    <a:prstGeom prst="rect">
+                      <a:avLst/>
+                    </a:prstGeom>
+                  </pic:spPr>
+                </pic:pic>
+              </a:graphicData>
+            </a:graphic>
+          </wp:inline>
+        </w:drawing>
+      </w:r>
+    </w:p>
+    <w:p>
+      <w:pPr>
+        <w:spacing w:before="120"/>
+        <w:ind w:firstLine="709"/>
+      </w:pPr>
+      <w:r>
+        <w:t xml:space="preserve">Da die Ergebnisse in </w:t>
+      </w:r>
+      <w:r>
+        <w:rPr>
+          <w:b/>
+          <w:bCs/>
+        </w:rPr>
+        <w:t>Listen</w:t>
+      </w:r>
+      <w:r>
+        <w:t xml:space="preserve"> vorliegen, kannst du sie m</w:t>
+      </w:r>
+      <w:r>
+        <w:t>it</w:t>
+      </w:r>
+      <w:r>
+        <w:t xml:space="preserve"> wenigen Befehlen</w:t>
+      </w:r>
+      <w:r>
+        <w:t xml:space="preserve"> plotten</w:t>
+      </w:r>
+      <w:r>
+        <w:t xml:space="preserve">: </w:t>
+      </w:r>
+    </w:p>
+    <w:p>
+      <w:r>
+        <w:drawing>
+          <wp:inline distT="0" distB="0" distL="0" distR="0" wp14:anchorId="03532A03" wp14:editId="1658BAF9">
+            <wp:extent cx="6645910" cy="784225"/>
+            <wp:effectExtent l="0" t="0" r="2540" b="0"/>
+            <wp:docPr id="1931480167" name="Grafik 1"/>
+            <wp:cNvGraphicFramePr>
+              <a:graphicFrameLocks xmlns:a="http://schemas.openxmlformats.org/drawingml/2006/main" noChangeAspect="1"/>
+            </wp:cNvGraphicFramePr>
+            <a:graphic xmlns:a="http://schemas.openxmlformats.org/drawingml/2006/main">
+              <a:graphicData uri="http://schemas.openxmlformats.org/drawingml/2006/picture">
+                <pic:pic xmlns:pic="http://schemas.openxmlformats.org/drawingml/2006/picture">
+                  <pic:nvPicPr>
+                    <pic:cNvPr id="1931480167" name=""/>
+                    <pic:cNvPicPr/>
+                  </pic:nvPicPr>
+                  <pic:blipFill>
+                    <a:blip r:embed="rId75"/>
+                    <a:stretch>
+                      <a:fillRect/>
+                    </a:stretch>
+                  </pic:blipFill>
+                  <pic:spPr>
+                    <a:xfrm>
+                      <a:off x="0" y="0"/>
+                      <a:ext cx="6645910" cy="784225"/>
+                    </a:xfrm>
+                    <a:prstGeom prst="rect">
+                      <a:avLst/>
+                    </a:prstGeom>
+                  </pic:spPr>
+                </pic:pic>
+              </a:graphicData>
+            </a:graphic>
+          </wp:inline>
+        </w:drawing>
+      </w:r>
+    </w:p>
+    <w:p>
+      <w:pPr>
+        <w:pStyle w:val="Listenabsatz"/>
+        <w:numPr>
+          <w:ilvl w:val="0"/>
+          <w:numId w:val="34"/>
+        </w:numPr>
+        <w:spacing w:before="120"/>
+        <w:ind w:left="714" w:hanging="357"/>
+        <w:contextualSpacing w:val="0"/>
+      </w:pPr>
+      <w:r>
+        <w:rPr>
+          <w:b/>
+          <w:bCs/>
+        </w:rPr>
+        <w:t>Starte</w:t>
+      </w:r>
+      <w:r>
+        <w:t xml:space="preserve"> das Programm mit dem Menüpunkt </w:t>
+      </w:r>
+      <w:r>
+        <w:rPr>
+          <w:b/>
+          <w:bCs/>
+        </w:rPr>
+        <w:t>Run/ Run Module</w:t>
+      </w:r>
+      <w:r>
+        <w:t xml:space="preserve">. </w:t>
+      </w:r>
+      <w:r>
+        <w:br/>
+        <w:t>Betrachte die print-Ausgaben</w:t>
+      </w:r>
+      <w:r>
+        <w:t xml:space="preserve"> und die Grafik-Ausgabe. </w:t>
+      </w:r>
+    </w:p>
+    <w:p/>
+    <w:p/>
     <w:p>
       <w:pPr>
         <w:sectPr>
-          <w:headerReference w:type="default" r:id="rId62"/>
+          <w:headerReference w:type="default" r:id="rId76"/>
           <w:pgSz w:w="11906" w:h="16838"/>
           <w:pgMar w:top="720" w:right="720" w:bottom="720" w:left="720" w:header="708" w:footer="708" w:gutter="0"/>
           <w:cols w:space="708"/>
@@ -24063,7 +25557,7 @@
       <w:pPr>
         <w:pStyle w:val="berschrift1"/>
       </w:pPr>
-      <w:bookmarkStart w:id="132" w:name="_Toc236167787"/>
+      <w:bookmarkStart w:id="132" w:name="_Toc236246111"/>
       <w:r>
         <w:lastRenderedPageBreak/>
         <w:t>Klassen haben Eigenschaften und Methoden</w:t>
@@ -25096,7 +26590,7 @@
     <w:p>
       <w:pPr>
         <w:sectPr>
-          <w:headerReference w:type="default" r:id="rId63"/>
+          <w:headerReference w:type="default" r:id="rId77"/>
           <w:pgSz w:w="11906" w:h="16838"/>
           <w:pgMar w:top="720" w:right="720" w:bottom="720" w:left="720" w:header="708" w:footer="708" w:gutter="0"/>
           <w:cols w:space="708"/>
@@ -25108,7 +26602,7 @@
       <w:pPr>
         <w:pStyle w:val="berschrift1"/>
       </w:pPr>
-      <w:bookmarkStart w:id="133" w:name="_Toc236167788"/>
+      <w:bookmarkStart w:id="133" w:name="_Toc236246112"/>
       <w:r>
         <w:lastRenderedPageBreak/>
         <w:t>Die Eltern-Klasse vererbt – die Kind-Klasse erbt</w:t>
@@ -26691,7 +28185,7 @@
           <w:tab w:val="left" w:pos="4405"/>
         </w:tabs>
         <w:sectPr>
-          <w:headerReference w:type="default" r:id="rId64"/>
+          <w:headerReference w:type="default" r:id="rId78"/>
           <w:pgSz w:w="11906" w:h="16838"/>
           <w:pgMar w:top="720" w:right="720" w:bottom="720" w:left="720" w:header="708" w:footer="708" w:gutter="0"/>
           <w:cols w:space="708"/>
@@ -26706,7 +28200,7 @@
       <w:pPr>
         <w:pStyle w:val="berschrift1"/>
       </w:pPr>
-      <w:bookmarkStart w:id="134" w:name="_Toc236167789"/>
+      <w:bookmarkStart w:id="134" w:name="_Toc236246113"/>
       <w:r>
         <w:lastRenderedPageBreak/>
         <w:t>Roboter im Irrgarten: Wände bauen</w:t>
@@ -26850,7 +28344,7 @@
                     <pic:cNvPicPr/>
                   </pic:nvPicPr>
                   <pic:blipFill>
-                    <a:blip r:embed="rId65"/>
+                    <a:blip r:embed="rId79"/>
                     <a:stretch>
                       <a:fillRect/>
                     </a:stretch>
@@ -26892,7 +28386,7 @@
                     <pic:cNvPicPr/>
                   </pic:nvPicPr>
                   <pic:blipFill>
-                    <a:blip r:embed="rId66"/>
+                    <a:blip r:embed="rId80"/>
                     <a:stretch>
                       <a:fillRect/>
                     </a:stretch>
@@ -26918,7 +28412,7 @@
         <w:pStyle w:val="berschrift1"/>
         <w:spacing w:before="0" w:after="0"/>
       </w:pPr>
-      <w:bookmarkStart w:id="135" w:name="_Toc236167790"/>
+      <w:bookmarkStart w:id="135" w:name="_Toc236246114"/>
       <w:r>
         <w:lastRenderedPageBreak/>
         <w:t xml:space="preserve">Roboter </w:t>
@@ -27118,7 +28612,7 @@
                     <pic:cNvPicPr/>
                   </pic:nvPicPr>
                   <pic:blipFill>
-                    <a:blip r:embed="rId67"/>
+                    <a:blip r:embed="rId81"/>
                     <a:stretch>
                       <a:fillRect/>
                     </a:stretch>
@@ -27161,7 +28655,7 @@
                     <pic:cNvPicPr/>
                   </pic:nvPicPr>
                   <pic:blipFill>
-                    <a:blip r:embed="rId68"/>
+                    <a:blip r:embed="rId82"/>
                     <a:stretch>
                       <a:fillRect/>
                     </a:stretch>
@@ -27204,7 +28698,7 @@
                     <pic:cNvPicPr/>
                   </pic:nvPicPr>
                   <pic:blipFill>
-                    <a:blip r:embed="rId69"/>
+                    <a:blip r:embed="rId83"/>
                     <a:stretch>
                       <a:fillRect/>
                     </a:stretch>
@@ -27235,7 +28729,7 @@
       <w:pPr>
         <w:pStyle w:val="berschrift1"/>
       </w:pPr>
-      <w:bookmarkStart w:id="136" w:name="_Toc236167791"/>
+      <w:bookmarkStart w:id="136" w:name="_Toc236246115"/>
       <w:r>
         <w:lastRenderedPageBreak/>
         <w:t xml:space="preserve">Roboter </w:t>
@@ -27658,7 +29152,7 @@
                     <pic:cNvPicPr/>
                   </pic:nvPicPr>
                   <pic:blipFill>
-                    <a:blip r:embed="rId70"/>
+                    <a:blip r:embed="rId84"/>
                     <a:stretch>
                       <a:fillRect/>
                     </a:stretch>
@@ -27703,7 +29197,7 @@
                     <pic:cNvPicPr/>
                   </pic:nvPicPr>
                   <pic:blipFill>
-                    <a:blip r:embed="rId71"/>
+                    <a:blip r:embed="rId85"/>
                     <a:stretch>
                       <a:fillRect/>
                     </a:stretch>
@@ -27734,7 +29228,7 @@
       <w:pPr>
         <w:pStyle w:val="berschrift1"/>
       </w:pPr>
-      <w:bookmarkStart w:id="137" w:name="_Toc236167792"/>
+      <w:bookmarkStart w:id="137" w:name="_Toc236246116"/>
       <w:r>
         <w:lastRenderedPageBreak/>
         <w:t xml:space="preserve">Roboter </w:t>
@@ -27948,7 +29442,7 @@
                     <pic:cNvPicPr/>
                   </pic:nvPicPr>
                   <pic:blipFill>
-                    <a:blip r:embed="rId72"/>
+                    <a:blip r:embed="rId86"/>
                     <a:stretch>
                       <a:fillRect/>
                     </a:stretch>
@@ -27990,7 +29484,7 @@
                     <pic:cNvPicPr/>
                   </pic:nvPicPr>
                   <pic:blipFill>
-                    <a:blip r:embed="rId73"/>
+                    <a:blip r:embed="rId87"/>
                     <a:stretch>
                       <a:fillRect/>
                     </a:stretch>
@@ -28018,7 +29512,7 @@
       <w:pPr>
         <w:pStyle w:val="berschrift1"/>
       </w:pPr>
-      <w:bookmarkStart w:id="138" w:name="_Toc236167793"/>
+      <w:bookmarkStart w:id="138" w:name="_Toc236246117"/>
       <w:r>
         <w:lastRenderedPageBreak/>
         <w:t xml:space="preserve">Roboter </w:t>
@@ -28626,7 +30120,7 @@
                     <pic:cNvPicPr/>
                   </pic:nvPicPr>
                   <pic:blipFill>
-                    <a:blip r:embed="rId74"/>
+                    <a:blip r:embed="rId88"/>
                     <a:stretch>
                       <a:fillRect/>
                     </a:stretch>
@@ -28672,7 +30166,7 @@
                     <pic:cNvPicPr/>
                   </pic:nvPicPr>
                   <pic:blipFill>
-                    <a:blip r:embed="rId75"/>
+                    <a:blip r:embed="rId89"/>
                     <a:stretch>
                       <a:fillRect/>
                     </a:stretch>
@@ -28720,7 +30214,7 @@
                     <pic:cNvPicPr/>
                   </pic:nvPicPr>
                   <pic:blipFill>
-                    <a:blip r:embed="rId76"/>
+                    <a:blip r:embed="rId90"/>
                     <a:stretch>
                       <a:fillRect/>
                     </a:stretch>
@@ -28753,7 +30247,7 @@
       <w:pPr>
         <w:pStyle w:val="berschrift1"/>
       </w:pPr>
-      <w:bookmarkStart w:id="139" w:name="_Toc236167794"/>
+      <w:bookmarkStart w:id="139" w:name="_Toc236246118"/>
       <w:r>
         <w:lastRenderedPageBreak/>
         <w:t xml:space="preserve">Roboter </w:t>
@@ -28836,7 +30330,7 @@
                     <pic:cNvPicPr/>
                   </pic:nvPicPr>
                   <pic:blipFill>
-                    <a:blip r:embed="rId77">
+                    <a:blip r:embed="rId91">
                       <a:extLst>
                         <a:ext uri="{28A0092B-C50C-407E-A947-70E740481C1C}">
                           <a14:useLocalDpi xmlns:a14="http://schemas.microsoft.com/office/drawing/2010/main" val="0"/>
@@ -29011,7 +30505,7 @@
                     <pic:cNvPicPr/>
                   </pic:nvPicPr>
                   <pic:blipFill>
-                    <a:blip r:embed="rId78"/>
+                    <a:blip r:embed="rId92"/>
                     <a:stretch>
                       <a:fillRect/>
                     </a:stretch>
@@ -29036,7 +30530,7 @@
       <w:pPr>
         <w:pStyle w:val="berschrift1"/>
       </w:pPr>
-      <w:bookmarkStart w:id="140" w:name="_Toc236167795"/>
+      <w:bookmarkStart w:id="140" w:name="_Toc236246119"/>
       <w:r>
         <w:lastRenderedPageBreak/>
         <w:t xml:space="preserve">Roboter </w:t>
@@ -29245,7 +30739,7 @@
                     <pic:cNvPicPr/>
                   </pic:nvPicPr>
                   <pic:blipFill>
-                    <a:blip r:embed="rId79"/>
+                    <a:blip r:embed="rId93"/>
                     <a:stretch>
                       <a:fillRect/>
                     </a:stretch>
@@ -29291,7 +30785,7 @@
                     <pic:cNvPicPr/>
                   </pic:nvPicPr>
                   <pic:blipFill>
-                    <a:blip r:embed="rId80"/>
+                    <a:blip r:embed="rId94"/>
                     <a:stretch>
                       <a:fillRect/>
                     </a:stretch>
@@ -29319,7 +30813,7 @@
           <w:tab w:val="left" w:pos="795"/>
         </w:tabs>
         <w:sectPr>
-          <w:headerReference w:type="default" r:id="rId81"/>
+          <w:headerReference w:type="default" r:id="rId95"/>
           <w:pgSz w:w="11906" w:h="16838"/>
           <w:pgMar w:top="720" w:right="720" w:bottom="720" w:left="720" w:header="708" w:footer="708" w:gutter="0"/>
           <w:cols w:space="708"/>
@@ -29331,7 +30825,7 @@
       <w:pPr>
         <w:pStyle w:val="berschrift1"/>
       </w:pPr>
-      <w:bookmarkStart w:id="141" w:name="_Toc236167796"/>
+      <w:bookmarkStart w:id="141" w:name="_Toc236246120"/>
       <w:r>
         <w:lastRenderedPageBreak/>
         <w:t>Auto im Gegenverkehr</w:t>
@@ -29520,7 +31014,7 @@
                     <pic:cNvPicPr/>
                   </pic:nvPicPr>
                   <pic:blipFill>
-                    <a:blip r:embed="rId82"/>
+                    <a:blip r:embed="rId96"/>
                     <a:stretch>
                       <a:fillRect/>
                     </a:stretch>
@@ -29563,7 +31057,7 @@
                     <pic:cNvPicPr/>
                   </pic:nvPicPr>
                   <pic:blipFill>
-                    <a:blip r:embed="rId83"/>
+                    <a:blip r:embed="rId97"/>
                     <a:stretch>
                       <a:fillRect/>
                     </a:stretch>
@@ -29593,7 +31087,7 @@
       <w:pPr>
         <w:pStyle w:val="berschrift1"/>
       </w:pPr>
-      <w:bookmarkStart w:id="142" w:name="_Toc236167797"/>
+      <w:bookmarkStart w:id="142" w:name="_Toc236246121"/>
       <w:r>
         <w:lastRenderedPageBreak/>
         <w:t xml:space="preserve">Auto im Gegenverkehr: </w:t>
@@ -29800,7 +31294,7 @@
                     <pic:cNvPicPr/>
                   </pic:nvPicPr>
                   <pic:blipFill>
-                    <a:blip r:embed="rId84"/>
+                    <a:blip r:embed="rId98"/>
                     <a:stretch>
                       <a:fillRect/>
                     </a:stretch>
@@ -29830,7 +31324,7 @@
       <w:pPr>
         <w:pStyle w:val="berschrift1"/>
       </w:pPr>
-      <w:bookmarkStart w:id="143" w:name="_Toc236167798"/>
+      <w:bookmarkStart w:id="143" w:name="_Toc236246122"/>
       <w:r>
         <w:lastRenderedPageBreak/>
         <w:t xml:space="preserve">Auto im Gegenverkehr: </w:t>
@@ -30018,7 +31512,7 @@
                     <pic:cNvPicPr/>
                   </pic:nvPicPr>
                   <pic:blipFill>
-                    <a:blip r:embed="rId85"/>
+                    <a:blip r:embed="rId99"/>
                     <a:stretch>
                       <a:fillRect/>
                     </a:stretch>
@@ -30069,7 +31563,7 @@
                     <pic:cNvPicPr/>
                   </pic:nvPicPr>
                   <pic:blipFill>
-                    <a:blip r:embed="rId86"/>
+                    <a:blip r:embed="rId100"/>
                     <a:stretch>
                       <a:fillRect/>
                     </a:stretch>
@@ -30112,7 +31606,7 @@
                     <pic:cNvPicPr/>
                   </pic:nvPicPr>
                   <pic:blipFill>
-                    <a:blip r:embed="rId87"/>
+                    <a:blip r:embed="rId101"/>
                     <a:stretch>
                       <a:fillRect/>
                     </a:stretch>
@@ -30143,7 +31637,7 @@
       <w:pPr>
         <w:pStyle w:val="berschrift1"/>
       </w:pPr>
-      <w:bookmarkStart w:id="144" w:name="_Toc236167799"/>
+      <w:bookmarkStart w:id="144" w:name="_Toc236246123"/>
       <w:r>
         <w:lastRenderedPageBreak/>
         <w:t xml:space="preserve">Auto im Gegenverkehr: </w:t>
@@ -30333,7 +31827,7 @@
                     <pic:cNvPicPr/>
                   </pic:nvPicPr>
                   <pic:blipFill>
-                    <a:blip r:embed="rId88"/>
+                    <a:blip r:embed="rId102"/>
                     <a:stretch>
                       <a:fillRect/>
                     </a:stretch>
@@ -30376,7 +31870,7 @@
                     <pic:cNvPicPr/>
                   </pic:nvPicPr>
                   <pic:blipFill>
-                    <a:blip r:embed="rId89"/>
+                    <a:blip r:embed="rId103"/>
                     <a:stretch>
                       <a:fillRect/>
                     </a:stretch>
@@ -30419,7 +31913,7 @@
                     <pic:cNvPicPr/>
                   </pic:nvPicPr>
                   <pic:blipFill>
-                    <a:blip r:embed="rId90"/>
+                    <a:blip r:embed="rId104"/>
                     <a:stretch>
                       <a:fillRect/>
                     </a:stretch>
@@ -30444,7 +31938,7 @@
       <w:pPr>
         <w:pStyle w:val="berschrift1"/>
       </w:pPr>
-      <w:bookmarkStart w:id="145" w:name="_Toc236167800"/>
+      <w:bookmarkStart w:id="145" w:name="_Toc236246124"/>
       <w:r>
         <w:lastRenderedPageBreak/>
         <w:t xml:space="preserve">Auto im Gegenverkehr: </w:t>
@@ -30599,7 +32093,7 @@
                     <pic:cNvPicPr/>
                   </pic:nvPicPr>
                   <pic:blipFill>
-                    <a:blip r:embed="rId91"/>
+                    <a:blip r:embed="rId105"/>
                     <a:stretch>
                       <a:fillRect/>
                     </a:stretch>
@@ -30642,7 +32136,7 @@
                     <pic:cNvPicPr/>
                   </pic:nvPicPr>
                   <pic:blipFill>
-                    <a:blip r:embed="rId92"/>
+                    <a:blip r:embed="rId106"/>
                     <a:stretch>
                       <a:fillRect/>
                     </a:stretch>
@@ -30685,7 +32179,7 @@
                     <pic:cNvPicPr/>
                   </pic:nvPicPr>
                   <pic:blipFill>
-                    <a:blip r:embed="rId93"/>
+                    <a:blip r:embed="rId107"/>
                     <a:stretch>
                       <a:fillRect/>
                     </a:stretch>
@@ -30718,7 +32212,7 @@
       <w:pPr>
         <w:pStyle w:val="berschrift1"/>
       </w:pPr>
-      <w:bookmarkStart w:id="146" w:name="_Toc236167801"/>
+      <w:bookmarkStart w:id="146" w:name="_Toc236246125"/>
       <w:r>
         <w:lastRenderedPageBreak/>
         <w:t>Ein Dinosaurier überquert die Straße</w:t>
@@ -31671,7 +33165,7 @@
                           <pic:cNvPicPr/>
                         </pic:nvPicPr>
                         <pic:blipFill>
-                          <a:blip r:embed="rId94"/>
+                          <a:blip r:embed="rId108"/>
                           <a:stretch>
                             <a:fillRect/>
                           </a:stretch>
@@ -31805,7 +33299,7 @@
           <w:lang w:val="en-US"/>
         </w:rPr>
         <w:sectPr>
-          <w:headerReference w:type="default" r:id="rId95"/>
+          <w:headerReference w:type="default" r:id="rId109"/>
           <w:pgSz w:w="11906" w:h="16838"/>
           <w:pgMar w:top="720" w:right="720" w:bottom="720" w:left="720" w:header="708" w:footer="708" w:gutter="0"/>
           <w:cols w:space="708"/>
@@ -31817,7 +33311,7 @@
       <w:pPr>
         <w:pStyle w:val="berschrift1"/>
       </w:pPr>
-      <w:bookmarkStart w:id="147" w:name="_Toc236167802"/>
+      <w:bookmarkStart w:id="147" w:name="_Toc236246126"/>
       <w:r>
         <w:lastRenderedPageBreak/>
         <w:t xml:space="preserve">MicroPython und </w:t>
@@ -31836,7 +33330,7 @@
       <w:pPr>
         <w:pStyle w:val="berschrift1"/>
       </w:pPr>
-      <w:bookmarkStart w:id="148" w:name="_Toc236167803"/>
+      <w:bookmarkStart w:id="148" w:name="_Toc236246127"/>
       <w:r>
         <w:lastRenderedPageBreak/>
         <w:t>Displays, Töne, Aktoren</w:t>
@@ -31852,7 +33346,7 @@
       <w:pPr>
         <w:pStyle w:val="berschrift1"/>
       </w:pPr>
-      <w:bookmarkStart w:id="149" w:name="_Toc236167804"/>
+      <w:bookmarkStart w:id="149" w:name="_Toc236246128"/>
       <w:r>
         <w:lastRenderedPageBreak/>
         <w:t>Sensoren</w:t>
@@ -31868,7 +33362,7 @@
       <w:pPr>
         <w:pStyle w:val="berschrift1"/>
       </w:pPr>
-      <w:bookmarkStart w:id="150" w:name="_Toc236167805"/>
+      <w:bookmarkStart w:id="150" w:name="_Toc236246129"/>
       <w:r>
         <w:lastRenderedPageBreak/>
         <w:t>Einparkhilfe</w:t>
@@ -31907,7 +33401,7 @@
     <w:p>
       <w:pPr>
         <w:sectPr>
-          <w:headerReference w:type="default" r:id="rId96"/>
+          <w:headerReference w:type="default" r:id="rId110"/>
           <w:pgSz w:w="11906" w:h="16838"/>
           <w:pgMar w:top="720" w:right="720" w:bottom="720" w:left="720" w:header="708" w:footer="708" w:gutter="0"/>
           <w:cols w:space="708"/>
@@ -31919,7 +33413,7 @@
       <w:pPr>
         <w:pStyle w:val="berschrift1"/>
       </w:pPr>
-      <w:bookmarkStart w:id="151" w:name="_Toc236167806"/>
+      <w:bookmarkStart w:id="151" w:name="_Toc236246130"/>
       <w:r>
         <w:lastRenderedPageBreak/>
         <w:t>Quellen</w:t>
@@ -31985,7 +33479,7 @@
             <w:tcW w:w="5240" w:type="dxa"/>
           </w:tcPr>
           <w:p>
-            <w:hyperlink r:id="rId97" w:history="1">
+            <w:hyperlink r:id="rId111" w:history="1">
               <w:r>
                 <w:rPr>
                   <w:rStyle w:val="Hyperlink"/>
@@ -32012,7 +33506,7 @@
             <w:tcW w:w="5240" w:type="dxa"/>
           </w:tcPr>
           <w:p>
-            <w:hyperlink r:id="rId98" w:history="1">
+            <w:hyperlink r:id="rId112" w:history="1">
               <w:r>
                 <w:rPr>
                   <w:rStyle w:val="Hyperlink"/>
@@ -32093,7 +33587,7 @@
             <w:tcW w:w="5240" w:type="dxa"/>
           </w:tcPr>
           <w:p>
-            <w:hyperlink r:id="rId99" w:history="1">
+            <w:hyperlink r:id="rId113" w:history="1">
               <w:r>
                 <w:rPr>
                   <w:rStyle w:val="Hyperlink"/>
@@ -32123,7 +33617,7 @@
             <w:tcW w:w="5240" w:type="dxa"/>
           </w:tcPr>
           <w:p>
-            <w:hyperlink r:id="rId100" w:history="1">
+            <w:hyperlink r:id="rId114" w:history="1">
               <w:r>
                 <w:rPr>
                   <w:rStyle w:val="Hyperlink"/>
@@ -32150,7 +33644,7 @@
             <w:tcW w:w="5240" w:type="dxa"/>
           </w:tcPr>
           <w:p>
-            <w:hyperlink r:id="rId101" w:history="1">
+            <w:hyperlink r:id="rId115" w:history="1">
               <w:r>
                 <w:rPr>
                   <w:rStyle w:val="Hyperlink"/>
@@ -32177,7 +33671,7 @@
             <w:tcW w:w="5240" w:type="dxa"/>
           </w:tcPr>
           <w:p>
-            <w:hyperlink r:id="rId102" w:history="1">
+            <w:hyperlink r:id="rId116" w:history="1">
               <w:r>
                 <w:rPr>
                   <w:rStyle w:val="Hyperlink"/>
@@ -32204,7 +33698,7 @@
             <w:tcW w:w="5240" w:type="dxa"/>
           </w:tcPr>
           <w:p>
-            <w:hyperlink r:id="rId103" w:history="1">
+            <w:hyperlink r:id="rId117" w:history="1">
               <w:r>
                 <w:rPr>
                   <w:rStyle w:val="Hyperlink"/>
@@ -32231,7 +33725,7 @@
             <w:tcW w:w="5240" w:type="dxa"/>
           </w:tcPr>
           <w:p>
-            <w:hyperlink r:id="rId104" w:history="1">
+            <w:hyperlink r:id="rId118" w:history="1">
               <w:r>
                 <w:rPr>
                   <w:rStyle w:val="Hyperlink"/>
@@ -32258,7 +33752,7 @@
             <w:tcW w:w="5240" w:type="dxa"/>
           </w:tcPr>
           <w:p>
-            <w:hyperlink r:id="rId105" w:history="1">
+            <w:hyperlink r:id="rId119" w:history="1">
               <w:r>
                 <w:rPr>
                   <w:rStyle w:val="Hyperlink"/>
@@ -32285,7 +33779,7 @@
             <w:tcW w:w="5240" w:type="dxa"/>
           </w:tcPr>
           <w:p>
-            <w:hyperlink r:id="rId106" w:history="1">
+            <w:hyperlink r:id="rId120" w:history="1">
               <w:r>
                 <w:rPr>
                   <w:rStyle w:val="Hyperlink"/>
@@ -32315,7 +33809,7 @@
             <w:tcW w:w="5240" w:type="dxa"/>
           </w:tcPr>
           <w:p>
-            <w:hyperlink r:id="rId107" w:history="1">
+            <w:hyperlink r:id="rId121" w:history="1">
               <w:r>
                 <w:rPr>
                   <w:rStyle w:val="Hyperlink"/>
@@ -32342,7 +33836,7 @@
             <w:tcW w:w="5240" w:type="dxa"/>
           </w:tcPr>
           <w:p>
-            <w:hyperlink r:id="rId108" w:history="1">
+            <w:hyperlink r:id="rId122" w:history="1">
               <w:r>
                 <w:rPr>
                   <w:rStyle w:val="Hyperlink"/>
@@ -32366,7 +33860,7 @@
     </w:tbl>
     <w:p/>
     <w:sectPr>
-      <w:headerReference w:type="default" r:id="rId109"/>
+      <w:headerReference w:type="default" r:id="rId123"/>
       <w:pgSz w:w="11906" w:h="16838"/>
       <w:pgMar w:top="720" w:right="720" w:bottom="720" w:left="720" w:header="708" w:footer="708" w:gutter="0"/>
       <w:cols w:space="708"/>
@@ -32503,7 +33997,7 @@
       <w:rPr>
         <w:noProof/>
       </w:rPr>
-      <w:t>28.07.2026</w:t>
+      <w:t>29.07.2026</w:t>
     </w:r>
     <w:r>
       <w:rPr>

</xml_diff>

<commit_message>
Kapitel 12: Kleine Fehler korrigiert
</commit_message>
<xml_diff>
--- a/Doc/Arbeitsblaetter_2026.docx
+++ b/Doc/Arbeitsblaetter_2026.docx
@@ -3584,7 +3584,6 @@
               </w:rPr>
             </w:pPr>
             <w:proofErr w:type="spellStart"/>
-            <w:proofErr w:type="gramStart"/>
             <w:r>
               <w:rPr>
                 <w:rFonts w:ascii="Courier New" w:hAnsi="Courier New" w:cs="Courier New"/>
@@ -3596,14 +3595,7 @@
               <w:rPr>
                 <w:rFonts w:ascii="Courier New" w:hAnsi="Courier New" w:cs="Courier New"/>
               </w:rPr>
-              <w:t>(</w:t>
-            </w:r>
-            <w:proofErr w:type="gramEnd"/>
-            <w:r>
-              <w:rPr>
-                <w:rFonts w:ascii="Courier New" w:hAnsi="Courier New" w:cs="Courier New"/>
-              </w:rPr>
-              <w:t>"Hallo Welt")</w:t>
+              <w:t>("Hallo Welt")</w:t>
             </w:r>
           </w:p>
         </w:tc>
@@ -3632,7 +3624,6 @@
               </w:rPr>
             </w:pPr>
             <w:proofErr w:type="spellStart"/>
-            <w:proofErr w:type="gramStart"/>
             <w:r>
               <w:rPr>
                 <w:rFonts w:ascii="Courier New" w:hAnsi="Courier New" w:cs="Courier New"/>
@@ -3644,14 +3635,7 @@
               <w:rPr>
                 <w:rFonts w:ascii="Courier New" w:hAnsi="Courier New" w:cs="Courier New"/>
               </w:rPr>
-              <w:t>(</w:t>
-            </w:r>
-            <w:proofErr w:type="gramEnd"/>
-            <w:r>
-              <w:rPr>
-                <w:rFonts w:ascii="Courier New" w:hAnsi="Courier New" w:cs="Courier New"/>
-              </w:rPr>
-              <w:t>"Hallo Welt")</w:t>
+              <w:t>("Hallo Welt")</w:t>
             </w:r>
           </w:p>
         </w:tc>
@@ -4081,7 +4065,6 @@
               </w:rPr>
             </w:pPr>
             <w:proofErr w:type="spellStart"/>
-            <w:proofErr w:type="gramStart"/>
             <w:r>
               <w:rPr>
                 <w:rFonts w:ascii="Courier New" w:hAnsi="Courier New" w:cs="Courier New"/>
@@ -4089,7 +4072,6 @@
               <w:t>nachricht.upper</w:t>
             </w:r>
             <w:proofErr w:type="spellEnd"/>
-            <w:proofErr w:type="gramEnd"/>
             <w:r>
               <w:rPr>
                 <w:rFonts w:ascii="Courier New" w:hAnsi="Courier New" w:cs="Courier New"/>
@@ -4315,7 +4297,6 @@
               </w:rPr>
             </w:pPr>
             <w:proofErr w:type="spellStart"/>
-            <w:proofErr w:type="gramStart"/>
             <w:r>
               <w:rPr>
                 <w:rFonts w:ascii="Courier New" w:hAnsi="Courier New" w:cs="Courier New"/>
@@ -4327,14 +4308,7 @@
               <w:rPr>
                 <w:rFonts w:ascii="Courier New" w:hAnsi="Courier New" w:cs="Courier New"/>
               </w:rPr>
-              <w:t>(</w:t>
-            </w:r>
-            <w:proofErr w:type="gramEnd"/>
-            <w:r>
-              <w:rPr>
-                <w:rFonts w:ascii="Courier New" w:hAnsi="Courier New" w:cs="Courier New"/>
-              </w:rPr>
-              <w:t>3)</w:t>
+              <w:t>(3)</w:t>
             </w:r>
           </w:p>
         </w:tc>
@@ -4363,7 +4337,6 @@
               </w:rPr>
             </w:pPr>
             <w:proofErr w:type="spellStart"/>
-            <w:proofErr w:type="gramStart"/>
             <w:r>
               <w:rPr>
                 <w:rFonts w:ascii="Courier New" w:hAnsi="Courier New" w:cs="Courier New"/>
@@ -4375,14 +4348,7 @@
               <w:rPr>
                 <w:rFonts w:ascii="Courier New" w:hAnsi="Courier New" w:cs="Courier New"/>
               </w:rPr>
-              <w:t>(</w:t>
-            </w:r>
-            <w:proofErr w:type="gramEnd"/>
-            <w:r>
-              <w:rPr>
-                <w:rFonts w:ascii="Courier New" w:hAnsi="Courier New" w:cs="Courier New"/>
-              </w:rPr>
-              <w:t>3.14)</w:t>
+              <w:t>(3.14)</w:t>
             </w:r>
           </w:p>
         </w:tc>
@@ -4411,7 +4377,6 @@
               </w:rPr>
             </w:pPr>
             <w:proofErr w:type="spellStart"/>
-            <w:proofErr w:type="gramStart"/>
             <w:r>
               <w:rPr>
                 <w:rFonts w:ascii="Courier New" w:hAnsi="Courier New" w:cs="Courier New"/>
@@ -4423,14 +4388,7 @@
               <w:rPr>
                 <w:rFonts w:ascii="Courier New" w:hAnsi="Courier New" w:cs="Courier New"/>
               </w:rPr>
-              <w:t>(</w:t>
-            </w:r>
-            <w:proofErr w:type="gramEnd"/>
-            <w:r>
-              <w:rPr>
-                <w:rFonts w:ascii="Courier New" w:hAnsi="Courier New" w:cs="Courier New"/>
-              </w:rPr>
-              <w:t>3,14)</w:t>
+              <w:t>(3,14)</w:t>
             </w:r>
           </w:p>
         </w:tc>
@@ -4755,7 +4713,6 @@
               </w:rPr>
             </w:pPr>
             <w:proofErr w:type="spellStart"/>
-            <w:proofErr w:type="gramStart"/>
             <w:r>
               <w:rPr>
                 <w:rFonts w:ascii="Courier New" w:hAnsi="Courier New" w:cs="Courier New"/>
@@ -4763,7 +4720,6 @@
               <w:t>zahl.upper</w:t>
             </w:r>
             <w:proofErr w:type="spellEnd"/>
-            <w:proofErr w:type="gramEnd"/>
             <w:r>
               <w:rPr>
                 <w:rFonts w:ascii="Courier New" w:hAnsi="Courier New" w:cs="Courier New"/>
@@ -5205,7 +5161,6 @@
               </w:rPr>
             </w:pPr>
             <w:proofErr w:type="spellStart"/>
-            <w:proofErr w:type="gramStart"/>
             <w:r>
               <w:rPr>
                 <w:rFonts w:ascii="Courier New" w:hAnsi="Courier New" w:cs="Courier New"/>
@@ -5217,14 +5172,7 @@
               <w:rPr>
                 <w:rFonts w:ascii="Courier New" w:hAnsi="Courier New" w:cs="Courier New"/>
               </w:rPr>
-              <w:t>(</w:t>
-            </w:r>
-            <w:proofErr w:type="gramEnd"/>
-            <w:r>
-              <w:rPr>
-                <w:rFonts w:ascii="Courier New" w:hAnsi="Courier New" w:cs="Courier New"/>
-              </w:rPr>
-              <w:t>"Hallo " + "Welt")</w:t>
+              <w:t>("Hallo " + "Welt")</w:t>
             </w:r>
           </w:p>
         </w:tc>
@@ -5385,7 +5333,6 @@
               </w:rPr>
             </w:pPr>
             <w:proofErr w:type="spellStart"/>
-            <w:proofErr w:type="gramStart"/>
             <w:r>
               <w:rPr>
                 <w:rFonts w:ascii="Courier New" w:hAnsi="Courier New" w:cs="Courier New"/>
@@ -5397,14 +5344,7 @@
               <w:rPr>
                 <w:rFonts w:ascii="Courier New" w:hAnsi="Courier New" w:cs="Courier New"/>
               </w:rPr>
-              <w:t>(</w:t>
-            </w:r>
-            <w:proofErr w:type="gramEnd"/>
-            <w:r>
-              <w:rPr>
-                <w:rFonts w:ascii="Courier New" w:hAnsi="Courier New" w:cs="Courier New"/>
-              </w:rPr>
-              <w:t>3 * "</w:t>
+              <w:t>(3 * "</w:t>
             </w:r>
             <w:r>
               <w:rPr>
@@ -5485,7 +5425,6 @@
               </w:rPr>
             </w:pPr>
             <w:proofErr w:type="spellStart"/>
-            <w:proofErr w:type="gramStart"/>
             <w:r>
               <w:rPr>
                 <w:rFonts w:ascii="Courier New" w:hAnsi="Courier New" w:cs="Courier New"/>
@@ -5497,14 +5436,7 @@
               <w:rPr>
                 <w:rFonts w:ascii="Courier New" w:hAnsi="Courier New" w:cs="Courier New"/>
               </w:rPr>
-              <w:t>(</w:t>
-            </w:r>
-            <w:proofErr w:type="gramEnd"/>
-            <w:r>
-              <w:rPr>
-                <w:rFonts w:ascii="Courier New" w:hAnsi="Courier New" w:cs="Courier New"/>
-              </w:rPr>
-              <w:t xml:space="preserve">3 * </w:t>
+              <w:t xml:space="preserve">(3 * </w:t>
             </w:r>
             <w:proofErr w:type="spellStart"/>
             <w:r>
@@ -6672,15 +6604,7 @@
         <w:t>M</w:t>
       </w:r>
       <w:r>
-        <w:t xml:space="preserve">it dem </w:t>
-      </w:r>
-      <w:proofErr w:type="gramStart"/>
-      <w:r>
-        <w:t>IDLE Editor</w:t>
-      </w:r>
-      <w:proofErr w:type="gramEnd"/>
-      <w:r>
-        <w:t xml:space="preserve"> </w:t>
+        <w:t xml:space="preserve">it dem IDLE Editor </w:t>
       </w:r>
       <w:r>
         <w:t xml:space="preserve">ein </w:t>
@@ -7170,7 +7094,6 @@
           </w:tcPr>
           <w:p>
             <w:proofErr w:type="spellStart"/>
-            <w:proofErr w:type="gramStart"/>
             <w:r>
               <w:rPr>
                 <w:rFonts w:ascii="Courier New" w:hAnsi="Courier New" w:cs="Courier New"/>
@@ -7182,14 +7105,7 @@
               <w:rPr>
                 <w:rFonts w:ascii="Courier New" w:hAnsi="Courier New" w:cs="Courier New"/>
               </w:rPr>
-              <w:t>(</w:t>
-            </w:r>
-            <w:proofErr w:type="gramEnd"/>
-            <w:r>
-              <w:rPr>
-                <w:rFonts w:ascii="Courier New" w:hAnsi="Courier New" w:cs="Courier New"/>
-              </w:rPr>
-              <w:t xml:space="preserve">3 * </w:t>
+              <w:t xml:space="preserve">(3 * </w:t>
             </w:r>
             <w:proofErr w:type="spellStart"/>
             <w:r>
@@ -7560,7 +7476,6 @@
               </w:rPr>
             </w:pPr>
             <w:proofErr w:type="spellStart"/>
-            <w:proofErr w:type="gramStart"/>
             <w:r>
               <w:rPr>
                 <w:rFonts w:ascii="Courier New" w:hAnsi="Courier New" w:cs="Courier New"/>
@@ -7572,14 +7487,7 @@
               <w:rPr>
                 <w:rFonts w:ascii="Courier New" w:hAnsi="Courier New" w:cs="Courier New"/>
               </w:rPr>
-              <w:t>(</w:t>
-            </w:r>
-            <w:proofErr w:type="gramEnd"/>
-            <w:r>
-              <w:rPr>
-                <w:rFonts w:ascii="Courier New" w:hAnsi="Courier New" w:cs="Courier New"/>
-              </w:rPr>
-              <w:t>3 * zeichenkette)</w:t>
+              <w:t>(3 * zeichenkette)</w:t>
             </w:r>
           </w:p>
         </w:tc>
@@ -7602,7 +7510,6 @@
               </w:rPr>
             </w:pPr>
             <w:proofErr w:type="spellStart"/>
-            <w:proofErr w:type="gramStart"/>
             <w:r>
               <w:rPr>
                 <w:rFonts w:ascii="Courier New" w:hAnsi="Courier New" w:cs="Courier New"/>
@@ -7614,14 +7521,7 @@
               <w:rPr>
                 <w:rFonts w:ascii="Courier New" w:hAnsi="Courier New" w:cs="Courier New"/>
               </w:rPr>
-              <w:t>(</w:t>
-            </w:r>
-            <w:proofErr w:type="gramEnd"/>
-            <w:r>
-              <w:rPr>
-                <w:rFonts w:ascii="Courier New" w:hAnsi="Courier New" w:cs="Courier New"/>
-              </w:rPr>
-              <w:t xml:space="preserve">3 * </w:t>
+              <w:t xml:space="preserve">(3 * </w:t>
             </w:r>
             <w:proofErr w:type="spellStart"/>
             <w:r>
@@ -7751,7 +7651,6 @@
               </w:rPr>
             </w:pPr>
             <w:proofErr w:type="spellStart"/>
-            <w:proofErr w:type="gramStart"/>
             <w:r>
               <w:rPr>
                 <w:rFonts w:ascii="Courier New" w:hAnsi="Courier New" w:cs="Courier New"/>
@@ -7763,14 +7662,7 @@
               <w:rPr>
                 <w:rFonts w:ascii="Courier New" w:hAnsi="Courier New" w:cs="Courier New"/>
               </w:rPr>
-              <w:t>(</w:t>
-            </w:r>
-            <w:proofErr w:type="gramEnd"/>
-            <w:r>
-              <w:rPr>
-                <w:rFonts w:ascii="Courier New" w:hAnsi="Courier New" w:cs="Courier New"/>
-              </w:rPr>
-              <w:t>"</w:t>
+              <w:t>("</w:t>
             </w:r>
             <w:proofErr w:type="spellStart"/>
             <w:r>
@@ -7821,7 +7713,6 @@
               </w:rPr>
             </w:pPr>
             <w:proofErr w:type="spellStart"/>
-            <w:proofErr w:type="gramStart"/>
             <w:r>
               <w:rPr>
                 <w:rFonts w:ascii="Courier New" w:hAnsi="Courier New" w:cs="Courier New"/>
@@ -7833,14 +7724,7 @@
               <w:rPr>
                 <w:rFonts w:ascii="Courier New" w:hAnsi="Courier New" w:cs="Courier New"/>
               </w:rPr>
-              <w:t>(</w:t>
-            </w:r>
-            <w:proofErr w:type="gramEnd"/>
-            <w:r>
-              <w:rPr>
-                <w:rFonts w:ascii="Courier New" w:hAnsi="Courier New" w:cs="Courier New"/>
-              </w:rPr>
-              <w:t>"</w:t>
+              <w:t>("</w:t>
             </w:r>
             <w:proofErr w:type="spellStart"/>
             <w:r>
@@ -7891,7 +7775,6 @@
               </w:rPr>
             </w:pPr>
             <w:proofErr w:type="spellStart"/>
-            <w:proofErr w:type="gramStart"/>
             <w:r>
               <w:rPr>
                 <w:rFonts w:ascii="Courier New" w:hAnsi="Courier New" w:cs="Courier New"/>
@@ -7903,14 +7786,7 @@
               <w:rPr>
                 <w:rFonts w:ascii="Courier New" w:hAnsi="Courier New" w:cs="Courier New"/>
               </w:rPr>
-              <w:t>(</w:t>
-            </w:r>
-            <w:proofErr w:type="gramEnd"/>
-            <w:r>
-              <w:rPr>
-                <w:rFonts w:ascii="Courier New" w:hAnsi="Courier New" w:cs="Courier New"/>
-              </w:rPr>
-              <w:t>"zahl =", zahl)</w:t>
+              <w:t>("zahl =", zahl)</w:t>
             </w:r>
           </w:p>
         </w:tc>
@@ -7933,7 +7809,6 @@
               </w:rPr>
             </w:pPr>
             <w:proofErr w:type="spellStart"/>
-            <w:proofErr w:type="gramStart"/>
             <w:r>
               <w:rPr>
                 <w:rFonts w:ascii="Courier New" w:hAnsi="Courier New" w:cs="Courier New"/>
@@ -7945,14 +7820,7 @@
               <w:rPr>
                 <w:rFonts w:ascii="Courier New" w:hAnsi="Courier New" w:cs="Courier New"/>
               </w:rPr>
-              <w:t>(</w:t>
-            </w:r>
-            <w:proofErr w:type="gramEnd"/>
-            <w:r>
-              <w:rPr>
-                <w:rFonts w:ascii="Courier New" w:hAnsi="Courier New" w:cs="Courier New"/>
-              </w:rPr>
-              <w:t>"zeichenkette =", zeichenkette)</w:t>
+              <w:t>("zeichenkette =", zeichenkette)</w:t>
             </w:r>
           </w:p>
         </w:tc>
@@ -7977,15 +7845,7 @@
       <w:bookmarkStart w:id="97" w:name="_Toc236341955"/>
       <w:r>
         <w:lastRenderedPageBreak/>
-        <w:t xml:space="preserve">Mit dem </w:t>
-      </w:r>
-      <w:proofErr w:type="gramStart"/>
-      <w:r>
-        <w:t>IDLE Editor</w:t>
-      </w:r>
-      <w:proofErr w:type="gramEnd"/>
-      <w:r>
-        <w:t xml:space="preserve"> ein </w:t>
+        <w:t xml:space="preserve">Mit dem IDLE Editor ein </w:t>
       </w:r>
       <w:r>
         <w:t xml:space="preserve">vorhandenes </w:t>
@@ -8878,7 +8738,6 @@
               <w:t>(</w:t>
             </w:r>
             <w:proofErr w:type="spellStart"/>
-            <w:proofErr w:type="gramStart"/>
             <w:r>
               <w:rPr>
                 <w:rFonts w:ascii="Courier New" w:hAnsi="Courier New" w:cs="Courier New"/>
@@ -8890,14 +8749,7 @@
               <w:rPr>
                 <w:rFonts w:ascii="Courier New" w:hAnsi="Courier New" w:cs="Courier New"/>
               </w:rPr>
-              <w:t>[</w:t>
-            </w:r>
-            <w:proofErr w:type="gramEnd"/>
-            <w:r>
-              <w:rPr>
-                <w:rFonts w:ascii="Courier New" w:hAnsi="Courier New" w:cs="Courier New"/>
-              </w:rPr>
-              <w:t>0])</w:t>
+              <w:t>[0])</w:t>
             </w:r>
           </w:p>
         </w:tc>
@@ -8934,7 +8786,6 @@
               <w:t>(</w:t>
             </w:r>
             <w:proofErr w:type="spellStart"/>
-            <w:proofErr w:type="gramStart"/>
             <w:r>
               <w:rPr>
                 <w:rFonts w:ascii="Courier New" w:hAnsi="Courier New" w:cs="Courier New"/>
@@ -8946,14 +8797,7 @@
               <w:rPr>
                 <w:rFonts w:ascii="Courier New" w:hAnsi="Courier New" w:cs="Courier New"/>
               </w:rPr>
-              <w:t>[</w:t>
-            </w:r>
-            <w:proofErr w:type="gramEnd"/>
-            <w:r>
-              <w:rPr>
-                <w:rFonts w:ascii="Courier New" w:hAnsi="Courier New" w:cs="Courier New"/>
-              </w:rPr>
-              <w:t>0:2])</w:t>
+              <w:t>[0:2])</w:t>
             </w:r>
           </w:p>
         </w:tc>
@@ -8990,7 +8834,6 @@
               <w:t>(</w:t>
             </w:r>
             <w:proofErr w:type="spellStart"/>
-            <w:proofErr w:type="gramStart"/>
             <w:r>
               <w:rPr>
                 <w:rFonts w:ascii="Courier New" w:hAnsi="Courier New" w:cs="Courier New"/>
@@ -9002,14 +8845,7 @@
               <w:rPr>
                 <w:rFonts w:ascii="Courier New" w:hAnsi="Courier New" w:cs="Courier New"/>
               </w:rPr>
-              <w:t>[</w:t>
-            </w:r>
-            <w:proofErr w:type="gramEnd"/>
-            <w:r>
-              <w:rPr>
-                <w:rFonts w:ascii="Courier New" w:hAnsi="Courier New" w:cs="Courier New"/>
-              </w:rPr>
-              <w:t>-1])</w:t>
+              <w:t>[-1])</w:t>
             </w:r>
           </w:p>
         </w:tc>
@@ -9032,7 +8868,6 @@
               </w:rPr>
             </w:pPr>
             <w:proofErr w:type="spellStart"/>
-            <w:proofErr w:type="gramStart"/>
             <w:r>
               <w:rPr>
                 <w:rFonts w:ascii="Courier New" w:hAnsi="Courier New" w:cs="Courier New"/>
@@ -9044,14 +8879,7 @@
               <w:rPr>
                 <w:rFonts w:ascii="Courier New" w:hAnsi="Courier New" w:cs="Courier New"/>
               </w:rPr>
-              <w:t>[</w:t>
-            </w:r>
-            <w:proofErr w:type="gramEnd"/>
-            <w:r>
-              <w:rPr>
-                <w:rFonts w:ascii="Courier New" w:hAnsi="Courier New" w:cs="Courier New"/>
-              </w:rPr>
-              <w:t>2] = "Fritz"</w:t>
+              <w:t>[2] = "Fritz"</w:t>
             </w:r>
           </w:p>
         </w:tc>
@@ -9484,7 +9312,6 @@
               </w:rPr>
             </w:pPr>
             <w:proofErr w:type="spellStart"/>
-            <w:proofErr w:type="gramStart"/>
             <w:r>
               <w:rPr>
                 <w:rFonts w:ascii="Courier New" w:hAnsi="Courier New" w:cs="Courier New"/>
@@ -9492,7 +9319,6 @@
               <w:t>buchstaben.append</w:t>
             </w:r>
             <w:proofErr w:type="spellEnd"/>
-            <w:proofErr w:type="gramEnd"/>
             <w:r>
               <w:rPr>
                 <w:rFonts w:ascii="Courier New" w:hAnsi="Courier New" w:cs="Courier New"/>
@@ -9568,7 +9394,6 @@
               </w:rPr>
             </w:pPr>
             <w:proofErr w:type="spellStart"/>
-            <w:proofErr w:type="gramStart"/>
             <w:r>
               <w:rPr>
                 <w:rFonts w:ascii="Courier New" w:hAnsi="Courier New" w:cs="Courier New"/>
@@ -9576,7 +9401,6 @@
               <w:t>buchstaben.append</w:t>
             </w:r>
             <w:proofErr w:type="spellEnd"/>
-            <w:proofErr w:type="gramEnd"/>
             <w:r>
               <w:rPr>
                 <w:rFonts w:ascii="Courier New" w:hAnsi="Courier New" w:cs="Courier New"/>
@@ -9765,7 +9589,6 @@
               </w:rPr>
             </w:pPr>
             <w:proofErr w:type="spellStart"/>
-            <w:proofErr w:type="gramStart"/>
             <w:r>
               <w:rPr>
                 <w:rFonts w:ascii="Courier New" w:hAnsi="Courier New" w:cs="Courier New"/>
@@ -9773,7 +9596,6 @@
               <w:t>vornamen.remove</w:t>
             </w:r>
             <w:proofErr w:type="spellEnd"/>
-            <w:proofErr w:type="gramEnd"/>
             <w:r>
               <w:rPr>
                 <w:rFonts w:ascii="Courier New" w:hAnsi="Courier New" w:cs="Courier New"/>
@@ -9855,7 +9677,6 @@
               <w:t xml:space="preserve">del </w:t>
             </w:r>
             <w:proofErr w:type="spellStart"/>
-            <w:proofErr w:type="gramStart"/>
             <w:r>
               <w:rPr>
                 <w:rFonts w:ascii="Courier New" w:hAnsi="Courier New" w:cs="Courier New"/>
@@ -9867,14 +9688,7 @@
               <w:rPr>
                 <w:rFonts w:ascii="Courier New" w:hAnsi="Courier New" w:cs="Courier New"/>
               </w:rPr>
-              <w:t>[</w:t>
-            </w:r>
-            <w:proofErr w:type="gramEnd"/>
-            <w:r>
-              <w:rPr>
-                <w:rFonts w:ascii="Courier New" w:hAnsi="Courier New" w:cs="Courier New"/>
-              </w:rPr>
-              <w:t>0]</w:t>
+              <w:t>[0]</w:t>
             </w:r>
           </w:p>
         </w:tc>
@@ -10182,7 +9996,6 @@
               <w:t>(</w:t>
             </w:r>
             <w:proofErr w:type="spellStart"/>
-            <w:proofErr w:type="gramStart"/>
             <w:r>
               <w:rPr>
                 <w:rFonts w:ascii="Courier New" w:hAnsi="Courier New" w:cs="Courier New"/>
@@ -10190,7 +10003,6 @@
               <w:t>random.choice</w:t>
             </w:r>
             <w:proofErr w:type="spellEnd"/>
-            <w:proofErr w:type="gramEnd"/>
             <w:r>
               <w:rPr>
                 <w:rFonts w:ascii="Courier New" w:hAnsi="Courier New" w:cs="Courier New"/>
@@ -10432,21 +10244,7 @@
               <w:rPr>
                 <w:rFonts w:ascii="Courier New" w:hAnsi="Courier New" w:cs="Courier New"/>
               </w:rPr>
-              <w:t>(</w:t>
-            </w:r>
-            <w:proofErr w:type="gramStart"/>
-            <w:r>
-              <w:rPr>
-                <w:rFonts w:ascii="Courier New" w:hAnsi="Courier New" w:cs="Courier New"/>
-              </w:rPr>
-              <w:t>punkt[</w:t>
-            </w:r>
-            <w:proofErr w:type="gramEnd"/>
-            <w:r>
-              <w:rPr>
-                <w:rFonts w:ascii="Courier New" w:hAnsi="Courier New" w:cs="Courier New"/>
-              </w:rPr>
-              <w:t>0])</w:t>
+              <w:t>(punkt[0])</w:t>
             </w:r>
           </w:p>
         </w:tc>
@@ -10480,21 +10278,7 @@
               <w:rPr>
                 <w:rFonts w:ascii="Courier New" w:hAnsi="Courier New" w:cs="Courier New"/>
               </w:rPr>
-              <w:t>(</w:t>
-            </w:r>
-            <w:proofErr w:type="gramStart"/>
-            <w:r>
-              <w:rPr>
-                <w:rFonts w:ascii="Courier New" w:hAnsi="Courier New" w:cs="Courier New"/>
-              </w:rPr>
-              <w:t>punkt[</w:t>
-            </w:r>
-            <w:proofErr w:type="gramEnd"/>
-            <w:r>
-              <w:rPr>
-                <w:rFonts w:ascii="Courier New" w:hAnsi="Courier New" w:cs="Courier New"/>
-              </w:rPr>
-              <w:t>0:2])</w:t>
+              <w:t>(punkt[0:2])</w:t>
             </w:r>
           </w:p>
         </w:tc>
@@ -10528,21 +10312,7 @@
               <w:rPr>
                 <w:rFonts w:ascii="Courier New" w:hAnsi="Courier New" w:cs="Courier New"/>
               </w:rPr>
-              <w:t>(</w:t>
-            </w:r>
-            <w:proofErr w:type="gramStart"/>
-            <w:r>
-              <w:rPr>
-                <w:rFonts w:ascii="Courier New" w:hAnsi="Courier New" w:cs="Courier New"/>
-              </w:rPr>
-              <w:t>punkt[</w:t>
-            </w:r>
-            <w:proofErr w:type="gramEnd"/>
-            <w:r>
-              <w:rPr>
-                <w:rFonts w:ascii="Courier New" w:hAnsi="Courier New" w:cs="Courier New"/>
-              </w:rPr>
-              <w:t>-1])</w:t>
+              <w:t>(punkt[-1])</w:t>
             </w:r>
           </w:p>
         </w:tc>
@@ -10564,19 +10334,11 @@
                 <w:rFonts w:ascii="Courier New" w:hAnsi="Courier New" w:cs="Courier New"/>
               </w:rPr>
             </w:pPr>
-            <w:proofErr w:type="gramStart"/>
-            <w:r>
-              <w:rPr>
-                <w:rFonts w:ascii="Courier New" w:hAnsi="Courier New" w:cs="Courier New"/>
-              </w:rPr>
-              <w:t>punkt[</w:t>
-            </w:r>
-            <w:proofErr w:type="gramEnd"/>
-            <w:r>
-              <w:rPr>
-                <w:rFonts w:ascii="Courier New" w:hAnsi="Courier New" w:cs="Courier New"/>
-              </w:rPr>
-              <w:t>2] = 15</w:t>
+            <w:r>
+              <w:rPr>
+                <w:rFonts w:ascii="Courier New" w:hAnsi="Courier New" w:cs="Courier New"/>
+              </w:rPr>
+              <w:t>punkt[2] = 15</w:t>
             </w:r>
           </w:p>
         </w:tc>
@@ -10772,7 +10534,6 @@
               <w:t>(</w:t>
             </w:r>
             <w:proofErr w:type="spellStart"/>
-            <w:proofErr w:type="gramStart"/>
             <w:r>
               <w:rPr>
                 <w:rFonts w:ascii="Courier New" w:hAnsi="Courier New" w:cs="Courier New"/>
@@ -10780,7 +10541,6 @@
               <w:t>punkt.count</w:t>
             </w:r>
             <w:proofErr w:type="spellEnd"/>
-            <w:proofErr w:type="gramEnd"/>
             <w:r>
               <w:rPr>
                 <w:rFonts w:ascii="Courier New" w:hAnsi="Courier New" w:cs="Courier New"/>
@@ -10822,7 +10582,6 @@
               <w:t>(</w:t>
             </w:r>
             <w:proofErr w:type="spellStart"/>
-            <w:proofErr w:type="gramStart"/>
             <w:r>
               <w:rPr>
                 <w:rFonts w:ascii="Courier New" w:hAnsi="Courier New" w:cs="Courier New"/>
@@ -10830,7 +10589,6 @@
               <w:t>punkt.index</w:t>
             </w:r>
             <w:proofErr w:type="spellEnd"/>
-            <w:proofErr w:type="gramEnd"/>
             <w:r>
               <w:rPr>
                 <w:rFonts w:ascii="Courier New" w:hAnsi="Courier New" w:cs="Courier New"/>
@@ -11846,17 +11604,9 @@
               <w:rPr>
                 <w:rFonts w:ascii="Courier New" w:hAnsi="Courier New" w:cs="Courier New"/>
               </w:rPr>
-              <w:t>englisch_</w:t>
-            </w:r>
-            <w:proofErr w:type="gramStart"/>
-            <w:r>
-              <w:rPr>
-                <w:rFonts w:ascii="Courier New" w:hAnsi="Courier New" w:cs="Courier New"/>
-              </w:rPr>
-              <w:t>deutsch.keys</w:t>
+              <w:t>englisch_deutsch.keys</w:t>
             </w:r>
             <w:proofErr w:type="spellEnd"/>
-            <w:proofErr w:type="gramEnd"/>
             <w:r>
               <w:rPr>
                 <w:rFonts w:ascii="Courier New" w:hAnsi="Courier New" w:cs="Courier New"/>
@@ -11928,17 +11678,9 @@
               <w:rPr>
                 <w:rFonts w:ascii="Courier New" w:hAnsi="Courier New" w:cs="Courier New"/>
               </w:rPr>
-              <w:t>englisch_</w:t>
-            </w:r>
-            <w:proofErr w:type="gramStart"/>
-            <w:r>
-              <w:rPr>
-                <w:rFonts w:ascii="Courier New" w:hAnsi="Courier New" w:cs="Courier New"/>
-              </w:rPr>
-              <w:t>deutsch.values</w:t>
+              <w:t>englisch_deutsch.values</w:t>
             </w:r>
             <w:proofErr w:type="spellEnd"/>
-            <w:proofErr w:type="gramEnd"/>
             <w:r>
               <w:rPr>
                 <w:rFonts w:ascii="Courier New" w:hAnsi="Courier New" w:cs="Courier New"/>
@@ -12717,7 +12459,6 @@
               <w:t xml:space="preserve">zahl1 = </w:t>
             </w:r>
             <w:proofErr w:type="spellStart"/>
-            <w:proofErr w:type="gramStart"/>
             <w:r>
               <w:rPr>
                 <w:rFonts w:ascii="Courier New" w:hAnsi="Courier New" w:cs="Courier New"/>
@@ -12729,28 +12470,7 @@
               <w:rPr>
                 <w:rFonts w:ascii="Courier New" w:hAnsi="Courier New" w:cs="Courier New"/>
               </w:rPr>
-              <w:t>(</w:t>
-            </w:r>
-            <w:proofErr w:type="gramEnd"/>
-            <w:r>
-              <w:rPr>
-                <w:rFonts w:ascii="Courier New" w:hAnsi="Courier New" w:cs="Courier New"/>
-              </w:rPr>
-              <w:t xml:space="preserve">"Gib die </w:t>
-            </w:r>
-            <w:proofErr w:type="gramStart"/>
-            <w:r>
-              <w:rPr>
-                <w:rFonts w:ascii="Courier New" w:hAnsi="Courier New" w:cs="Courier New"/>
-              </w:rPr>
-              <w:t>erste  Zahl</w:t>
-            </w:r>
-            <w:proofErr w:type="gramEnd"/>
-            <w:r>
-              <w:rPr>
-                <w:rFonts w:ascii="Courier New" w:hAnsi="Courier New" w:cs="Courier New"/>
-              </w:rPr>
-              <w:t xml:space="preserve"> ein ")</w:t>
+              <w:t>("Gib die erste  Zahl ein ")</w:t>
             </w:r>
           </w:p>
         </w:tc>
@@ -12785,7 +12505,6 @@
               <w:t xml:space="preserve">zahl2 = </w:t>
             </w:r>
             <w:proofErr w:type="spellStart"/>
-            <w:proofErr w:type="gramStart"/>
             <w:r>
               <w:rPr>
                 <w:rFonts w:ascii="Courier New" w:hAnsi="Courier New" w:cs="Courier New"/>
@@ -12797,14 +12516,7 @@
               <w:rPr>
                 <w:rFonts w:ascii="Courier New" w:hAnsi="Courier New" w:cs="Courier New"/>
               </w:rPr>
-              <w:t>(</w:t>
-            </w:r>
-            <w:proofErr w:type="gramEnd"/>
-            <w:r>
-              <w:rPr>
-                <w:rFonts w:ascii="Courier New" w:hAnsi="Courier New" w:cs="Courier New"/>
-              </w:rPr>
-              <w:t>"Gib die zweite Zahl ein ")</w:t>
+              <w:t>("Gib die zweite Zahl ein ")</w:t>
             </w:r>
           </w:p>
         </w:tc>
@@ -12965,7 +12677,6 @@
               </w:rPr>
             </w:pPr>
             <w:proofErr w:type="spellStart"/>
-            <w:proofErr w:type="gramStart"/>
             <w:r>
               <w:rPr>
                 <w:rFonts w:ascii="Courier New" w:hAnsi="Courier New" w:cs="Courier New"/>
@@ -12977,14 +12688,7 @@
               <w:rPr>
                 <w:rFonts w:ascii="Courier New" w:hAnsi="Courier New" w:cs="Courier New"/>
               </w:rPr>
-              <w:t>(</w:t>
-            </w:r>
-            <w:proofErr w:type="gramEnd"/>
-            <w:r>
-              <w:rPr>
-                <w:rFonts w:ascii="Courier New" w:hAnsi="Courier New" w:cs="Courier New"/>
-              </w:rPr>
-              <w:t>"Die Summe der Zahlen ist", zahl1 + zahl2)</w:t>
+              <w:t>("Die Summe der Zahlen ist", zahl1 + zahl2)</w:t>
             </w:r>
           </w:p>
         </w:tc>
@@ -13158,7 +12862,6 @@
               <w:t xml:space="preserve"> = </w:t>
             </w:r>
             <w:proofErr w:type="spellStart"/>
-            <w:proofErr w:type="gramStart"/>
             <w:r>
               <w:rPr>
                 <w:rFonts w:ascii="Courier New" w:hAnsi="Courier New" w:cs="Courier New"/>
@@ -13170,14 +12873,7 @@
               <w:rPr>
                 <w:rFonts w:ascii="Courier New" w:hAnsi="Courier New" w:cs="Courier New"/>
               </w:rPr>
-              <w:t>(</w:t>
-            </w:r>
-            <w:proofErr w:type="gramEnd"/>
-            <w:r>
-              <w:rPr>
-                <w:rFonts w:ascii="Courier New" w:hAnsi="Courier New" w:cs="Courier New"/>
-              </w:rPr>
-              <w:t xml:space="preserve">"Gib </w:t>
+              <w:t xml:space="preserve">("Gib </w:t>
             </w:r>
             <w:r>
               <w:rPr>
@@ -13189,21 +12885,20 @@
               <w:rPr>
                 <w:rFonts w:ascii="Courier New" w:hAnsi="Courier New" w:cs="Courier New"/>
               </w:rPr>
+              <w:t xml:space="preserve"> erste</w:t>
+            </w:r>
+            <w:r>
+              <w:rPr>
+                <w:rFonts w:ascii="Courier New" w:hAnsi="Courier New" w:cs="Courier New"/>
+              </w:rPr>
+              <w:t>n</w:t>
+            </w:r>
+            <w:r>
+              <w:rPr>
+                <w:rFonts w:ascii="Courier New" w:hAnsi="Courier New" w:cs="Courier New"/>
+              </w:rPr>
               <w:t xml:space="preserve"> </w:t>
             </w:r>
-            <w:proofErr w:type="gramStart"/>
-            <w:r>
-              <w:rPr>
-                <w:rFonts w:ascii="Courier New" w:hAnsi="Courier New" w:cs="Courier New"/>
-              </w:rPr>
-              <w:t>erste</w:t>
-            </w:r>
-            <w:r>
-              <w:rPr>
-                <w:rFonts w:ascii="Courier New" w:hAnsi="Courier New" w:cs="Courier New"/>
-              </w:rPr>
-              <w:t>n</w:t>
-            </w:r>
             <w:r>
               <w:rPr>
                 <w:rFonts w:ascii="Courier New" w:hAnsi="Courier New" w:cs="Courier New"/>
@@ -13214,15 +12909,8 @@
               <w:rPr>
                 <w:rFonts w:ascii="Courier New" w:hAnsi="Courier New" w:cs="Courier New"/>
               </w:rPr>
-              <w:t xml:space="preserve"> </w:t>
-            </w:r>
-            <w:r>
-              <w:rPr>
-                <w:rFonts w:ascii="Courier New" w:hAnsi="Courier New" w:cs="Courier New"/>
-              </w:rPr>
               <w:t>String</w:t>
             </w:r>
-            <w:proofErr w:type="gramEnd"/>
             <w:r>
               <w:rPr>
                 <w:rFonts w:ascii="Courier New" w:hAnsi="Courier New" w:cs="Courier New"/>
@@ -13268,7 +12956,6 @@
               <w:t xml:space="preserve"> = </w:t>
             </w:r>
             <w:proofErr w:type="spellStart"/>
-            <w:proofErr w:type="gramStart"/>
             <w:r>
               <w:rPr>
                 <w:rFonts w:ascii="Courier New" w:hAnsi="Courier New" w:cs="Courier New"/>
@@ -13280,14 +12967,7 @@
               <w:rPr>
                 <w:rFonts w:ascii="Courier New" w:hAnsi="Courier New" w:cs="Courier New"/>
               </w:rPr>
-              <w:t>(</w:t>
-            </w:r>
-            <w:proofErr w:type="gramEnd"/>
-            <w:r>
-              <w:rPr>
-                <w:rFonts w:ascii="Courier New" w:hAnsi="Courier New" w:cs="Courier New"/>
-              </w:rPr>
-              <w:t xml:space="preserve">"Gib </w:t>
+              <w:t xml:space="preserve">("Gib </w:t>
             </w:r>
             <w:r>
               <w:rPr>
@@ -13378,7 +13058,6 @@
               </w:rPr>
             </w:pPr>
             <w:proofErr w:type="spellStart"/>
-            <w:proofErr w:type="gramStart"/>
             <w:r>
               <w:rPr>
                 <w:rFonts w:ascii="Courier New" w:hAnsi="Courier New" w:cs="Courier New"/>
@@ -13390,14 +13069,7 @@
               <w:rPr>
                 <w:rFonts w:ascii="Courier New" w:hAnsi="Courier New" w:cs="Courier New"/>
               </w:rPr>
-              <w:t>(</w:t>
-            </w:r>
-            <w:proofErr w:type="gramEnd"/>
-            <w:r>
-              <w:rPr>
-                <w:rFonts w:ascii="Courier New" w:hAnsi="Courier New" w:cs="Courier New"/>
-              </w:rPr>
-              <w:t xml:space="preserve">"Die Summe der </w:t>
+              <w:t xml:space="preserve">("Die Summe der </w:t>
             </w:r>
             <w:r>
               <w:rPr>
@@ -14565,7 +14237,6 @@
               </w:rPr>
             </w:pPr>
             <w:proofErr w:type="spellStart"/>
-            <w:proofErr w:type="gramStart"/>
             <w:r>
               <w:rPr>
                 <w:rFonts w:ascii="Courier New" w:hAnsi="Courier New" w:cs="Courier New"/>
@@ -14577,14 +14248,7 @@
               <w:rPr>
                 <w:rFonts w:ascii="Courier New" w:hAnsi="Courier New" w:cs="Courier New"/>
               </w:rPr>
-              <w:t>(</w:t>
-            </w:r>
-            <w:proofErr w:type="gramEnd"/>
-            <w:r>
-              <w:rPr>
-                <w:rFonts w:ascii="Courier New" w:hAnsi="Courier New" w:cs="Courier New"/>
-              </w:rPr>
-              <w:t>1 == 2)</w:t>
+              <w:t>(1 == 2)</w:t>
             </w:r>
           </w:p>
         </w:tc>
@@ -14607,7 +14271,6 @@
               </w:rPr>
             </w:pPr>
             <w:proofErr w:type="spellStart"/>
-            <w:proofErr w:type="gramStart"/>
             <w:r>
               <w:rPr>
                 <w:rFonts w:ascii="Courier New" w:hAnsi="Courier New" w:cs="Courier New"/>
@@ -14619,14 +14282,7 @@
               <w:rPr>
                 <w:rFonts w:ascii="Courier New" w:hAnsi="Courier New" w:cs="Courier New"/>
               </w:rPr>
-              <w:t>(1 !</w:t>
-            </w:r>
-            <w:proofErr w:type="gramEnd"/>
-            <w:r>
-              <w:rPr>
-                <w:rFonts w:ascii="Courier New" w:hAnsi="Courier New" w:cs="Courier New"/>
-              </w:rPr>
-              <w:t>= 2)</w:t>
+              <w:t>(1 != 2)</w:t>
             </w:r>
           </w:p>
         </w:tc>
@@ -14649,7 +14305,6 @@
               </w:rPr>
             </w:pPr>
             <w:proofErr w:type="spellStart"/>
-            <w:proofErr w:type="gramStart"/>
             <w:r>
               <w:rPr>
                 <w:rFonts w:ascii="Courier New" w:hAnsi="Courier New" w:cs="Courier New"/>
@@ -14661,14 +14316,7 @@
               <w:rPr>
                 <w:rFonts w:ascii="Courier New" w:hAnsi="Courier New" w:cs="Courier New"/>
               </w:rPr>
-              <w:t>(</w:t>
-            </w:r>
-            <w:proofErr w:type="gramEnd"/>
-            <w:r>
-              <w:rPr>
-                <w:rFonts w:ascii="Courier New" w:hAnsi="Courier New" w:cs="Courier New"/>
-              </w:rPr>
-              <w:t>1 &lt; 2)</w:t>
+              <w:t>(1 &lt; 2)</w:t>
             </w:r>
           </w:p>
         </w:tc>
@@ -14697,7 +14345,6 @@
               </w:rPr>
             </w:pPr>
             <w:proofErr w:type="spellStart"/>
-            <w:proofErr w:type="gramStart"/>
             <w:r>
               <w:rPr>
                 <w:rFonts w:ascii="Courier New" w:hAnsi="Courier New" w:cs="Courier New"/>
@@ -14709,14 +14356,7 @@
               <w:rPr>
                 <w:rFonts w:ascii="Courier New" w:hAnsi="Courier New" w:cs="Courier New"/>
               </w:rPr>
-              <w:t>(</w:t>
-            </w:r>
-            <w:proofErr w:type="gramEnd"/>
-            <w:r>
-              <w:rPr>
-                <w:rFonts w:ascii="Courier New" w:hAnsi="Courier New" w:cs="Courier New"/>
-              </w:rPr>
-              <w:t>1 &gt; 2)</w:t>
+              <w:t>(1 &gt; 2)</w:t>
             </w:r>
           </w:p>
         </w:tc>
@@ -14745,7 +14385,6 @@
               </w:rPr>
             </w:pPr>
             <w:proofErr w:type="spellStart"/>
-            <w:proofErr w:type="gramStart"/>
             <w:r>
               <w:rPr>
                 <w:rFonts w:ascii="Courier New" w:hAnsi="Courier New" w:cs="Courier New"/>
@@ -14757,14 +14396,7 @@
               <w:rPr>
                 <w:rFonts w:ascii="Courier New" w:hAnsi="Courier New" w:cs="Courier New"/>
               </w:rPr>
-              <w:t>(</w:t>
-            </w:r>
-            <w:proofErr w:type="gramEnd"/>
-            <w:r>
-              <w:rPr>
-                <w:rFonts w:ascii="Courier New" w:hAnsi="Courier New" w:cs="Courier New"/>
-              </w:rPr>
-              <w:t>3 == 3)</w:t>
+              <w:t>(3 == 3)</w:t>
             </w:r>
           </w:p>
         </w:tc>
@@ -14787,7 +14419,6 @@
               </w:rPr>
             </w:pPr>
             <w:proofErr w:type="spellStart"/>
-            <w:proofErr w:type="gramStart"/>
             <w:r>
               <w:rPr>
                 <w:rFonts w:ascii="Courier New" w:hAnsi="Courier New" w:cs="Courier New"/>
@@ -14799,14 +14430,7 @@
               <w:rPr>
                 <w:rFonts w:ascii="Courier New" w:hAnsi="Courier New" w:cs="Courier New"/>
               </w:rPr>
-              <w:t>(3 !</w:t>
-            </w:r>
-            <w:proofErr w:type="gramEnd"/>
-            <w:r>
-              <w:rPr>
-                <w:rFonts w:ascii="Courier New" w:hAnsi="Courier New" w:cs="Courier New"/>
-              </w:rPr>
-              <w:t>= 3)</w:t>
+              <w:t>(3 != 3)</w:t>
             </w:r>
           </w:p>
         </w:tc>
@@ -14829,7 +14453,6 @@
               </w:rPr>
             </w:pPr>
             <w:proofErr w:type="spellStart"/>
-            <w:proofErr w:type="gramStart"/>
             <w:r>
               <w:rPr>
                 <w:rFonts w:ascii="Courier New" w:hAnsi="Courier New" w:cs="Courier New"/>
@@ -14841,14 +14464,7 @@
               <w:rPr>
                 <w:rFonts w:ascii="Courier New" w:hAnsi="Courier New" w:cs="Courier New"/>
               </w:rPr>
-              <w:t>(</w:t>
-            </w:r>
-            <w:proofErr w:type="gramEnd"/>
-            <w:r>
-              <w:rPr>
-                <w:rFonts w:ascii="Courier New" w:hAnsi="Courier New" w:cs="Courier New"/>
-              </w:rPr>
-              <w:t>3 &lt;= 3)</w:t>
+              <w:t>(3 &lt;= 3)</w:t>
             </w:r>
           </w:p>
         </w:tc>
@@ -14871,7 +14487,6 @@
               </w:rPr>
             </w:pPr>
             <w:proofErr w:type="spellStart"/>
-            <w:proofErr w:type="gramStart"/>
             <w:r>
               <w:rPr>
                 <w:rFonts w:ascii="Courier New" w:hAnsi="Courier New" w:cs="Courier New"/>
@@ -14883,14 +14498,7 @@
               <w:rPr>
                 <w:rFonts w:ascii="Courier New" w:hAnsi="Courier New" w:cs="Courier New"/>
               </w:rPr>
-              <w:t>(</w:t>
-            </w:r>
-            <w:proofErr w:type="gramEnd"/>
-            <w:r>
-              <w:rPr>
-                <w:rFonts w:ascii="Courier New" w:hAnsi="Courier New" w:cs="Courier New"/>
-              </w:rPr>
-              <w:t>3 &gt;= 3)</w:t>
+              <w:t>(3 &gt;= 3)</w:t>
             </w:r>
           </w:p>
         </w:tc>
@@ -14977,7 +14585,6 @@
               </w:rPr>
             </w:pPr>
             <w:proofErr w:type="spellStart"/>
-            <w:proofErr w:type="gramStart"/>
             <w:r>
               <w:rPr>
                 <w:rFonts w:ascii="Courier New" w:hAnsi="Courier New" w:cs="Courier New"/>
@@ -14989,14 +14596,7 @@
               <w:rPr>
                 <w:rFonts w:ascii="Courier New" w:hAnsi="Courier New" w:cs="Courier New"/>
               </w:rPr>
-              <w:t>(</w:t>
-            </w:r>
-            <w:proofErr w:type="gramEnd"/>
-            <w:r>
-              <w:rPr>
-                <w:rFonts w:ascii="Courier New" w:hAnsi="Courier New" w:cs="Courier New"/>
-              </w:rPr>
-              <w:t>"Hallo" == "Welt")</w:t>
+              <w:t>("Hallo" == "Welt")</w:t>
             </w:r>
           </w:p>
         </w:tc>
@@ -15019,7 +14619,6 @@
               </w:rPr>
             </w:pPr>
             <w:proofErr w:type="spellStart"/>
-            <w:proofErr w:type="gramStart"/>
             <w:r>
               <w:rPr>
                 <w:rFonts w:ascii="Courier New" w:hAnsi="Courier New" w:cs="Courier New"/>
@@ -15031,28 +14630,7 @@
               <w:rPr>
                 <w:rFonts w:ascii="Courier New" w:hAnsi="Courier New" w:cs="Courier New"/>
               </w:rPr>
-              <w:t>(</w:t>
-            </w:r>
-            <w:proofErr w:type="gramEnd"/>
-            <w:r>
-              <w:rPr>
-                <w:rFonts w:ascii="Courier New" w:hAnsi="Courier New" w:cs="Courier New"/>
-              </w:rPr>
-              <w:t>"Hallo</w:t>
-            </w:r>
-            <w:proofErr w:type="gramStart"/>
-            <w:r>
-              <w:rPr>
-                <w:rFonts w:ascii="Courier New" w:hAnsi="Courier New" w:cs="Courier New"/>
-              </w:rPr>
-              <w:t>" !</w:t>
-            </w:r>
-            <w:proofErr w:type="gramEnd"/>
-            <w:r>
-              <w:rPr>
-                <w:rFonts w:ascii="Courier New" w:hAnsi="Courier New" w:cs="Courier New"/>
-              </w:rPr>
-              <w:t xml:space="preserve">= </w:t>
+              <w:t xml:space="preserve">("Hallo" != </w:t>
             </w:r>
             <w:r>
               <w:rPr>
@@ -15087,7 +14665,6 @@
               </w:rPr>
             </w:pPr>
             <w:proofErr w:type="spellStart"/>
-            <w:proofErr w:type="gramStart"/>
             <w:r>
               <w:rPr>
                 <w:rFonts w:ascii="Courier New" w:hAnsi="Courier New" w:cs="Courier New"/>
@@ -15101,7 +14678,6 @@
               </w:rPr>
               <w:t>(</w:t>
             </w:r>
-            <w:proofErr w:type="gramEnd"/>
             <w:r>
               <w:rPr>
                 <w:rFonts w:ascii="Courier New" w:hAnsi="Courier New" w:cs="Courier New"/>
@@ -15147,7 +14723,6 @@
               </w:rPr>
             </w:pPr>
             <w:proofErr w:type="spellStart"/>
-            <w:proofErr w:type="gramStart"/>
             <w:r>
               <w:rPr>
                 <w:rFonts w:ascii="Courier New" w:hAnsi="Courier New" w:cs="Courier New"/>
@@ -15161,32 +14736,17 @@
               </w:rPr>
               <w:t>(</w:t>
             </w:r>
-            <w:proofErr w:type="gramEnd"/>
-            <w:r>
-              <w:rPr>
-                <w:rFonts w:ascii="Courier New" w:hAnsi="Courier New" w:cs="Courier New"/>
-              </w:rPr>
-              <w:t>"Montag</w:t>
-            </w:r>
-            <w:proofErr w:type="gramStart"/>
-            <w:r>
-              <w:rPr>
-                <w:rFonts w:ascii="Courier New" w:hAnsi="Courier New" w:cs="Courier New"/>
-              </w:rPr>
-              <w:t>"</w:t>
-            </w:r>
-            <w:r>
-              <w:rPr>
-                <w:rFonts w:ascii="Courier New" w:hAnsi="Courier New" w:cs="Courier New"/>
-              </w:rPr>
-              <w:t xml:space="preserve"> !</w:t>
-            </w:r>
-            <w:proofErr w:type="gramEnd"/>
-            <w:r>
-              <w:rPr>
-                <w:rFonts w:ascii="Courier New" w:hAnsi="Courier New" w:cs="Courier New"/>
-              </w:rPr>
-              <w:t xml:space="preserve">= </w:t>
+            <w:r>
+              <w:rPr>
+                <w:rFonts w:ascii="Courier New" w:hAnsi="Courier New" w:cs="Courier New"/>
+              </w:rPr>
+              <w:t>"Montag"</w:t>
+            </w:r>
+            <w:r>
+              <w:rPr>
+                <w:rFonts w:ascii="Courier New" w:hAnsi="Courier New" w:cs="Courier New"/>
+              </w:rPr>
+              <w:t xml:space="preserve"> != </w:t>
             </w:r>
             <w:r>
               <w:rPr>
@@ -15310,7 +14870,6 @@
               <w:t xml:space="preserve"> = </w:t>
             </w:r>
             <w:proofErr w:type="spellStart"/>
-            <w:proofErr w:type="gramStart"/>
             <w:r>
               <w:rPr>
                 <w:rFonts w:ascii="Courier New" w:hAnsi="Courier New" w:cs="Courier New"/>
@@ -15322,14 +14881,7 @@
               <w:rPr>
                 <w:rFonts w:ascii="Courier New" w:hAnsi="Courier New" w:cs="Courier New"/>
               </w:rPr>
-              <w:t>(</w:t>
-            </w:r>
-            <w:proofErr w:type="gramEnd"/>
-            <w:r>
-              <w:rPr>
-                <w:rFonts w:ascii="Courier New" w:hAnsi="Courier New" w:cs="Courier New"/>
-              </w:rPr>
-              <w:t>10)</w:t>
+              <w:t>(10)</w:t>
             </w:r>
           </w:p>
         </w:tc>
@@ -15414,7 +14966,6 @@
               </w:rPr>
             </w:pPr>
             <w:proofErr w:type="spellStart"/>
-            <w:proofErr w:type="gramStart"/>
             <w:r>
               <w:rPr>
                 <w:rFonts w:ascii="Courier New" w:hAnsi="Courier New" w:cs="Courier New"/>
@@ -15426,14 +14977,7 @@
               <w:rPr>
                 <w:rFonts w:ascii="Courier New" w:hAnsi="Courier New" w:cs="Courier New"/>
               </w:rPr>
-              <w:t>(</w:t>
-            </w:r>
-            <w:proofErr w:type="gramEnd"/>
-            <w:r>
-              <w:rPr>
-                <w:rFonts w:ascii="Courier New" w:hAnsi="Courier New" w:cs="Courier New"/>
-              </w:rPr>
-              <w:t xml:space="preserve">1 in </w:t>
+              <w:t xml:space="preserve">(1 in </w:t>
             </w:r>
             <w:proofErr w:type="spellStart"/>
             <w:r>
@@ -15470,7 +15014,6 @@
               </w:rPr>
             </w:pPr>
             <w:proofErr w:type="spellStart"/>
-            <w:proofErr w:type="gramStart"/>
             <w:r>
               <w:rPr>
                 <w:rFonts w:ascii="Courier New" w:hAnsi="Courier New" w:cs="Courier New"/>
@@ -15482,14 +15025,7 @@
               <w:rPr>
                 <w:rFonts w:ascii="Courier New" w:hAnsi="Courier New" w:cs="Courier New"/>
               </w:rPr>
-              <w:t>(</w:t>
-            </w:r>
-            <w:proofErr w:type="gramEnd"/>
-            <w:r>
-              <w:rPr>
-                <w:rFonts w:ascii="Courier New" w:hAnsi="Courier New" w:cs="Courier New"/>
-              </w:rPr>
-              <w:t xml:space="preserve">10 in </w:t>
+              <w:t xml:space="preserve">(10 in </w:t>
             </w:r>
             <w:proofErr w:type="spellStart"/>
             <w:r>
@@ -15523,7 +15059,6 @@
         <w:t xml:space="preserve">Bedingung mit </w:t>
       </w:r>
       <w:proofErr w:type="spellStart"/>
-      <w:proofErr w:type="gramStart"/>
       <w:r>
         <w:t>range</w:t>
       </w:r>
@@ -15532,7 +15067,6 @@
         <w:t>(</w:t>
       </w:r>
       <w:proofErr w:type="spellStart"/>
-      <w:proofErr w:type="gramEnd"/>
       <w:r>
         <w:t>start</w:t>
       </w:r>
@@ -15619,7 +15153,6 @@
               <w:t xml:space="preserve"> = </w:t>
             </w:r>
             <w:proofErr w:type="spellStart"/>
-            <w:proofErr w:type="gramStart"/>
             <w:r>
               <w:rPr>
                 <w:rFonts w:ascii="Courier New" w:hAnsi="Courier New" w:cs="Courier New"/>
@@ -15631,14 +15164,7 @@
               <w:rPr>
                 <w:rFonts w:ascii="Courier New" w:hAnsi="Courier New" w:cs="Courier New"/>
               </w:rPr>
-              <w:t>(</w:t>
-            </w:r>
-            <w:proofErr w:type="gramEnd"/>
-            <w:r>
-              <w:rPr>
-                <w:rFonts w:ascii="Courier New" w:hAnsi="Courier New" w:cs="Courier New"/>
-              </w:rPr>
-              <w:t>2, 10)</w:t>
+              <w:t>(2, 10)</w:t>
             </w:r>
           </w:p>
         </w:tc>
@@ -15723,7 +15249,6 @@
               </w:rPr>
             </w:pPr>
             <w:proofErr w:type="spellStart"/>
-            <w:proofErr w:type="gramStart"/>
             <w:r>
               <w:rPr>
                 <w:rFonts w:ascii="Courier New" w:hAnsi="Courier New" w:cs="Courier New"/>
@@ -15735,14 +15260,7 @@
               <w:rPr>
                 <w:rFonts w:ascii="Courier New" w:hAnsi="Courier New" w:cs="Courier New"/>
               </w:rPr>
-              <w:t>(</w:t>
-            </w:r>
-            <w:proofErr w:type="gramEnd"/>
-            <w:r>
-              <w:rPr>
-                <w:rFonts w:ascii="Courier New" w:hAnsi="Courier New" w:cs="Courier New"/>
-              </w:rPr>
-              <w:t xml:space="preserve">1 in </w:t>
+              <w:t xml:space="preserve">(1 in </w:t>
             </w:r>
             <w:proofErr w:type="spellStart"/>
             <w:r>
@@ -15779,7 +15297,6 @@
               </w:rPr>
             </w:pPr>
             <w:proofErr w:type="spellStart"/>
-            <w:proofErr w:type="gramStart"/>
             <w:r>
               <w:rPr>
                 <w:rFonts w:ascii="Courier New" w:hAnsi="Courier New" w:cs="Courier New"/>
@@ -15791,14 +15308,7 @@
               <w:rPr>
                 <w:rFonts w:ascii="Courier New" w:hAnsi="Courier New" w:cs="Courier New"/>
               </w:rPr>
-              <w:t>(</w:t>
-            </w:r>
-            <w:proofErr w:type="gramEnd"/>
-            <w:r>
-              <w:rPr>
-                <w:rFonts w:ascii="Courier New" w:hAnsi="Courier New" w:cs="Courier New"/>
-              </w:rPr>
-              <w:t xml:space="preserve">9 in </w:t>
+              <w:t xml:space="preserve">(9 in </w:t>
             </w:r>
             <w:proofErr w:type="spellStart"/>
             <w:r>
@@ -15857,21 +15367,7 @@
         <w:rPr>
           <w:lang w:val="en-US"/>
         </w:rPr>
-        <w:t xml:space="preserve"> </w:t>
-      </w:r>
-      <w:proofErr w:type="gramStart"/>
-      <w:r>
-        <w:rPr>
-          <w:lang w:val="en-US"/>
-        </w:rPr>
-        <w:t>range(</w:t>
-      </w:r>
-      <w:proofErr w:type="gramEnd"/>
-      <w:r>
-        <w:rPr>
-          <w:lang w:val="en-US"/>
-        </w:rPr>
-        <w:t>start, stop, step)</w:t>
+        <w:t xml:space="preserve"> range(start, stop, step)</w:t>
       </w:r>
     </w:p>
     <w:tbl>
@@ -15952,7 +15448,6 @@
               <w:t xml:space="preserve"> = </w:t>
             </w:r>
             <w:proofErr w:type="spellStart"/>
-            <w:proofErr w:type="gramStart"/>
             <w:r>
               <w:rPr>
                 <w:rFonts w:ascii="Courier New" w:hAnsi="Courier New" w:cs="Courier New"/>
@@ -15964,14 +15459,7 @@
               <w:rPr>
                 <w:rFonts w:ascii="Courier New" w:hAnsi="Courier New" w:cs="Courier New"/>
               </w:rPr>
-              <w:t>(</w:t>
-            </w:r>
-            <w:proofErr w:type="gramEnd"/>
-            <w:r>
-              <w:rPr>
-                <w:rFonts w:ascii="Courier New" w:hAnsi="Courier New" w:cs="Courier New"/>
-              </w:rPr>
-              <w:t>0, 10, 2)</w:t>
+              <w:t>(0, 10, 2)</w:t>
             </w:r>
           </w:p>
         </w:tc>
@@ -16056,7 +15544,6 @@
               </w:rPr>
             </w:pPr>
             <w:proofErr w:type="spellStart"/>
-            <w:proofErr w:type="gramStart"/>
             <w:r>
               <w:rPr>
                 <w:rFonts w:ascii="Courier New" w:hAnsi="Courier New" w:cs="Courier New"/>
@@ -16068,14 +15555,7 @@
               <w:rPr>
                 <w:rFonts w:ascii="Courier New" w:hAnsi="Courier New" w:cs="Courier New"/>
               </w:rPr>
-              <w:t>(</w:t>
-            </w:r>
-            <w:proofErr w:type="gramEnd"/>
-            <w:r>
-              <w:rPr>
-                <w:rFonts w:ascii="Courier New" w:hAnsi="Courier New" w:cs="Courier New"/>
-              </w:rPr>
-              <w:t xml:space="preserve">3 in </w:t>
+              <w:t xml:space="preserve">(3 in </w:t>
             </w:r>
             <w:proofErr w:type="spellStart"/>
             <w:r>
@@ -16112,7 +15592,6 @@
               </w:rPr>
             </w:pPr>
             <w:proofErr w:type="spellStart"/>
-            <w:proofErr w:type="gramStart"/>
             <w:r>
               <w:rPr>
                 <w:rFonts w:ascii="Courier New" w:hAnsi="Courier New" w:cs="Courier New"/>
@@ -16124,14 +15603,7 @@
               <w:rPr>
                 <w:rFonts w:ascii="Courier New" w:hAnsi="Courier New" w:cs="Courier New"/>
               </w:rPr>
-              <w:t>(</w:t>
-            </w:r>
-            <w:proofErr w:type="gramEnd"/>
-            <w:r>
-              <w:rPr>
-                <w:rFonts w:ascii="Courier New" w:hAnsi="Courier New" w:cs="Courier New"/>
-              </w:rPr>
-              <w:t xml:space="preserve">8 in </w:t>
+              <w:t xml:space="preserve">(8 in </w:t>
             </w:r>
             <w:proofErr w:type="spellStart"/>
             <w:r>
@@ -16384,7 +15856,6 @@
               <w:t xml:space="preserve">    </w:t>
             </w:r>
             <w:proofErr w:type="spellStart"/>
-            <w:proofErr w:type="gramStart"/>
             <w:r>
               <w:rPr>
                 <w:rFonts w:ascii="Courier New" w:hAnsi="Courier New" w:cs="Courier New"/>
@@ -16396,14 +15867,7 @@
               <w:rPr>
                 <w:rFonts w:ascii="Courier New" w:hAnsi="Courier New" w:cs="Courier New"/>
               </w:rPr>
-              <w:t>(</w:t>
-            </w:r>
-            <w:proofErr w:type="gramEnd"/>
-            <w:r>
-              <w:rPr>
-                <w:rFonts w:ascii="Courier New" w:hAnsi="Courier New" w:cs="Courier New"/>
-              </w:rPr>
-              <w:t>"</w:t>
+              <w:t>("</w:t>
             </w:r>
             <w:r>
               <w:rPr>
@@ -16451,7 +15915,6 @@
               <w:t xml:space="preserve">    </w:t>
             </w:r>
             <w:proofErr w:type="spellStart"/>
-            <w:proofErr w:type="gramStart"/>
             <w:r>
               <w:rPr>
                 <w:rFonts w:ascii="Courier New" w:hAnsi="Courier New" w:cs="Courier New"/>
@@ -16463,14 +15926,7 @@
               <w:rPr>
                 <w:rFonts w:ascii="Courier New" w:hAnsi="Courier New" w:cs="Courier New"/>
               </w:rPr>
-              <w:t>(</w:t>
-            </w:r>
-            <w:proofErr w:type="gramEnd"/>
-            <w:r>
-              <w:rPr>
-                <w:rFonts w:ascii="Courier New" w:hAnsi="Courier New" w:cs="Courier New"/>
-              </w:rPr>
-              <w:t>"Ich gehöre auch zu der Bedingung")</w:t>
+              <w:t>("Ich gehöre auch zu der Bedingung")</w:t>
             </w:r>
           </w:p>
         </w:tc>
@@ -16603,7 +16059,6 @@
               <w:t xml:space="preserve">    </w:t>
             </w:r>
             <w:proofErr w:type="spellStart"/>
-            <w:proofErr w:type="gramStart"/>
             <w:r>
               <w:rPr>
                 <w:rFonts w:ascii="Courier New" w:hAnsi="Courier New" w:cs="Courier New"/>
@@ -16615,14 +16070,7 @@
               <w:rPr>
                 <w:rFonts w:ascii="Courier New" w:hAnsi="Courier New" w:cs="Courier New"/>
               </w:rPr>
-              <w:t>(</w:t>
-            </w:r>
-            <w:proofErr w:type="gramEnd"/>
-            <w:r>
-              <w:rPr>
-                <w:rFonts w:ascii="Courier New" w:hAnsi="Courier New" w:cs="Courier New"/>
-              </w:rPr>
-              <w:t>"</w:t>
+              <w:t>("</w:t>
             </w:r>
             <w:r>
               <w:rPr>
@@ -16704,7 +16152,6 @@
               <w:t xml:space="preserve">    </w:t>
             </w:r>
             <w:proofErr w:type="spellStart"/>
-            <w:proofErr w:type="gramStart"/>
             <w:r>
               <w:rPr>
                 <w:rFonts w:ascii="Courier New" w:hAnsi="Courier New" w:cs="Courier New"/>
@@ -16716,14 +16163,7 @@
               <w:rPr>
                 <w:rFonts w:ascii="Courier New" w:hAnsi="Courier New" w:cs="Courier New"/>
               </w:rPr>
-              <w:t>(</w:t>
-            </w:r>
-            <w:proofErr w:type="gramEnd"/>
-            <w:r>
-              <w:rPr>
-                <w:rFonts w:ascii="Courier New" w:hAnsi="Courier New" w:cs="Courier New"/>
-              </w:rPr>
-              <w:t>"</w:t>
+              <w:t>("</w:t>
             </w:r>
             <w:r>
               <w:rPr>
@@ -16883,7 +16323,6 @@
               <w:t xml:space="preserve">    </w:t>
             </w:r>
             <w:proofErr w:type="spellStart"/>
-            <w:proofErr w:type="gramStart"/>
             <w:r>
               <w:rPr>
                 <w:rFonts w:ascii="Courier New" w:hAnsi="Courier New" w:cs="Courier New"/>
@@ -16895,14 +16334,7 @@
               <w:rPr>
                 <w:rFonts w:ascii="Courier New" w:hAnsi="Courier New" w:cs="Courier New"/>
               </w:rPr>
-              <w:t>(</w:t>
-            </w:r>
-            <w:proofErr w:type="gramEnd"/>
-            <w:r>
-              <w:rPr>
-                <w:rFonts w:ascii="Courier New" w:hAnsi="Courier New" w:cs="Courier New"/>
-              </w:rPr>
-              <w:t xml:space="preserve">"wert ist </w:t>
+              <w:t xml:space="preserve">("wert ist </w:t>
             </w:r>
             <w:r>
               <w:rPr>
@@ -16983,7 +16415,6 @@
               <w:t xml:space="preserve">    </w:t>
             </w:r>
             <w:proofErr w:type="spellStart"/>
-            <w:proofErr w:type="gramStart"/>
             <w:r>
               <w:rPr>
                 <w:rFonts w:ascii="Courier New" w:hAnsi="Courier New" w:cs="Courier New"/>
@@ -16995,14 +16426,7 @@
               <w:rPr>
                 <w:rFonts w:ascii="Courier New" w:hAnsi="Courier New" w:cs="Courier New"/>
               </w:rPr>
-              <w:t>(</w:t>
-            </w:r>
-            <w:proofErr w:type="gramEnd"/>
-            <w:r>
-              <w:rPr>
-                <w:rFonts w:ascii="Courier New" w:hAnsi="Courier New" w:cs="Courier New"/>
-              </w:rPr>
-              <w:t>"wert ist gleich 4")</w:t>
+              <w:t>("wert ist gleich 4")</w:t>
             </w:r>
           </w:p>
         </w:tc>
@@ -17065,7 +16489,6 @@
               <w:t xml:space="preserve">    </w:t>
             </w:r>
             <w:proofErr w:type="spellStart"/>
-            <w:proofErr w:type="gramStart"/>
             <w:r>
               <w:rPr>
                 <w:rFonts w:ascii="Courier New" w:hAnsi="Courier New" w:cs="Courier New"/>
@@ -17077,14 +16500,7 @@
               <w:rPr>
                 <w:rFonts w:ascii="Courier New" w:hAnsi="Courier New" w:cs="Courier New"/>
               </w:rPr>
-              <w:t>(</w:t>
-            </w:r>
-            <w:proofErr w:type="gramEnd"/>
-            <w:r>
-              <w:rPr>
-                <w:rFonts w:ascii="Courier New" w:hAnsi="Courier New" w:cs="Courier New"/>
-              </w:rPr>
-              <w:t>"wert ist gleich 5")</w:t>
+              <w:t>("wert ist gleich 5")</w:t>
             </w:r>
           </w:p>
         </w:tc>
@@ -17147,7 +16563,6 @@
               <w:t xml:space="preserve">    </w:t>
             </w:r>
             <w:proofErr w:type="spellStart"/>
-            <w:proofErr w:type="gramStart"/>
             <w:r>
               <w:rPr>
                 <w:rFonts w:ascii="Courier New" w:hAnsi="Courier New" w:cs="Courier New"/>
@@ -17159,14 +16574,7 @@
               <w:rPr>
                 <w:rFonts w:ascii="Courier New" w:hAnsi="Courier New" w:cs="Courier New"/>
               </w:rPr>
-              <w:t>(</w:t>
-            </w:r>
-            <w:proofErr w:type="gramEnd"/>
-            <w:r>
-              <w:rPr>
-                <w:rFonts w:ascii="Courier New" w:hAnsi="Courier New" w:cs="Courier New"/>
-              </w:rPr>
-              <w:t>"keine Bedingung ist erfüllt")</w:t>
+              <w:t>("keine Bedingung ist erfüllt")</w:t>
             </w:r>
           </w:p>
         </w:tc>
@@ -17905,7 +17313,6 @@
               </w:rPr>
             </w:pPr>
             <w:proofErr w:type="spellStart"/>
-            <w:proofErr w:type="gramStart"/>
             <w:r>
               <w:rPr>
                 <w:rFonts w:ascii="Courier New" w:hAnsi="Courier New" w:cs="Courier New"/>
@@ -17917,14 +17324,7 @@
               <w:rPr>
                 <w:rFonts w:ascii="Courier New" w:hAnsi="Courier New" w:cs="Courier New"/>
               </w:rPr>
-              <w:t>(</w:t>
-            </w:r>
-            <w:proofErr w:type="gramEnd"/>
-            <w:r>
-              <w:rPr>
-                <w:rFonts w:ascii="Courier New" w:hAnsi="Courier New" w:cs="Courier New"/>
-              </w:rPr>
-              <w:t>"nach der Schleife")</w:t>
+              <w:t>("nach der Schleife")</w:t>
             </w:r>
           </w:p>
         </w:tc>
@@ -18184,7 +17584,6 @@
               <w:t xml:space="preserve">    </w:t>
             </w:r>
             <w:proofErr w:type="spellStart"/>
-            <w:proofErr w:type="gramStart"/>
             <w:r>
               <w:rPr>
                 <w:rFonts w:ascii="Courier New" w:hAnsi="Courier New" w:cs="Courier New"/>
@@ -18196,14 +17595,7 @@
               <w:rPr>
                 <w:rFonts w:ascii="Courier New" w:hAnsi="Courier New" w:cs="Courier New"/>
               </w:rPr>
-              <w:t>(</w:t>
-            </w:r>
-            <w:proofErr w:type="gramEnd"/>
-            <w:r>
-              <w:rPr>
-                <w:rFonts w:ascii="Courier New" w:hAnsi="Courier New" w:cs="Courier New"/>
-              </w:rPr>
-              <w:t>"</w:t>
+              <w:t>("</w:t>
             </w:r>
             <w:proofErr w:type="spellStart"/>
             <w:r>
@@ -18412,7 +17804,6 @@
               </w:rPr>
             </w:pPr>
             <w:proofErr w:type="spellStart"/>
-            <w:proofErr w:type="gramStart"/>
             <w:r>
               <w:rPr>
                 <w:rFonts w:ascii="Courier New" w:hAnsi="Courier New" w:cs="Courier New"/>
@@ -18424,14 +17815,7 @@
               <w:rPr>
                 <w:rFonts w:ascii="Courier New" w:hAnsi="Courier New" w:cs="Courier New"/>
               </w:rPr>
-              <w:t>(</w:t>
-            </w:r>
-            <w:proofErr w:type="gramEnd"/>
-            <w:r>
-              <w:rPr>
-                <w:rFonts w:ascii="Courier New" w:hAnsi="Courier New" w:cs="Courier New"/>
-              </w:rPr>
-              <w:t>"Nach der Schleife")</w:t>
+              <w:t>("Nach der Schleife")</w:t>
             </w:r>
           </w:p>
         </w:tc>
@@ -18742,7 +18126,6 @@
               </w:rPr>
             </w:pPr>
             <w:proofErr w:type="spellStart"/>
-            <w:proofErr w:type="gramStart"/>
             <w:r>
               <w:rPr>
                 <w:rFonts w:ascii="Courier New" w:hAnsi="Courier New" w:cs="Courier New"/>
@@ -18754,14 +18137,7 @@
               <w:rPr>
                 <w:rFonts w:ascii="Courier New" w:hAnsi="Courier New" w:cs="Courier New"/>
               </w:rPr>
-              <w:t>(</w:t>
-            </w:r>
-            <w:proofErr w:type="gramEnd"/>
-            <w:r>
-              <w:rPr>
-                <w:rFonts w:ascii="Courier New" w:hAnsi="Courier New" w:cs="Courier New"/>
-              </w:rPr>
-              <w:t>"nach der Schleife")</w:t>
+              <w:t>("nach der Schleife")</w:t>
             </w:r>
           </w:p>
         </w:tc>
@@ -18959,7 +18335,6 @@
               <w:t xml:space="preserve"> in </w:t>
             </w:r>
             <w:proofErr w:type="spellStart"/>
-            <w:proofErr w:type="gramStart"/>
             <w:r>
               <w:rPr>
                 <w:rFonts w:ascii="Courier New" w:hAnsi="Courier New" w:cs="Courier New"/>
@@ -18971,14 +18346,7 @@
               <w:rPr>
                 <w:rFonts w:ascii="Courier New" w:hAnsi="Courier New" w:cs="Courier New"/>
               </w:rPr>
-              <w:t>(</w:t>
-            </w:r>
-            <w:proofErr w:type="gramEnd"/>
-            <w:r>
-              <w:rPr>
-                <w:rFonts w:ascii="Courier New" w:hAnsi="Courier New" w:cs="Courier New"/>
-              </w:rPr>
-              <w:t>10)</w:t>
+              <w:t>(10)</w:t>
             </w:r>
             <w:r>
               <w:rPr>
@@ -19067,7 +18435,6 @@
               </w:rPr>
             </w:pPr>
             <w:proofErr w:type="spellStart"/>
-            <w:proofErr w:type="gramStart"/>
             <w:r>
               <w:rPr>
                 <w:rFonts w:ascii="Courier New" w:hAnsi="Courier New" w:cs="Courier New"/>
@@ -19079,14 +18446,7 @@
               <w:rPr>
                 <w:rFonts w:ascii="Courier New" w:hAnsi="Courier New" w:cs="Courier New"/>
               </w:rPr>
-              <w:t>(</w:t>
-            </w:r>
-            <w:proofErr w:type="gramEnd"/>
-            <w:r>
-              <w:rPr>
-                <w:rFonts w:ascii="Courier New" w:hAnsi="Courier New" w:cs="Courier New"/>
-              </w:rPr>
-              <w:t>"nach der Schleife")</w:t>
+              <w:t>("nach der Schleife")</w:t>
             </w:r>
           </w:p>
         </w:tc>
@@ -19473,18 +18833,8 @@
           <w:sz w:val="20"/>
           <w:szCs w:val="20"/>
         </w:rPr>
-        <w:t>)</w:t>
-      </w:r>
-      <w:proofErr w:type="gramStart"/>
-      <w:r>
-        <w:rPr>
-          <w:rFonts w:ascii="Courier New" w:hAnsi="Courier New" w:cs="Courier New"/>
-          <w:sz w:val="20"/>
-          <w:szCs w:val="20"/>
-        </w:rPr>
-        <w:t>?  "</w:t>
-      </w:r>
-      <w:proofErr w:type="gramEnd"/>
+        <w:t>)?  "</w:t>
+      </w:r>
     </w:p>
     <w:p>
       <w:pPr>
@@ -19504,17 +18854,12 @@
         <w:t xml:space="preserve">Tipp: Die Funktion </w:t>
       </w:r>
       <w:proofErr w:type="spellStart"/>
-      <w:proofErr w:type="gramStart"/>
       <w:r>
         <w:t>max</w:t>
       </w:r>
       <w:proofErr w:type="spellEnd"/>
       <w:r>
-        <w:t>(</w:t>
-      </w:r>
-      <w:proofErr w:type="gramEnd"/>
-      <w:r>
-        <w:t>arg1, arg2) gibt das größte Argument zurück.</w:t>
+        <w:t>(arg1, arg2) gibt das größte Argument zurück.</w:t>
       </w:r>
     </w:p>
     <w:p>
@@ -19535,15 +18880,7 @@
       </w:r>
       <w:r>
         <w:br/>
-        <w:t xml:space="preserve">Tipp: Die Funktion </w:t>
-      </w:r>
-      <w:proofErr w:type="gramStart"/>
-      <w:r>
-        <w:t>min(</w:t>
-      </w:r>
-      <w:proofErr w:type="gramEnd"/>
-      <w:r>
-        <w:t>arg1, arg2) gibt das kleinste Argument zurück.</w:t>
+        <w:t>Tipp: Die Funktion min(arg1, arg2) gibt das kleinste Argument zurück.</w:t>
       </w:r>
     </w:p>
     <w:p>
@@ -19646,30 +18983,8 @@
                               <w:rPr>
                                 <w:rFonts w:ascii="Courier New" w:hAnsi="Courier New" w:cs="Courier New"/>
                               </w:rPr>
-                              <w:t xml:space="preserve">Denke dir eine Zahl </w:t>
+                              <w:t>Denke dir eine Zahl zwischen  1  und  100</w:t>
                             </w:r>
-                            <w:proofErr w:type="gramStart"/>
-                            <w:r>
-                              <w:rPr>
-                                <w:rFonts w:ascii="Courier New" w:hAnsi="Courier New" w:cs="Courier New"/>
-                              </w:rPr>
-                              <w:t>zwischen  1</w:t>
-                            </w:r>
-                            <w:proofErr w:type="gramEnd"/>
-                            <w:r>
-                              <w:rPr>
-                                <w:rFonts w:ascii="Courier New" w:hAnsi="Courier New" w:cs="Courier New"/>
-                              </w:rPr>
-                              <w:t xml:space="preserve">  </w:t>
-                            </w:r>
-                            <w:proofErr w:type="gramStart"/>
-                            <w:r>
-                              <w:rPr>
-                                <w:rFonts w:ascii="Courier New" w:hAnsi="Courier New" w:cs="Courier New"/>
-                              </w:rPr>
-                              <w:t>und  100</w:t>
-                            </w:r>
-                            <w:proofErr w:type="gramEnd"/>
                           </w:p>
                           <w:p>
                             <w:pPr>
@@ -19694,16 +19009,8 @@
                               <w:rPr>
                                 <w:rFonts w:ascii="Courier New" w:hAnsi="Courier New" w:cs="Courier New"/>
                               </w:rPr>
-                              <w:t xml:space="preserve">Der Computer </w:t>
+                              <w:t>Der Computer rät  50</w:t>
                             </w:r>
-                            <w:proofErr w:type="gramStart"/>
-                            <w:r>
-                              <w:rPr>
-                                <w:rFonts w:ascii="Courier New" w:hAnsi="Courier New" w:cs="Courier New"/>
-                              </w:rPr>
-                              <w:t>rät  50</w:t>
-                            </w:r>
-                            <w:proofErr w:type="gramEnd"/>
                           </w:p>
                           <w:p>
                             <w:pPr>
@@ -19770,16 +19077,8 @@
                               <w:rPr>
                                 <w:rFonts w:ascii="Courier New" w:hAnsi="Courier New" w:cs="Courier New"/>
                               </w:rPr>
-                              <w:t xml:space="preserve">Der Computer </w:t>
+                              <w:t>Der Computer rät  75</w:t>
                             </w:r>
-                            <w:proofErr w:type="gramStart"/>
-                            <w:r>
-                              <w:rPr>
-                                <w:rFonts w:ascii="Courier New" w:hAnsi="Courier New" w:cs="Courier New"/>
-                              </w:rPr>
-                              <w:t>rät  75</w:t>
-                            </w:r>
-                            <w:proofErr w:type="gramEnd"/>
                           </w:p>
                           <w:p>
                             <w:pPr>
@@ -19846,16 +19145,8 @@
                               <w:rPr>
                                 <w:rFonts w:ascii="Courier New" w:hAnsi="Courier New" w:cs="Courier New"/>
                               </w:rPr>
-                              <w:t xml:space="preserve">Der Computer </w:t>
+                              <w:t>Der Computer rät  88</w:t>
                             </w:r>
-                            <w:proofErr w:type="gramStart"/>
-                            <w:r>
-                              <w:rPr>
-                                <w:rFonts w:ascii="Courier New" w:hAnsi="Courier New" w:cs="Courier New"/>
-                              </w:rPr>
-                              <w:t>rät  88</w:t>
-                            </w:r>
-                            <w:proofErr w:type="gramEnd"/>
                           </w:p>
                           <w:p>
                             <w:pPr>
@@ -19922,16 +19213,8 @@
                               <w:rPr>
                                 <w:rFonts w:ascii="Courier New" w:hAnsi="Courier New" w:cs="Courier New"/>
                               </w:rPr>
-                              <w:t xml:space="preserve">Der Computer </w:t>
+                              <w:t>Der Computer rät  81</w:t>
                             </w:r>
-                            <w:proofErr w:type="gramStart"/>
-                            <w:r>
-                              <w:rPr>
-                                <w:rFonts w:ascii="Courier New" w:hAnsi="Courier New" w:cs="Courier New"/>
-                              </w:rPr>
-                              <w:t>rät  81</w:t>
-                            </w:r>
-                            <w:proofErr w:type="gramEnd"/>
                           </w:p>
                           <w:p>
                             <w:pPr>
@@ -19998,16 +19281,8 @@
                               <w:rPr>
                                 <w:rFonts w:ascii="Courier New" w:hAnsi="Courier New" w:cs="Courier New"/>
                               </w:rPr>
-                              <w:t xml:space="preserve">Der Computer </w:t>
+                              <w:t>Der Computer rät  78</w:t>
                             </w:r>
-                            <w:proofErr w:type="gramStart"/>
-                            <w:r>
-                              <w:rPr>
-                                <w:rFonts w:ascii="Courier New" w:hAnsi="Courier New" w:cs="Courier New"/>
-                              </w:rPr>
-                              <w:t>rät  78</w:t>
-                            </w:r>
-                            <w:proofErr w:type="gramEnd"/>
                           </w:p>
                           <w:p>
                             <w:pPr>
@@ -20074,16 +19349,8 @@
                               <w:rPr>
                                 <w:rFonts w:ascii="Courier New" w:hAnsi="Courier New" w:cs="Courier New"/>
                               </w:rPr>
-                              <w:t xml:space="preserve">Der Computer </w:t>
+                              <w:t>Der Computer rät  76</w:t>
                             </w:r>
-                            <w:proofErr w:type="gramStart"/>
-                            <w:r>
-                              <w:rPr>
-                                <w:rFonts w:ascii="Courier New" w:hAnsi="Courier New" w:cs="Courier New"/>
-                              </w:rPr>
-                              <w:t>rät  76</w:t>
-                            </w:r>
-                            <w:proofErr w:type="gramEnd"/>
                           </w:p>
                           <w:p>
                             <w:pPr>
@@ -20192,30 +19459,8 @@
                         <w:rPr>
                           <w:rFonts w:ascii="Courier New" w:hAnsi="Courier New" w:cs="Courier New"/>
                         </w:rPr>
-                        <w:t xml:space="preserve">Denke dir eine Zahl </w:t>
+                        <w:t>Denke dir eine Zahl zwischen  1  und  100</w:t>
                       </w:r>
-                      <w:proofErr w:type="gramStart"/>
-                      <w:r>
-                        <w:rPr>
-                          <w:rFonts w:ascii="Courier New" w:hAnsi="Courier New" w:cs="Courier New"/>
-                        </w:rPr>
-                        <w:t>zwischen  1</w:t>
-                      </w:r>
-                      <w:proofErr w:type="gramEnd"/>
-                      <w:r>
-                        <w:rPr>
-                          <w:rFonts w:ascii="Courier New" w:hAnsi="Courier New" w:cs="Courier New"/>
-                        </w:rPr>
-                        <w:t xml:space="preserve">  </w:t>
-                      </w:r>
-                      <w:proofErr w:type="gramStart"/>
-                      <w:r>
-                        <w:rPr>
-                          <w:rFonts w:ascii="Courier New" w:hAnsi="Courier New" w:cs="Courier New"/>
-                        </w:rPr>
-                        <w:t>und  100</w:t>
-                      </w:r>
-                      <w:proofErr w:type="gramEnd"/>
                     </w:p>
                     <w:p>
                       <w:pPr>
@@ -20240,16 +19485,8 @@
                         <w:rPr>
                           <w:rFonts w:ascii="Courier New" w:hAnsi="Courier New" w:cs="Courier New"/>
                         </w:rPr>
-                        <w:t xml:space="preserve">Der Computer </w:t>
+                        <w:t>Der Computer rät  50</w:t>
                       </w:r>
-                      <w:proofErr w:type="gramStart"/>
-                      <w:r>
-                        <w:rPr>
-                          <w:rFonts w:ascii="Courier New" w:hAnsi="Courier New" w:cs="Courier New"/>
-                        </w:rPr>
-                        <w:t>rät  50</w:t>
-                      </w:r>
-                      <w:proofErr w:type="gramEnd"/>
                     </w:p>
                     <w:p>
                       <w:pPr>
@@ -20316,16 +19553,8 @@
                         <w:rPr>
                           <w:rFonts w:ascii="Courier New" w:hAnsi="Courier New" w:cs="Courier New"/>
                         </w:rPr>
-                        <w:t xml:space="preserve">Der Computer </w:t>
+                        <w:t>Der Computer rät  75</w:t>
                       </w:r>
-                      <w:proofErr w:type="gramStart"/>
-                      <w:r>
-                        <w:rPr>
-                          <w:rFonts w:ascii="Courier New" w:hAnsi="Courier New" w:cs="Courier New"/>
-                        </w:rPr>
-                        <w:t>rät  75</w:t>
-                      </w:r>
-                      <w:proofErr w:type="gramEnd"/>
                     </w:p>
                     <w:p>
                       <w:pPr>
@@ -20392,16 +19621,8 @@
                         <w:rPr>
                           <w:rFonts w:ascii="Courier New" w:hAnsi="Courier New" w:cs="Courier New"/>
                         </w:rPr>
-                        <w:t xml:space="preserve">Der Computer </w:t>
+                        <w:t>Der Computer rät  88</w:t>
                       </w:r>
-                      <w:proofErr w:type="gramStart"/>
-                      <w:r>
-                        <w:rPr>
-                          <w:rFonts w:ascii="Courier New" w:hAnsi="Courier New" w:cs="Courier New"/>
-                        </w:rPr>
-                        <w:t>rät  88</w:t>
-                      </w:r>
-                      <w:proofErr w:type="gramEnd"/>
                     </w:p>
                     <w:p>
                       <w:pPr>
@@ -20468,16 +19689,8 @@
                         <w:rPr>
                           <w:rFonts w:ascii="Courier New" w:hAnsi="Courier New" w:cs="Courier New"/>
                         </w:rPr>
-                        <w:t xml:space="preserve">Der Computer </w:t>
+                        <w:t>Der Computer rät  81</w:t>
                       </w:r>
-                      <w:proofErr w:type="gramStart"/>
-                      <w:r>
-                        <w:rPr>
-                          <w:rFonts w:ascii="Courier New" w:hAnsi="Courier New" w:cs="Courier New"/>
-                        </w:rPr>
-                        <w:t>rät  81</w:t>
-                      </w:r>
-                      <w:proofErr w:type="gramEnd"/>
                     </w:p>
                     <w:p>
                       <w:pPr>
@@ -20544,16 +19757,8 @@
                         <w:rPr>
                           <w:rFonts w:ascii="Courier New" w:hAnsi="Courier New" w:cs="Courier New"/>
                         </w:rPr>
-                        <w:t xml:space="preserve">Der Computer </w:t>
+                        <w:t>Der Computer rät  78</w:t>
                       </w:r>
-                      <w:proofErr w:type="gramStart"/>
-                      <w:r>
-                        <w:rPr>
-                          <w:rFonts w:ascii="Courier New" w:hAnsi="Courier New" w:cs="Courier New"/>
-                        </w:rPr>
-                        <w:t>rät  78</w:t>
-                      </w:r>
-                      <w:proofErr w:type="gramEnd"/>
                     </w:p>
                     <w:p>
                       <w:pPr>
@@ -20620,16 +19825,8 @@
                         <w:rPr>
                           <w:rFonts w:ascii="Courier New" w:hAnsi="Courier New" w:cs="Courier New"/>
                         </w:rPr>
-                        <w:t xml:space="preserve">Der Computer </w:t>
+                        <w:t>Der Computer rät  76</w:t>
                       </w:r>
-                      <w:proofErr w:type="gramStart"/>
-                      <w:r>
-                        <w:rPr>
-                          <w:rFonts w:ascii="Courier New" w:hAnsi="Courier New" w:cs="Courier New"/>
-                        </w:rPr>
-                        <w:t>rät  76</w:t>
-                      </w:r>
-                      <w:proofErr w:type="gramEnd"/>
                     </w:p>
                     <w:p>
                       <w:pPr>
@@ -20741,25 +19938,7 @@
           <w:sz w:val="20"/>
           <w:szCs w:val="20"/>
         </w:rPr>
-        <w:t xml:space="preserve">x = (untere + </w:t>
-      </w:r>
-      <w:proofErr w:type="gramStart"/>
-      <w:r>
-        <w:rPr>
-          <w:rFonts w:ascii="Courier New" w:hAnsi="Courier New" w:cs="Courier New"/>
-          <w:sz w:val="20"/>
-          <w:szCs w:val="20"/>
-        </w:rPr>
-        <w:t>obere)/</w:t>
-      </w:r>
-      <w:proofErr w:type="gramEnd"/>
-      <w:r>
-        <w:rPr>
-          <w:rFonts w:ascii="Courier New" w:hAnsi="Courier New" w:cs="Courier New"/>
-          <w:sz w:val="20"/>
-          <w:szCs w:val="20"/>
-        </w:rPr>
-        <w:t>/2</w:t>
+        <w:t>x = (untere + obere)//2</w:t>
       </w:r>
       <w:r>
         <w:t xml:space="preserve"> rät der Computer die </w:t>
@@ -22039,7 +21218,6 @@
               <w:t xml:space="preserve"> </w:t>
             </w:r>
             <w:proofErr w:type="spellStart"/>
-            <w:proofErr w:type="gramStart"/>
             <w:r>
               <w:rPr>
                 <w:rFonts w:ascii="Courier New" w:hAnsi="Courier New" w:cs="Courier New"/>
@@ -22051,14 +21229,7 @@
               <w:rPr>
                 <w:rFonts w:ascii="Courier New" w:hAnsi="Courier New" w:cs="Courier New"/>
               </w:rPr>
-              <w:t>(</w:t>
-            </w:r>
-            <w:proofErr w:type="gramEnd"/>
-            <w:r>
-              <w:rPr>
-                <w:rFonts w:ascii="Courier New" w:hAnsi="Courier New" w:cs="Courier New"/>
-              </w:rPr>
-              <w:t>):</w:t>
+              <w:t>():</w:t>
             </w:r>
           </w:p>
         </w:tc>
@@ -22087,7 +21258,6 @@
               <w:t xml:space="preserve">    </w:t>
             </w:r>
             <w:proofErr w:type="spellStart"/>
-            <w:proofErr w:type="gramStart"/>
             <w:r>
               <w:rPr>
                 <w:rFonts w:ascii="Courier New" w:hAnsi="Courier New" w:cs="Courier New"/>
@@ -22099,14 +21269,7 @@
               <w:rPr>
                 <w:rFonts w:ascii="Courier New" w:hAnsi="Courier New" w:cs="Courier New"/>
               </w:rPr>
-              <w:t>(</w:t>
-            </w:r>
-            <w:proofErr w:type="gramEnd"/>
-            <w:r>
-              <w:rPr>
-                <w:rFonts w:ascii="Courier New" w:hAnsi="Courier New" w:cs="Courier New"/>
-              </w:rPr>
-              <w:t>"</w:t>
+              <w:t>("</w:t>
             </w:r>
             <w:r>
               <w:rPr>
@@ -22167,7 +21330,6 @@
               </w:rPr>
             </w:pPr>
             <w:proofErr w:type="spellStart"/>
-            <w:proofErr w:type="gramStart"/>
             <w:r>
               <w:rPr>
                 <w:rFonts w:ascii="Courier New" w:hAnsi="Courier New" w:cs="Courier New"/>
@@ -22179,14 +21341,7 @@
               <w:rPr>
                 <w:rFonts w:ascii="Courier New" w:hAnsi="Courier New" w:cs="Courier New"/>
               </w:rPr>
-              <w:t>(</w:t>
-            </w:r>
-            <w:proofErr w:type="gramEnd"/>
-            <w:r>
-              <w:rPr>
-                <w:rFonts w:ascii="Courier New" w:hAnsi="Courier New" w:cs="Courier New"/>
-              </w:rPr>
-              <w:t>)</w:t>
+              <w:t>()</w:t>
             </w:r>
           </w:p>
         </w:tc>
@@ -22352,14 +21507,7 @@
               <w:rPr>
                 <w:rFonts w:ascii="Courier New" w:hAnsi="Courier New" w:cs="Courier New"/>
               </w:rPr>
-              <w:t>2</w:t>
-            </w:r>
-            <w:proofErr w:type="gramStart"/>
-            <w:r>
-              <w:rPr>
-                <w:rFonts w:ascii="Courier New" w:hAnsi="Courier New" w:cs="Courier New"/>
-              </w:rPr>
-              <w:t>a</w:t>
+              <w:t>2a</w:t>
             </w:r>
             <w:r>
               <w:rPr>
@@ -22367,7 +21515,6 @@
               </w:rPr>
               <w:t>(</w:t>
             </w:r>
-            <w:proofErr w:type="gramEnd"/>
             <w:r>
               <w:rPr>
                 <w:rFonts w:ascii="Courier New" w:hAnsi="Courier New" w:cs="Courier New"/>
@@ -22429,7 +21576,6 @@
               <w:t xml:space="preserve">    </w:t>
             </w:r>
             <w:proofErr w:type="spellStart"/>
-            <w:proofErr w:type="gramStart"/>
             <w:r>
               <w:rPr>
                 <w:rFonts w:ascii="Courier New" w:hAnsi="Courier New" w:cs="Courier New"/>
@@ -22441,14 +21587,7 @@
               <w:rPr>
                 <w:rFonts w:ascii="Courier New" w:hAnsi="Courier New" w:cs="Courier New"/>
               </w:rPr>
-              <w:t>(</w:t>
-            </w:r>
-            <w:proofErr w:type="gramEnd"/>
-            <w:r>
-              <w:rPr>
-                <w:rFonts w:ascii="Courier New" w:hAnsi="Courier New" w:cs="Courier New"/>
-              </w:rPr>
-              <w:t>"</w:t>
+              <w:t>("</w:t>
             </w:r>
             <w:r>
               <w:rPr>
@@ -22542,14 +21681,7 @@
               <w:rPr>
                 <w:rFonts w:ascii="Courier New" w:hAnsi="Courier New" w:cs="Courier New"/>
               </w:rPr>
-              <w:t>2</w:t>
-            </w:r>
-            <w:proofErr w:type="gramStart"/>
-            <w:r>
-              <w:rPr>
-                <w:rFonts w:ascii="Courier New" w:hAnsi="Courier New" w:cs="Courier New"/>
-              </w:rPr>
-              <w:t>a</w:t>
+              <w:t>2a</w:t>
             </w:r>
             <w:r>
               <w:rPr>
@@ -22557,7 +21689,6 @@
               </w:rPr>
               <w:t>(</w:t>
             </w:r>
-            <w:proofErr w:type="gramEnd"/>
             <w:r>
               <w:rPr>
                 <w:rFonts w:ascii="Courier New" w:hAnsi="Courier New" w:cs="Courier New"/>
@@ -22703,21 +21834,7 @@
               <w:rPr>
                 <w:rFonts w:ascii="Courier New" w:hAnsi="Courier New" w:cs="Courier New"/>
               </w:rPr>
-              <w:t xml:space="preserve"> ausgabe2</w:t>
-            </w:r>
-            <w:proofErr w:type="gramStart"/>
-            <w:r>
-              <w:rPr>
-                <w:rFonts w:ascii="Courier New" w:hAnsi="Courier New" w:cs="Courier New"/>
-              </w:rPr>
-              <w:t>b(</w:t>
-            </w:r>
-            <w:proofErr w:type="gramEnd"/>
-            <w:r>
-              <w:rPr>
-                <w:rFonts w:ascii="Courier New" w:hAnsi="Courier New" w:cs="Courier New"/>
-              </w:rPr>
-              <w:t xml:space="preserve">wert1: </w:t>
+              <w:t xml:space="preserve"> ausgabe2b(wert1: </w:t>
             </w:r>
             <w:proofErr w:type="spellStart"/>
             <w:r>
@@ -22774,7 +21891,6 @@
               <w:t xml:space="preserve">    </w:t>
             </w:r>
             <w:proofErr w:type="spellStart"/>
-            <w:proofErr w:type="gramStart"/>
             <w:r>
               <w:rPr>
                 <w:rFonts w:ascii="Courier New" w:hAnsi="Courier New" w:cs="Courier New"/>
@@ -22786,14 +21902,7 @@
               <w:rPr>
                 <w:rFonts w:ascii="Courier New" w:hAnsi="Courier New" w:cs="Courier New"/>
               </w:rPr>
-              <w:t>(</w:t>
-            </w:r>
-            <w:proofErr w:type="gramEnd"/>
-            <w:r>
-              <w:rPr>
-                <w:rFonts w:ascii="Courier New" w:hAnsi="Courier New" w:cs="Courier New"/>
-              </w:rPr>
-              <w:t>"wert1 =", wert1, "wert2 =", wert2)</w:t>
+              <w:t>("wert1 =", wert1, "wert2 =", wert2)</w:t>
             </w:r>
           </w:p>
         </w:tc>
@@ -22845,21 +21954,7 @@
               <w:rPr>
                 <w:rFonts w:ascii="Courier New" w:hAnsi="Courier New" w:cs="Courier New"/>
               </w:rPr>
-              <w:t>ausgabe2</w:t>
-            </w:r>
-            <w:proofErr w:type="gramStart"/>
-            <w:r>
-              <w:rPr>
-                <w:rFonts w:ascii="Courier New" w:hAnsi="Courier New" w:cs="Courier New"/>
-              </w:rPr>
-              <w:t>b(</w:t>
-            </w:r>
-            <w:proofErr w:type="gramEnd"/>
-            <w:r>
-              <w:rPr>
-                <w:rFonts w:ascii="Courier New" w:hAnsi="Courier New" w:cs="Courier New"/>
-              </w:rPr>
-              <w:t>5)</w:t>
+              <w:t>ausgabe2b(5)</w:t>
             </w:r>
           </w:p>
         </w:tc>
@@ -22997,21 +22092,7 @@
               <w:rPr>
                 <w:rFonts w:ascii="Courier New" w:hAnsi="Courier New" w:cs="Courier New"/>
               </w:rPr>
-              <w:t xml:space="preserve"> </w:t>
-            </w:r>
-            <w:proofErr w:type="gramStart"/>
-            <w:r>
-              <w:rPr>
-                <w:rFonts w:ascii="Courier New" w:hAnsi="Courier New" w:cs="Courier New"/>
-              </w:rPr>
-              <w:t>verdoppeln(</w:t>
-            </w:r>
-            <w:proofErr w:type="gramEnd"/>
-            <w:r>
-              <w:rPr>
-                <w:rFonts w:ascii="Courier New" w:hAnsi="Courier New" w:cs="Courier New"/>
-              </w:rPr>
-              <w:t xml:space="preserve">wert: </w:t>
+              <w:t xml:space="preserve"> verdoppeln(wert: </w:t>
             </w:r>
             <w:proofErr w:type="spellStart"/>
             <w:r>
@@ -23141,7 +22222,6 @@
               </w:rPr>
               <w:t xml:space="preserve"> = </w:t>
             </w:r>
-            <w:proofErr w:type="gramStart"/>
             <w:r>
               <w:rPr>
                 <w:rFonts w:ascii="Courier New" w:hAnsi="Courier New" w:cs="Courier New"/>
@@ -23152,14 +22232,7 @@
               <w:rPr>
                 <w:rFonts w:ascii="Courier New" w:hAnsi="Courier New" w:cs="Courier New"/>
               </w:rPr>
-              <w:t>(</w:t>
-            </w:r>
-            <w:proofErr w:type="gramEnd"/>
-            <w:r>
-              <w:rPr>
-                <w:rFonts w:ascii="Courier New" w:hAnsi="Courier New" w:cs="Courier New"/>
-              </w:rPr>
-              <w:t>5)</w:t>
+              <w:t>(5)</w:t>
             </w:r>
           </w:p>
         </w:tc>
@@ -23182,7 +22255,6 @@
               </w:rPr>
             </w:pPr>
             <w:proofErr w:type="spellStart"/>
-            <w:proofErr w:type="gramStart"/>
             <w:r>
               <w:rPr>
                 <w:rFonts w:ascii="Courier New" w:hAnsi="Courier New" w:cs="Courier New"/>
@@ -23196,7 +22268,6 @@
               </w:rPr>
               <w:t>(</w:t>
             </w:r>
-            <w:proofErr w:type="gramEnd"/>
             <w:r>
               <w:rPr>
                 <w:rFonts w:ascii="Courier New" w:hAnsi="Courier New" w:cs="Courier New"/>
@@ -23714,31 +22785,16 @@
               <w:rPr>
                 <w:rFonts w:ascii="Courier New" w:hAnsi="Courier New" w:cs="Courier New"/>
               </w:rPr>
-              <w:t>wo_bin_</w:t>
-            </w:r>
-            <w:proofErr w:type="gramStart"/>
-            <w:r>
-              <w:rPr>
-                <w:rFonts w:ascii="Courier New" w:hAnsi="Courier New" w:cs="Courier New"/>
-              </w:rPr>
-              <w:t>ich</w:t>
+              <w:t>wo_bin_ich</w:t>
             </w:r>
             <w:proofErr w:type="spellEnd"/>
             <w:r>
               <w:rPr>
                 <w:rFonts w:ascii="Courier New" w:hAnsi="Courier New" w:cs="Courier New"/>
               </w:rPr>
-              <w:t>(</w:t>
-            </w:r>
-            <w:proofErr w:type="gramEnd"/>
-            <w:r>
-              <w:rPr>
-                <w:rFonts w:ascii="Courier New" w:hAnsi="Courier New" w:cs="Courier New"/>
-              </w:rPr>
-              <w:t xml:space="preserve">) -&gt; </w:t>
+              <w:t xml:space="preserve">() -&gt; </w:t>
             </w:r>
             <w:proofErr w:type="spellStart"/>
-            <w:proofErr w:type="gramStart"/>
             <w:r>
               <w:rPr>
                 <w:rFonts w:ascii="Courier New" w:hAnsi="Courier New" w:cs="Courier New"/>
@@ -23753,7 +22809,6 @@
               <w:t>[</w:t>
             </w:r>
             <w:proofErr w:type="spellStart"/>
-            <w:proofErr w:type="gramEnd"/>
             <w:r>
               <w:rPr>
                 <w:rFonts w:ascii="Courier New" w:hAnsi="Courier New" w:cs="Courier New"/>
@@ -23936,28 +22991,14 @@
               <w:rPr>
                 <w:rFonts w:ascii="Courier New" w:hAnsi="Courier New" w:cs="Courier New"/>
               </w:rPr>
-              <w:t>wo_bin_</w:t>
-            </w:r>
-            <w:proofErr w:type="gramStart"/>
-            <w:r>
-              <w:rPr>
-                <w:rFonts w:ascii="Courier New" w:hAnsi="Courier New" w:cs="Courier New"/>
-              </w:rPr>
-              <w:t>ich</w:t>
+              <w:t>wo_bin_ich</w:t>
             </w:r>
             <w:proofErr w:type="spellEnd"/>
             <w:r>
               <w:rPr>
                 <w:rFonts w:ascii="Courier New" w:hAnsi="Courier New" w:cs="Courier New"/>
               </w:rPr>
-              <w:t>(</w:t>
-            </w:r>
-            <w:proofErr w:type="gramEnd"/>
-            <w:r>
-              <w:rPr>
-                <w:rFonts w:ascii="Courier New" w:hAnsi="Courier New" w:cs="Courier New"/>
-              </w:rPr>
-              <w:t>)</w:t>
+              <w:t>()</w:t>
             </w:r>
           </w:p>
         </w:tc>
@@ -23980,7 +23021,6 @@
               </w:rPr>
             </w:pPr>
             <w:proofErr w:type="spellStart"/>
-            <w:proofErr w:type="gramStart"/>
             <w:r>
               <w:rPr>
                 <w:rFonts w:ascii="Courier New" w:hAnsi="Courier New" w:cs="Courier New"/>
@@ -23992,14 +23032,7 @@
               <w:rPr>
                 <w:rFonts w:ascii="Courier New" w:hAnsi="Courier New" w:cs="Courier New"/>
               </w:rPr>
-              <w:t>(</w:t>
-            </w:r>
-            <w:proofErr w:type="gramEnd"/>
-            <w:r>
-              <w:rPr>
-                <w:rFonts w:ascii="Courier New" w:hAnsi="Courier New" w:cs="Courier New"/>
-              </w:rPr>
-              <w:t>"x =", x, "y =", y)</w:t>
+              <w:t>("x =", x, "y =", y)</w:t>
             </w:r>
           </w:p>
         </w:tc>
@@ -24541,7 +23574,6 @@
               <w:t xml:space="preserve"> </w:t>
             </w:r>
             <w:proofErr w:type="spellStart"/>
-            <w:proofErr w:type="gramStart"/>
             <w:r>
               <w:rPr>
                 <w:rFonts w:ascii="Courier New" w:hAnsi="Courier New" w:cs="Courier New"/>
@@ -24555,7 +23587,6 @@
               </w:rPr>
               <w:t>(</w:t>
             </w:r>
-            <w:proofErr w:type="gramEnd"/>
             <w:r>
               <w:rPr>
                 <w:rFonts w:ascii="Courier New" w:hAnsi="Courier New" w:cs="Courier New"/>
@@ -24596,7 +23627,6 @@
               </w:rPr>
               <w:t xml:space="preserve">], </w:t>
             </w:r>
-            <w:proofErr w:type="gramStart"/>
             <w:r>
               <w:rPr>
                 <w:rFonts w:ascii="Courier New" w:hAnsi="Courier New" w:cs="Courier New"/>
@@ -24609,7 +23639,6 @@
               </w:rPr>
               <w:t>:[</w:t>
             </w:r>
-            <w:proofErr w:type="gramEnd"/>
             <w:r>
               <w:rPr>
                 <w:rFonts w:ascii="Courier New" w:hAnsi="Courier New" w:cs="Courier New"/>
@@ -24922,7 +23951,6 @@
               <w:t xml:space="preserve"> = </w:t>
             </w:r>
             <w:proofErr w:type="spellStart"/>
-            <w:proofErr w:type="gramStart"/>
             <w:r>
               <w:rPr>
                 <w:rFonts w:ascii="Courier New" w:hAnsi="Courier New" w:cs="Courier New"/>
@@ -24930,7 +23958,6 @@
               <w:t>original.copy</w:t>
             </w:r>
             <w:proofErr w:type="spellEnd"/>
-            <w:proofErr w:type="gramEnd"/>
             <w:r>
               <w:rPr>
                 <w:rFonts w:ascii="Courier New" w:hAnsi="Courier New" w:cs="Courier New"/>
@@ -25036,7 +24063,6 @@
               </w:rPr>
             </w:pPr>
             <w:proofErr w:type="spellStart"/>
-            <w:proofErr w:type="gramStart"/>
             <w:r>
               <w:rPr>
                 <w:rFonts w:ascii="Courier New" w:hAnsi="Courier New" w:cs="Courier New"/>
@@ -25051,7 +24077,6 @@
               <w:t>(</w:t>
             </w:r>
             <w:proofErr w:type="spellStart"/>
-            <w:proofErr w:type="gramEnd"/>
             <w:r>
               <w:rPr>
                 <w:rFonts w:ascii="Courier New" w:hAnsi="Courier New" w:cs="Courier New"/>
@@ -25112,7 +24137,6 @@
               </w:rPr>
             </w:pPr>
             <w:proofErr w:type="spellStart"/>
-            <w:proofErr w:type="gramStart"/>
             <w:r>
               <w:rPr>
                 <w:rFonts w:ascii="Courier New" w:hAnsi="Courier New" w:cs="Courier New"/>
@@ -25124,14 +24148,7 @@
               <w:rPr>
                 <w:rFonts w:ascii="Courier New" w:hAnsi="Courier New" w:cs="Courier New"/>
               </w:rPr>
-              <w:t>(</w:t>
-            </w:r>
-            <w:proofErr w:type="gramEnd"/>
-            <w:r>
-              <w:rPr>
-                <w:rFonts w:ascii="Courier New" w:hAnsi="Courier New" w:cs="Courier New"/>
-              </w:rPr>
-              <w:t>"original =", original)</w:t>
+              <w:t>("original =", original)</w:t>
             </w:r>
           </w:p>
         </w:tc>
@@ -25154,7 +24171,6 @@
               </w:rPr>
             </w:pPr>
             <w:proofErr w:type="spellStart"/>
-            <w:proofErr w:type="gramStart"/>
             <w:r>
               <w:rPr>
                 <w:rFonts w:ascii="Courier New" w:hAnsi="Courier New" w:cs="Courier New"/>
@@ -25166,14 +24182,7 @@
               <w:rPr>
                 <w:rFonts w:ascii="Courier New" w:hAnsi="Courier New" w:cs="Courier New"/>
               </w:rPr>
-              <w:t>(</w:t>
-            </w:r>
-            <w:proofErr w:type="gramEnd"/>
-            <w:r>
-              <w:rPr>
-                <w:rFonts w:ascii="Courier New" w:hAnsi="Courier New" w:cs="Courier New"/>
-              </w:rPr>
-              <w:t>"</w:t>
+              <w:t>("</w:t>
             </w:r>
             <w:proofErr w:type="spellStart"/>
             <w:r>
@@ -25451,28 +24460,14 @@
         <w:rPr>
           <w:rFonts w:ascii="Courier New" w:hAnsi="Courier New" w:cs="Courier New"/>
         </w:rPr>
-        <w:t>bspfunktion_global_</w:t>
-      </w:r>
-      <w:proofErr w:type="gramStart"/>
+        <w:t>bspfunktion_global_lesen</w:t>
+      </w:r>
+      <w:proofErr w:type="spellEnd"/>
       <w:r>
         <w:rPr>
           <w:rFonts w:ascii="Courier New" w:hAnsi="Courier New" w:cs="Courier New"/>
         </w:rPr>
-        <w:t>lesen</w:t>
-      </w:r>
-      <w:proofErr w:type="spellEnd"/>
-      <w:r>
-        <w:rPr>
-          <w:rFonts w:ascii="Courier New" w:hAnsi="Courier New" w:cs="Courier New"/>
-        </w:rPr>
-        <w:t>(</w:t>
-      </w:r>
-      <w:proofErr w:type="gramEnd"/>
-      <w:r>
-        <w:rPr>
-          <w:rFonts w:ascii="Courier New" w:hAnsi="Courier New" w:cs="Courier New"/>
-        </w:rPr>
-        <w:t>)</w:t>
+        <w:t>()</w:t>
       </w:r>
     </w:p>
     <w:p>
@@ -25549,44 +24544,25 @@
         <w:rPr>
           <w:rFonts w:ascii="Courier New" w:hAnsi="Courier New" w:cs="Courier New"/>
         </w:rPr>
-        <w:t>bspfunktion_lokal_</w:t>
-      </w:r>
-      <w:proofErr w:type="gramStart"/>
+        <w:t>bspfunktion_lokal_schreiben</w:t>
+      </w:r>
+      <w:proofErr w:type="spellEnd"/>
       <w:r>
         <w:rPr>
           <w:rFonts w:ascii="Courier New" w:hAnsi="Courier New" w:cs="Courier New"/>
         </w:rPr>
-        <w:t>schreiben</w:t>
-      </w:r>
-      <w:proofErr w:type="spellEnd"/>
-      <w:r>
+        <w:t>()</w:t>
+      </w:r>
+    </w:p>
+    <w:p>
+      <w:pPr>
+        <w:spacing w:after="120"/>
         <w:rPr>
           <w:rFonts w:ascii="Courier New" w:hAnsi="Courier New" w:cs="Courier New"/>
         </w:rPr>
-        <w:t>(</w:t>
-      </w:r>
-      <w:proofErr w:type="gramEnd"/>
-      <w:r>
-        <w:rPr>
-          <w:rFonts w:ascii="Courier New" w:hAnsi="Courier New" w:cs="Courier New"/>
-        </w:rPr>
-        <w:t>)</w:t>
-      </w:r>
-    </w:p>
-    <w:p>
-      <w:pPr>
-        <w:spacing w:after="120"/>
-        <w:rPr>
-          <w:rFonts w:ascii="Courier New" w:hAnsi="Courier New" w:cs="Courier New"/>
-        </w:rPr>
-      </w:pPr>
-      <w:proofErr w:type="gramStart"/>
-      <w:r>
-        <w:t>…</w:t>
-      </w:r>
-      <w:proofErr w:type="gramEnd"/>
-      <w:r>
-        <w:t xml:space="preserve"> </w:t>
+      </w:pPr>
+      <w:r>
+        <w:t xml:space="preserve">… </w:t>
       </w:r>
       <w:r>
         <w:t>wenn</w:t>
@@ -25620,28 +24596,14 @@
         <w:rPr>
           <w:rFonts w:ascii="Courier New" w:hAnsi="Courier New" w:cs="Courier New"/>
         </w:rPr>
-        <w:t>bspfunktion_global_lesen_</w:t>
-      </w:r>
-      <w:proofErr w:type="gramStart"/>
+        <w:t>bspfunktion_global_lesen_schreiben</w:t>
+      </w:r>
+      <w:proofErr w:type="spellEnd"/>
       <w:r>
         <w:rPr>
           <w:rFonts w:ascii="Courier New" w:hAnsi="Courier New" w:cs="Courier New"/>
         </w:rPr>
-        <w:t>schreiben</w:t>
-      </w:r>
-      <w:proofErr w:type="spellEnd"/>
-      <w:r>
-        <w:rPr>
-          <w:rFonts w:ascii="Courier New" w:hAnsi="Courier New" w:cs="Courier New"/>
-        </w:rPr>
-        <w:t>(</w:t>
-      </w:r>
-      <w:proofErr w:type="gramEnd"/>
-      <w:r>
-        <w:rPr>
-          <w:rFonts w:ascii="Courier New" w:hAnsi="Courier New" w:cs="Courier New"/>
-        </w:rPr>
-        <w:t>)</w:t>
+        <w:t>()</w:t>
       </w:r>
     </w:p>
     <w:p>
@@ -26641,15 +25603,7 @@
         <w:t>Ergebnisse prüfen.</w:t>
       </w:r>
       <w:r>
-        <w:t xml:space="preserve"> Dazu rufen wir die Funktion </w:t>
-      </w:r>
-      <w:proofErr w:type="gramStart"/>
-      <w:r>
-        <w:t>5 mal</w:t>
-      </w:r>
-      <w:proofErr w:type="gramEnd"/>
-      <w:r>
-        <w:t xml:space="preserve"> auf. </w:t>
+        <w:t xml:space="preserve"> Dazu rufen wir die Funktion 5 mal auf. </w:t>
       </w:r>
     </w:p>
     <w:p>
@@ -27785,7 +26739,6 @@
         <w:t xml:space="preserve"> du mit </w:t>
       </w:r>
       <w:proofErr w:type="spellStart"/>
-      <w:proofErr w:type="gramStart"/>
       <w:r>
         <w:rPr>
           <w:rFonts w:ascii="Courier New" w:hAnsi="Courier New" w:cs="Courier New"/>
@@ -27800,7 +26753,6 @@
         <w:t>(</w:t>
       </w:r>
       <w:proofErr w:type="spellStart"/>
-      <w:proofErr w:type="gramEnd"/>
       <w:r>
         <w:rPr>
           <w:rFonts w:ascii="Courier New" w:hAnsi="Courier New" w:cs="Courier New"/>
@@ -27819,28 +26771,17 @@
         <w:rPr>
           <w:rFonts w:ascii="Courier New" w:hAnsi="Courier New" w:cs="Courier New"/>
         </w:rPr>
-        <w:t>eur_</w:t>
-      </w:r>
-      <w:proofErr w:type="gramStart"/>
+        <w:t>eur_liste</w:t>
+      </w:r>
+      <w:proofErr w:type="spellEnd"/>
       <w:r>
         <w:rPr>
           <w:rFonts w:ascii="Courier New" w:hAnsi="Courier New" w:cs="Courier New"/>
         </w:rPr>
-        <w:t>liste</w:t>
-      </w:r>
-      <w:proofErr w:type="spellEnd"/>
-      <w:r>
-        <w:rPr>
-          <w:rFonts w:ascii="Courier New" w:hAnsi="Courier New" w:cs="Courier New"/>
-        </w:rPr>
         <w:t>)</w:t>
       </w:r>
       <w:r>
-        <w:t>ein</w:t>
-      </w:r>
-      <w:proofErr w:type="gramEnd"/>
-      <w:r>
-        <w:t xml:space="preserve"> Tupel mit einem Element aus </w:t>
+        <w:t xml:space="preserve">ein Tupel mit einem Element aus </w:t>
       </w:r>
       <w:r>
         <w:t>jeder</w:t>
@@ -30271,35 +29212,7 @@
         <w:rPr>
           <w:rFonts w:ascii="Courier New" w:hAnsi="Courier New" w:cs="Courier New"/>
         </w:rPr>
-        <w:t>zip(trainerstunden_</w:t>
-      </w:r>
-      <w:proofErr w:type="gramStart"/>
-      <w:r>
-        <w:rPr>
-          <w:rFonts w:ascii="Courier New" w:hAnsi="Courier New" w:cs="Courier New"/>
-        </w:rPr>
-        <w:t>liste,tennis</w:t>
-      </w:r>
-      <w:proofErr w:type="gramEnd"/>
-      <w:r>
-        <w:rPr>
-          <w:rFonts w:ascii="Courier New" w:hAnsi="Courier New" w:cs="Courier New"/>
-        </w:rPr>
-        <w:t>_pro_kosten_</w:t>
-      </w:r>
-      <w:proofErr w:type="gramStart"/>
-      <w:r>
-        <w:rPr>
-          <w:rFonts w:ascii="Courier New" w:hAnsi="Courier New" w:cs="Courier New"/>
-        </w:rPr>
-        <w:t>liste,go</w:t>
-      </w:r>
-      <w:proofErr w:type="gramEnd"/>
-      <w:r>
-        <w:rPr>
-          <w:rFonts w:ascii="Courier New" w:hAnsi="Courier New" w:cs="Courier New"/>
-        </w:rPr>
-        <w:t>_tennis_kosten_liste)</w:t>
+        <w:t>zip(trainerstunden_liste,tennis_pro_kosten_liste,go_tennis_kosten_liste)</w:t>
       </w:r>
       <w:r>
         <w:rPr>
@@ -30502,7 +29415,6 @@
         <w:t xml:space="preserve">Die Kosten sollen in einem Diagramm gezeigt werden. Du benötigst dazu die Bibliothek </w:t>
       </w:r>
       <w:proofErr w:type="spellStart"/>
-      <w:proofErr w:type="gramStart"/>
       <w:r>
         <w:rPr>
           <w:rFonts w:ascii="Courier New" w:hAnsi="Courier New" w:cs="Courier New"/>
@@ -30510,7 +29422,6 @@
         <w:t>matplotlib.pyplot</w:t>
       </w:r>
       <w:proofErr w:type="spellEnd"/>
-      <w:proofErr w:type="gramEnd"/>
       <w:r>
         <w:rPr>
           <w:rFonts w:cstheme="minorHAnsi"/>
@@ -31524,7 +30435,6 @@
         <w:t xml:space="preserve">Anstelle von </w:t>
       </w:r>
       <w:proofErr w:type="spellStart"/>
-      <w:proofErr w:type="gramStart"/>
       <w:r>
         <w:rPr>
           <w:rFonts w:ascii="Courier New" w:hAnsi="Courier New" w:cs="Courier New"/>
@@ -31532,7 +30442,6 @@
         <w:t>self.rufname</w:t>
       </w:r>
       <w:proofErr w:type="spellEnd"/>
-      <w:proofErr w:type="gramEnd"/>
       <w:r>
         <w:rPr>
           <w:rFonts w:ascii="Courier New" w:hAnsi="Courier New" w:cs="Courier New"/>
@@ -31551,7 +30460,6 @@
         <w:t xml:space="preserve"> schreibst du </w:t>
       </w:r>
       <w:proofErr w:type="spellStart"/>
-      <w:proofErr w:type="gramStart"/>
       <w:r>
         <w:rPr>
           <w:rFonts w:ascii="Courier New" w:hAnsi="Courier New" w:cs="Courier New"/>
@@ -31559,7 +30467,6 @@
         <w:t>self.besitzer</w:t>
       </w:r>
       <w:proofErr w:type="spellEnd"/>
-      <w:proofErr w:type="gramEnd"/>
       <w:r>
         <w:rPr>
           <w:rFonts w:ascii="Courier New" w:hAnsi="Courier New" w:cs="Courier New"/>
@@ -31943,6 +30850,9 @@
     </w:p>
     <w:p>
       <w:r>
+        <w:rPr>
+          <w:noProof/>
+        </w:rPr>
         <w:drawing>
           <wp:inline distT="0" distB="0" distL="0" distR="0" wp14:anchorId="51EC3F83" wp14:editId="3296E23C">
             <wp:extent cx="6645910" cy="7486015"/>
@@ -32557,13 +31467,7 @@
         <w:t xml:space="preserve"> File/ Open</w:t>
       </w:r>
       <w:r>
-        <w:t xml:space="preserve"> … öffnest du die Datei "</w:t>
-      </w:r>
-      <w:r>
-        <w:t>Tier</w:t>
-      </w:r>
-      <w:r>
-        <w:t>_Klasse.py" im Ordner Python/</w:t>
+        <w:t xml:space="preserve"> … öffnest du die Datei "Tier_Klasse.py" im Ordner Python/</w:t>
       </w:r>
       <w:r>
         <w:t>12_OOP_Vererbung_bei_Klassen</w:t>
@@ -32673,6 +31577,9 @@
         <w:spacing w:after="120"/>
       </w:pPr>
       <w:r>
+        <w:rPr>
+          <w:noProof/>
+        </w:rPr>
         <w:drawing>
           <wp:inline distT="0" distB="0" distL="0" distR="0" wp14:anchorId="29363026" wp14:editId="1CB580E2">
             <wp:extent cx="6645910" cy="136525"/>
@@ -32915,7 +31822,6 @@
         <w:t xml:space="preserve">Anstelle von </w:t>
       </w:r>
       <w:proofErr w:type="spellStart"/>
-      <w:proofErr w:type="gramStart"/>
       <w:r>
         <w:rPr>
           <w:rFonts w:ascii="Courier New" w:hAnsi="Courier New" w:cs="Courier New"/>
@@ -32923,7 +31829,6 @@
         <w:t>self.rufname</w:t>
       </w:r>
       <w:proofErr w:type="spellEnd"/>
-      <w:proofErr w:type="gramEnd"/>
       <w:r>
         <w:rPr>
           <w:rFonts w:ascii="Courier New" w:hAnsi="Courier New" w:cs="Courier New"/>
@@ -32942,7 +31847,6 @@
         <w:t xml:space="preserve"> schreibst du </w:t>
       </w:r>
       <w:proofErr w:type="spellStart"/>
-      <w:proofErr w:type="gramStart"/>
       <w:r>
         <w:rPr>
           <w:rFonts w:ascii="Courier New" w:hAnsi="Courier New" w:cs="Courier New"/>
@@ -32950,7 +31854,6 @@
         <w:t>self.besitzer</w:t>
       </w:r>
       <w:proofErr w:type="spellEnd"/>
-      <w:proofErr w:type="gramEnd"/>
       <w:r>
         <w:rPr>
           <w:rFonts w:ascii="Courier New" w:hAnsi="Courier New" w:cs="Courier New"/>
@@ -32996,7 +31899,10 @@
       </w:r>
       <w:proofErr w:type="spellStart"/>
       <w:r>
-        <w:t>Fahrrad_Klasse</w:t>
+        <w:t>Zwei</w:t>
+      </w:r>
+      <w:r>
+        <w:t>rad_Klasse</w:t>
       </w:r>
       <w:proofErr w:type="spellEnd"/>
       <w:r>
@@ -33021,13 +31927,7 @@
         <w:contextualSpacing w:val="0"/>
       </w:pPr>
       <w:r>
-        <w:t xml:space="preserve">Ab hier kannst du die </w:t>
-      </w:r>
-      <w:r>
-        <w:t>Definition der Eltern-Klasse</w:t>
-      </w:r>
-      <w:r>
-        <w:t xml:space="preserve"> alleine vervollständigen! </w:t>
+        <w:t xml:space="preserve">Ab hier kannst du die Definition der Eltern-Klasse alleine vervollständigen! </w:t>
       </w:r>
       <w:r>
         <w:br/>
@@ -33166,8 +32066,6 @@
       </w:r>
       <w:r>
         <w:br/>
-      </w:r>
-      <w:r>
         <w:t xml:space="preserve">Anstelle von </w:t>
       </w:r>
       <w:r>
@@ -33265,16 +32163,7 @@
         <w:t>__</w:t>
       </w:r>
       <w:r>
-        <w:t xml:space="preserve"> </w:t>
-      </w:r>
-      <w:r>
-        <w:t xml:space="preserve">der Kind-Klasse für Fahrräder </w:t>
-      </w:r>
-      <w:r>
-        <w:t>m</w:t>
-      </w:r>
-      <w:r>
-        <w:t xml:space="preserve">achst du nach dem </w:t>
+        <w:t xml:space="preserve"> der Kind-Klasse für Fahrräder machst du nach dem </w:t>
       </w:r>
       <w:r>
         <w:rPr>
@@ -33284,15 +32173,10 @@
         <w:t>Vorbild</w:t>
       </w:r>
       <w:r>
-        <w:t>:</w:t>
-      </w:r>
-      <w:r>
-        <w:t xml:space="preserve"> </w:t>
+        <w:t xml:space="preserve">: </w:t>
       </w:r>
       <w:r>
         <w:br/>
-      </w:r>
-      <w:r>
         <w:t xml:space="preserve">Anstelle von </w:t>
       </w:r>
       <w:proofErr w:type="spellStart"/>
@@ -33393,13 +32277,7 @@
         <w:contextualSpacing w:val="0"/>
       </w:pPr>
       <w:r>
-        <w:t xml:space="preserve">Die Definition der Kind-Klasse für </w:t>
-      </w:r>
-      <w:r>
-        <w:t>Pedelecs</w:t>
-      </w:r>
-      <w:r>
-        <w:t xml:space="preserve"> und den Hilfetext machst du nach dem </w:t>
+        <w:t xml:space="preserve">Die Definition der Kind-Klasse für Pedelecs und den Hilfetext machst du nach dem </w:t>
       </w:r>
       <w:r>
         <w:rPr>
@@ -33413,14 +32291,7 @@
       </w:r>
       <w:r>
         <w:br/>
-        <w:t xml:space="preserve">Anstelle </w:t>
-      </w:r>
-      <w:proofErr w:type="gramStart"/>
-      <w:r>
-        <w:t>von</w:t>
-      </w:r>
-      <w:r>
-        <w:t xml:space="preserve"> </w:t>
+        <w:t xml:space="preserve">Anstelle von </w:t>
       </w:r>
       <w:r>
         <w:rPr>
@@ -33429,7 +32300,6 @@
         </w:rPr>
         <w:t>Hunde</w:t>
       </w:r>
-      <w:proofErr w:type="gramEnd"/>
       <w:r>
         <w:rPr>
           <w:color w:val="EE0000"/>
@@ -33793,95 +32663,89 @@
           <w:rFonts w:ascii="Courier New" w:hAnsi="Courier New" w:cs="Courier New"/>
           <w:color w:val="0070C0"/>
         </w:rPr>
-        <w:t>tut_</w:t>
-      </w:r>
-      <w:proofErr w:type="gramStart"/>
+        <w:t>tut_reden</w:t>
+      </w:r>
+      <w:proofErr w:type="spellEnd"/>
+      <w:r>
+        <w:rPr>
+          <w:rFonts w:ascii="Courier New" w:hAnsi="Courier New" w:cs="Courier New"/>
+        </w:rPr>
+        <w:t>(</w:t>
+      </w:r>
+      <w:proofErr w:type="spellStart"/>
+      <w:r>
+        <w:rPr>
+          <w:rFonts w:ascii="Courier New" w:hAnsi="Courier New" w:cs="Courier New"/>
+        </w:rPr>
+        <w:t>self</w:t>
+      </w:r>
+      <w:proofErr w:type="spellEnd"/>
+      <w:r>
+        <w:rPr>
+          <w:rFonts w:ascii="Courier New" w:hAnsi="Courier New" w:cs="Courier New"/>
+        </w:rPr>
+        <w:t xml:space="preserve">, </w:t>
+      </w:r>
+      <w:proofErr w:type="spellStart"/>
+      <w:r>
+        <w:rPr>
+          <w:rFonts w:ascii="Courier New" w:hAnsi="Courier New" w:cs="Courier New"/>
+        </w:rPr>
+        <w:t>anzahl</w:t>
+      </w:r>
+      <w:proofErr w:type="spellEnd"/>
+      <w:r>
+        <w:rPr>
+          <w:rFonts w:ascii="Courier New" w:hAnsi="Courier New" w:cs="Courier New"/>
+        </w:rPr>
+        <w:t xml:space="preserve"> = 1)</w:t>
+      </w:r>
+      <w:r>
+        <w:rPr>
+          <w:rFonts w:cstheme="minorHAnsi"/>
+        </w:rPr>
+        <w:t xml:space="preserve"> schreibst du </w:t>
+      </w:r>
       <w:r>
         <w:rPr>
           <w:rFonts w:ascii="Courier New" w:hAnsi="Courier New" w:cs="Courier New"/>
           <w:color w:val="0070C0"/>
         </w:rPr>
-        <w:t>reden</w:t>
+        <w:t>aufladen</w:t>
+      </w:r>
+      <w:r>
+        <w:rPr>
+          <w:rFonts w:ascii="Courier New" w:hAnsi="Courier New" w:cs="Courier New"/>
+        </w:rPr>
+        <w:t>(</w:t>
+      </w:r>
+      <w:proofErr w:type="spellStart"/>
+      <w:r>
+        <w:rPr>
+          <w:rFonts w:ascii="Courier New" w:hAnsi="Courier New" w:cs="Courier New"/>
+        </w:rPr>
+        <w:t>self</w:t>
       </w:r>
       <w:proofErr w:type="spellEnd"/>
       <w:r>
         <w:rPr>
           <w:rFonts w:ascii="Courier New" w:hAnsi="Courier New" w:cs="Courier New"/>
         </w:rPr>
-        <w:t>(</w:t>
-      </w:r>
-      <w:proofErr w:type="spellStart"/>
-      <w:proofErr w:type="gramEnd"/>
-      <w:r>
-        <w:rPr>
-          <w:rFonts w:ascii="Courier New" w:hAnsi="Courier New" w:cs="Courier New"/>
-        </w:rPr>
-        <w:t>self</w:t>
-      </w:r>
-      <w:proofErr w:type="spellEnd"/>
-      <w:r>
-        <w:rPr>
-          <w:rFonts w:ascii="Courier New" w:hAnsi="Courier New" w:cs="Courier New"/>
-        </w:rPr>
-        <w:t xml:space="preserve">, </w:t>
-      </w:r>
-      <w:proofErr w:type="spellStart"/>
-      <w:r>
-        <w:rPr>
-          <w:rFonts w:ascii="Courier New" w:hAnsi="Courier New" w:cs="Courier New"/>
-        </w:rPr>
-        <w:t>anzahl</w:t>
-      </w:r>
-      <w:proofErr w:type="spellEnd"/>
-      <w:r>
-        <w:rPr>
-          <w:rFonts w:ascii="Courier New" w:hAnsi="Courier New" w:cs="Courier New"/>
-        </w:rPr>
-        <w:t xml:space="preserve"> = 1)</w:t>
+        <w:t>)</w:t>
       </w:r>
       <w:r>
         <w:rPr>
           <w:rFonts w:cstheme="minorHAnsi"/>
         </w:rPr>
-        <w:t xml:space="preserve"> schreibst du </w:t>
-      </w:r>
-      <w:r>
-        <w:rPr>
-          <w:rFonts w:ascii="Courier New" w:hAnsi="Courier New" w:cs="Courier New"/>
-          <w:color w:val="0070C0"/>
-        </w:rPr>
-        <w:t>aufladen</w:t>
-      </w:r>
-      <w:r>
-        <w:rPr>
-          <w:rFonts w:ascii="Courier New" w:hAnsi="Courier New" w:cs="Courier New"/>
-        </w:rPr>
-        <w:t>(</w:t>
-      </w:r>
-      <w:proofErr w:type="spellStart"/>
-      <w:r>
-        <w:rPr>
-          <w:rFonts w:ascii="Courier New" w:hAnsi="Courier New" w:cs="Courier New"/>
-        </w:rPr>
-        <w:t>self</w:t>
-      </w:r>
-      <w:proofErr w:type="spellEnd"/>
-      <w:r>
-        <w:rPr>
-          <w:rFonts w:ascii="Courier New" w:hAnsi="Courier New" w:cs="Courier New"/>
-        </w:rPr>
-        <w:t>)</w:t>
-      </w:r>
-      <w:r>
-        <w:rPr>
-          <w:rFonts w:cstheme="minorHAnsi"/>
-        </w:rPr>
         <w:t xml:space="preserve"> mit dem</w:t>
       </w:r>
       <w:r>
         <w:t xml:space="preserve"> Rumpf:</w:t>
       </w:r>
       <w:r>
+        <w:rPr>
+          <w:noProof/>
+        </w:rPr>
         <w:drawing>
           <wp:inline distT="0" distB="0" distL="0" distR="0" wp14:anchorId="43DD7FCB" wp14:editId="391CB12E">
             <wp:extent cx="6645910" cy="123190"/>
@@ -34071,7 +32935,10 @@
       </w:r>
       <w:proofErr w:type="spellStart"/>
       <w:r>
-        <w:t>Fahrrad_Klasse</w:t>
+        <w:t>Zwei</w:t>
+      </w:r>
+      <w:r>
+        <w:t>rad_Klasse</w:t>
       </w:r>
       <w:proofErr w:type="spellEnd"/>
       <w:r>
@@ -34473,19 +33340,11 @@
               <w:t xml:space="preserve"> </w:t>
             </w:r>
             <w:proofErr w:type="spellStart"/>
-            <w:proofErr w:type="gramStart"/>
-            <w:r>
-              <w:rPr>
-                <w:rFonts w:ascii="Courier New" w:hAnsi="Courier New" w:cs="Courier New"/>
-              </w:rPr>
-              <w:t>self.from</w:t>
-            </w:r>
-            <w:proofErr w:type="gramEnd"/>
-            <w:r>
-              <w:rPr>
-                <w:rFonts w:ascii="Courier New" w:hAnsi="Courier New" w:cs="Courier New"/>
-              </w:rPr>
-              <w:t>_bottom</w:t>
+            <w:r>
+              <w:rPr>
+                <w:rFonts w:ascii="Courier New" w:hAnsi="Courier New" w:cs="Courier New"/>
+              </w:rPr>
+              <w:t>self.from_bottom</w:t>
             </w:r>
             <w:proofErr w:type="spellEnd"/>
             <w:r>
@@ -35083,21 +33942,7 @@
         <w:rPr>
           <w:rFonts w:ascii="Courier New" w:hAnsi="Courier New" w:cs="Courier New"/>
         </w:rPr>
-        <w:t xml:space="preserve">+               </w:t>
-      </w:r>
-      <w:proofErr w:type="gramStart"/>
-      <w:r>
-        <w:rPr>
-          <w:rFonts w:ascii="Courier New" w:hAnsi="Courier New" w:cs="Courier New"/>
-        </w:rPr>
-        <w:t>S  +</w:t>
-      </w:r>
-      <w:proofErr w:type="gramEnd"/>
-      <w:r>
-        <w:rPr>
-          <w:rFonts w:ascii="Courier New" w:hAnsi="Courier New" w:cs="Courier New"/>
-        </w:rPr>
-        <w:t xml:space="preserve"> +</w:t>
+        <w:t>+               S  + +</w:t>
       </w:r>
     </w:p>
     <w:p>
@@ -35281,19 +34126,11 @@
       </w:r>
       <w:proofErr w:type="spellStart"/>
       <w:r>
-        <w:t>search_</w:t>
-      </w:r>
-      <w:proofErr w:type="gramStart"/>
-      <w:r>
-        <w:t>from</w:t>
+        <w:t>search_from</w:t>
       </w:r>
       <w:proofErr w:type="spellEnd"/>
       <w:r>
-        <w:t>(</w:t>
-      </w:r>
-      <w:proofErr w:type="gramEnd"/>
-      <w:r>
-        <w:t xml:space="preserve">) setzt die Schildkröte auf den Startpunkt. </w:t>
+        <w:t xml:space="preserve">() setzt die Schildkröte auf den Startpunkt. </w:t>
       </w:r>
       <w:r>
         <w:t xml:space="preserve">Starte das Programm. </w:t>
@@ -35431,40 +34268,22 @@
               </w:rPr>
             </w:pPr>
             <w:proofErr w:type="spellStart"/>
-            <w:proofErr w:type="gramStart"/>
             <w:r>
               <w:rPr>
                 <w:rFonts w:ascii="Courier New" w:hAnsi="Courier New" w:cs="Courier New"/>
                 <w:lang w:val="en-US"/>
               </w:rPr>
-              <w:t>maze.update</w:t>
-            </w:r>
-            <w:proofErr w:type="gramEnd"/>
+              <w:t>maze.update_position</w:t>
+            </w:r>
+            <w:proofErr w:type="spellEnd"/>
             <w:r>
               <w:rPr>
                 <w:rFonts w:ascii="Courier New" w:hAnsi="Courier New" w:cs="Courier New"/>
                 <w:lang w:val="en-US"/>
               </w:rPr>
-              <w:t>_</w:t>
-            </w:r>
-            <w:proofErr w:type="gramStart"/>
-            <w:r>
-              <w:rPr>
-                <w:rFonts w:ascii="Courier New" w:hAnsi="Courier New" w:cs="Courier New"/>
-                <w:lang w:val="en-US"/>
-              </w:rPr>
-              <w:t>position</w:t>
-            </w:r>
-            <w:proofErr w:type="spellEnd"/>
-            <w:r>
-              <w:rPr>
-                <w:rFonts w:ascii="Courier New" w:hAnsi="Courier New" w:cs="Courier New"/>
-                <w:lang w:val="en-US"/>
-              </w:rPr>
               <w:t>(</w:t>
             </w:r>
             <w:proofErr w:type="spellStart"/>
-            <w:proofErr w:type="gramEnd"/>
             <w:r>
               <w:rPr>
                 <w:rFonts w:ascii="Courier New" w:hAnsi="Courier New" w:cs="Courier New"/>
@@ -36158,28 +34977,14 @@
         <w:rPr>
           <w:rFonts w:ascii="Courier New" w:hAnsi="Courier New" w:cs="Courier New"/>
         </w:rPr>
-        <w:t>search_</w:t>
-      </w:r>
-      <w:proofErr w:type="gramStart"/>
+        <w:t>search_from</w:t>
+      </w:r>
+      <w:proofErr w:type="spellEnd"/>
       <w:r>
         <w:rPr>
           <w:rFonts w:ascii="Courier New" w:hAnsi="Courier New" w:cs="Courier New"/>
         </w:rPr>
-        <w:t>from</w:t>
-      </w:r>
-      <w:proofErr w:type="spellEnd"/>
-      <w:r>
-        <w:rPr>
-          <w:rFonts w:ascii="Courier New" w:hAnsi="Courier New" w:cs="Courier New"/>
-        </w:rPr>
-        <w:t>(</w:t>
-      </w:r>
-      <w:proofErr w:type="gramEnd"/>
-      <w:r>
-        <w:rPr>
-          <w:rFonts w:ascii="Courier New" w:hAnsi="Courier New" w:cs="Courier New"/>
-        </w:rPr>
-        <w:t>)</w:t>
+        <w:t>()</w:t>
       </w:r>
       <w:r>
         <w:t xml:space="preserve">. Die Funktion enthält eine Benutzerabfrage. Dort gebt ihr ein Kommando ein, und der Roboter schaut, geht und dreht. Starte das Programm. Gib Kommandos ein und beobachte die Reaktion </w:t>
@@ -36299,14 +35104,9 @@
             </w:r>
             <w:proofErr w:type="spellEnd"/>
             <w:r>
-              <w:t xml:space="preserve">], r[rechts], </w:t>
-            </w:r>
-            <w:proofErr w:type="gramStart"/>
-            <w:r>
-              <w:t>s[</w:t>
+              <w:t>], r[rechts], s[</w:t>
             </w:r>
             <w:proofErr w:type="spellStart"/>
-            <w:proofErr w:type="gramEnd"/>
             <w:r>
               <w:t>chritt</w:t>
             </w:r>
@@ -36525,59 +35325,31 @@
         <w:rPr>
           <w:rFonts w:ascii="Courier New" w:hAnsi="Courier New" w:cs="Courier New"/>
         </w:rPr>
-        <w:t>look_</w:t>
-      </w:r>
-      <w:proofErr w:type="gramStart"/>
+        <w:t>look_forward</w:t>
+      </w:r>
+      <w:proofErr w:type="spellEnd"/>
       <w:r>
         <w:rPr>
           <w:rFonts w:ascii="Courier New" w:hAnsi="Courier New" w:cs="Courier New"/>
         </w:rPr>
-        <w:t>forward</w:t>
+        <w:t>()</w:t>
+      </w:r>
+      <w:r>
+        <w:t xml:space="preserve"> und </w:t>
+      </w:r>
+      <w:proofErr w:type="spellStart"/>
+      <w:r>
+        <w:rPr>
+          <w:rFonts w:ascii="Courier New" w:hAnsi="Courier New" w:cs="Courier New"/>
+        </w:rPr>
+        <w:t>look_right</w:t>
       </w:r>
       <w:proofErr w:type="spellEnd"/>
       <w:r>
         <w:rPr>
           <w:rFonts w:ascii="Courier New" w:hAnsi="Courier New" w:cs="Courier New"/>
         </w:rPr>
-        <w:t>(</w:t>
-      </w:r>
-      <w:proofErr w:type="gramEnd"/>
-      <w:r>
-        <w:rPr>
-          <w:rFonts w:ascii="Courier New" w:hAnsi="Courier New" w:cs="Courier New"/>
-        </w:rPr>
-        <w:t>)</w:t>
-      </w:r>
-      <w:r>
-        <w:t xml:space="preserve"> und </w:t>
-      </w:r>
-      <w:proofErr w:type="spellStart"/>
-      <w:r>
-        <w:rPr>
-          <w:rFonts w:ascii="Courier New" w:hAnsi="Courier New" w:cs="Courier New"/>
-        </w:rPr>
-        <w:t>look_</w:t>
-      </w:r>
-      <w:proofErr w:type="gramStart"/>
-      <w:r>
-        <w:rPr>
-          <w:rFonts w:ascii="Courier New" w:hAnsi="Courier New" w:cs="Courier New"/>
-        </w:rPr>
-        <w:t>right</w:t>
-      </w:r>
-      <w:proofErr w:type="spellEnd"/>
-      <w:r>
-        <w:rPr>
-          <w:rFonts w:ascii="Courier New" w:hAnsi="Courier New" w:cs="Courier New"/>
-        </w:rPr>
-        <w:t>(</w:t>
-      </w:r>
-      <w:proofErr w:type="gramEnd"/>
-      <w:r>
-        <w:rPr>
-          <w:rFonts w:ascii="Courier New" w:hAnsi="Courier New" w:cs="Courier New"/>
-        </w:rPr>
-        <w:t>)</w:t>
+        <w:t>()</w:t>
       </w:r>
       <w:r>
         <w:rPr>
@@ -36670,28 +35442,14 @@
         <w:rPr>
           <w:rFonts w:ascii="Courier New" w:hAnsi="Courier New" w:cs="Courier New"/>
         </w:rPr>
-        <w:t>is_</w:t>
-      </w:r>
-      <w:proofErr w:type="gramStart"/>
+        <w:t>is_exit</w:t>
+      </w:r>
+      <w:proofErr w:type="spellEnd"/>
       <w:r>
         <w:rPr>
           <w:rFonts w:ascii="Courier New" w:hAnsi="Courier New" w:cs="Courier New"/>
         </w:rPr>
-        <w:t>exit</w:t>
-      </w:r>
-      <w:proofErr w:type="spellEnd"/>
-      <w:r>
-        <w:rPr>
-          <w:rFonts w:ascii="Courier New" w:hAnsi="Courier New" w:cs="Courier New"/>
-        </w:rPr>
-        <w:t>(</w:t>
-      </w:r>
-      <w:proofErr w:type="gramEnd"/>
-      <w:r>
-        <w:rPr>
-          <w:rFonts w:ascii="Courier New" w:hAnsi="Courier New" w:cs="Courier New"/>
-        </w:rPr>
-        <w:t>)</w:t>
+        <w:t>()</w:t>
       </w:r>
       <w:r>
         <w:rPr>
@@ -38934,20 +37692,102 @@
               <w:br/>
             </w:r>
             <w:proofErr w:type="spellStart"/>
-            <w:proofErr w:type="gramStart"/>
+            <w:r>
+              <w:rPr>
+                <w:rFonts w:ascii="Courier New" w:hAnsi="Courier New" w:cs="Courier New"/>
+              </w:rPr>
+              <w:t>self.image_LR</w:t>
+            </w:r>
+            <w:proofErr w:type="spellEnd"/>
+            <w:r>
+              <w:rPr>
+                <w:rFonts w:ascii="Courier New" w:hAnsi="Courier New" w:cs="Courier New"/>
+              </w:rPr>
+              <w:t xml:space="preserve"> = </w:t>
+            </w:r>
+            <w:proofErr w:type="spellStart"/>
+            <w:r>
+              <w:rPr>
+                <w:rFonts w:ascii="Courier New" w:hAnsi="Courier New" w:cs="Courier New"/>
+              </w:rPr>
+              <w:t>pygame.image.load</w:t>
+            </w:r>
+            <w:proofErr w:type="spellEnd"/>
+            <w:r>
+              <w:rPr>
+                <w:rFonts w:ascii="Courier New" w:hAnsi="Courier New" w:cs="Courier New"/>
+              </w:rPr>
+              <w:t>(</w:t>
+            </w:r>
+            <w:r>
+              <w:rPr>
+                <w:rFonts w:ascii="Courier New" w:hAnsi="Courier New" w:cs="Courier New"/>
+                <w:color w:val="538135" w:themeColor="accent6" w:themeShade="BF"/>
+              </w:rPr>
+              <w:t>"dinosaur_LR.png"</w:t>
+            </w:r>
+            <w:r>
+              <w:rPr>
+                <w:rFonts w:ascii="Courier New" w:hAnsi="Courier New" w:cs="Courier New"/>
+              </w:rPr>
+              <w:t>)</w:t>
+            </w:r>
+            <w:r>
+              <w:br/>
+            </w:r>
+            <w:proofErr w:type="spellStart"/>
+            <w:r>
+              <w:rPr>
+                <w:rFonts w:ascii="Courier New" w:hAnsi="Courier New" w:cs="Courier New"/>
+              </w:rPr>
+              <w:t>self.image_RL</w:t>
+            </w:r>
+            <w:proofErr w:type="spellEnd"/>
+            <w:r>
+              <w:rPr>
+                <w:rFonts w:ascii="Courier New" w:hAnsi="Courier New" w:cs="Courier New"/>
+              </w:rPr>
+              <w:t xml:space="preserve"> = </w:t>
+            </w:r>
+            <w:proofErr w:type="spellStart"/>
+            <w:r>
+              <w:rPr>
+                <w:rFonts w:ascii="Courier New" w:hAnsi="Courier New" w:cs="Courier New"/>
+              </w:rPr>
+              <w:t>pygame.image.load</w:t>
+            </w:r>
+            <w:proofErr w:type="spellEnd"/>
+            <w:r>
+              <w:rPr>
+                <w:rFonts w:ascii="Courier New" w:hAnsi="Courier New" w:cs="Courier New"/>
+              </w:rPr>
+              <w:t>(</w:t>
+            </w:r>
+            <w:r>
+              <w:rPr>
+                <w:rFonts w:ascii="Courier New" w:hAnsi="Courier New" w:cs="Courier New"/>
+                <w:color w:val="538135" w:themeColor="accent6" w:themeShade="BF"/>
+              </w:rPr>
+              <w:t>"dinosaur_RL.png"</w:t>
+            </w:r>
+            <w:r>
+              <w:rPr>
+                <w:rFonts w:ascii="Courier New" w:hAnsi="Courier New" w:cs="Courier New"/>
+              </w:rPr>
+              <w:t>)</w:t>
+            </w:r>
+          </w:p>
+          <w:p>
+            <w:r>
+              <w:t xml:space="preserve">Definiere das Anfangsbild: </w:t>
+            </w:r>
+            <w:proofErr w:type="spellStart"/>
             <w:r>
               <w:rPr>
                 <w:rFonts w:ascii="Courier New" w:hAnsi="Courier New" w:cs="Courier New"/>
               </w:rPr>
               <w:t>self.image</w:t>
             </w:r>
-            <w:proofErr w:type="gramEnd"/>
-            <w:r>
-              <w:rPr>
-                <w:rFonts w:ascii="Courier New" w:hAnsi="Courier New" w:cs="Courier New"/>
-              </w:rPr>
-              <w:t>_LR</w:t>
-            </w:r>
             <w:proofErr w:type="spellEnd"/>
             <w:r>
               <w:rPr>
@@ -38956,58 +37796,53 @@
               <w:t xml:space="preserve"> = </w:t>
             </w:r>
             <w:proofErr w:type="spellStart"/>
-            <w:proofErr w:type="gramStart"/>
-            <w:r>
-              <w:rPr>
-                <w:rFonts w:ascii="Courier New" w:hAnsi="Courier New" w:cs="Courier New"/>
-              </w:rPr>
-              <w:t>pygame.image</w:t>
-            </w:r>
-            <w:proofErr w:type="gramEnd"/>
-            <w:r>
-              <w:rPr>
-                <w:rFonts w:ascii="Courier New" w:hAnsi="Courier New" w:cs="Courier New"/>
-              </w:rPr>
-              <w:t>.load</w:t>
+            <w:r>
+              <w:rPr>
+                <w:rFonts w:ascii="Courier New" w:hAnsi="Courier New" w:cs="Courier New"/>
+              </w:rPr>
+              <w:t>self.image_LR</w:t>
             </w:r>
             <w:proofErr w:type="spellEnd"/>
-            <w:r>
-              <w:rPr>
-                <w:rFonts w:ascii="Courier New" w:hAnsi="Courier New" w:cs="Courier New"/>
-              </w:rPr>
-              <w:t>(</w:t>
-            </w:r>
-            <w:r>
-              <w:rPr>
-                <w:rFonts w:ascii="Courier New" w:hAnsi="Courier New" w:cs="Courier New"/>
-                <w:color w:val="538135" w:themeColor="accent6" w:themeShade="BF"/>
-              </w:rPr>
-              <w:t>"dinosaur_LR.png"</w:t>
-            </w:r>
-            <w:r>
-              <w:rPr>
-                <w:rFonts w:ascii="Courier New" w:hAnsi="Courier New" w:cs="Courier New"/>
-              </w:rPr>
-              <w:t>)</w:t>
+          </w:p>
+          <w:p>
+            <w:pPr>
+              <w:rPr>
+                <w:rFonts w:ascii="Courier New" w:hAnsi="Courier New" w:cs="Courier New"/>
+              </w:rPr>
+            </w:pPr>
+            <w:r>
+              <w:t xml:space="preserve">Wechsle die Bilder abhängig von </w:t>
+            </w:r>
+            <w:proofErr w:type="spellStart"/>
+            <w:r>
+              <w:rPr>
+                <w:rFonts w:ascii="Courier New" w:hAnsi="Courier New" w:cs="Courier New"/>
+              </w:rPr>
+              <w:t>pressed_keys</w:t>
+            </w:r>
+            <w:proofErr w:type="spellEnd"/>
+            <w:r>
+              <w:rPr>
+                <w:rFonts w:ascii="Courier New" w:hAnsi="Courier New" w:cs="Courier New"/>
+              </w:rPr>
+              <w:t>[]</w:t>
+            </w:r>
+            <w:r>
+              <w:rPr>
+                <w:rFonts w:ascii="Courier New" w:hAnsi="Courier New" w:cs="Courier New"/>
+              </w:rPr>
+              <w:t>:</w:t>
             </w:r>
             <w:r>
               <w:br/>
             </w:r>
             <w:proofErr w:type="spellStart"/>
-            <w:proofErr w:type="gramStart"/>
             <w:r>
               <w:rPr>
                 <w:rFonts w:ascii="Courier New" w:hAnsi="Courier New" w:cs="Courier New"/>
               </w:rPr>
               <w:t>self.image</w:t>
             </w:r>
-            <w:proofErr w:type="gramEnd"/>
-            <w:r>
-              <w:rPr>
-                <w:rFonts w:ascii="Courier New" w:hAnsi="Courier New" w:cs="Courier New"/>
-              </w:rPr>
-              <w:t>_RL</w:t>
-            </w:r>
             <w:proofErr w:type="spellEnd"/>
             <w:r>
               <w:rPr>
@@ -39016,47 +37851,34 @@
               <w:t xml:space="preserve"> = </w:t>
             </w:r>
             <w:proofErr w:type="spellStart"/>
-            <w:proofErr w:type="gramStart"/>
-            <w:r>
-              <w:rPr>
-                <w:rFonts w:ascii="Courier New" w:hAnsi="Courier New" w:cs="Courier New"/>
-              </w:rPr>
-              <w:t>pygame.image</w:t>
-            </w:r>
-            <w:proofErr w:type="gramEnd"/>
-            <w:r>
-              <w:rPr>
-                <w:rFonts w:ascii="Courier New" w:hAnsi="Courier New" w:cs="Courier New"/>
-              </w:rPr>
-              <w:t>.load</w:t>
+            <w:r>
+              <w:rPr>
+                <w:rFonts w:ascii="Courier New" w:hAnsi="Courier New" w:cs="Courier New"/>
+              </w:rPr>
+              <w:t>self.image_RL</w:t>
             </w:r>
             <w:proofErr w:type="spellEnd"/>
             <w:r>
               <w:rPr>
                 <w:rFonts w:ascii="Courier New" w:hAnsi="Courier New" w:cs="Courier New"/>
               </w:rPr>
-              <w:t>(</w:t>
-            </w:r>
-            <w:r>
-              <w:rPr>
-                <w:rFonts w:ascii="Courier New" w:hAnsi="Courier New" w:cs="Courier New"/>
-                <w:color w:val="538135" w:themeColor="accent6" w:themeShade="BF"/>
-              </w:rPr>
-              <w:t>"dinosaur_RL.png"</w:t>
-            </w:r>
-            <w:r>
-              <w:rPr>
-                <w:rFonts w:ascii="Courier New" w:hAnsi="Courier New" w:cs="Courier New"/>
-              </w:rPr>
-              <w:t>)</w:t>
-            </w:r>
-          </w:p>
-          <w:p>
-            <w:r>
-              <w:t xml:space="preserve">Definiere das Anfangsbild: </w:t>
-            </w:r>
+              <w:t xml:space="preserve"> </w:t>
+            </w:r>
+            <w:r>
+              <w:rPr>
+                <w:rFonts w:cstheme="minorHAnsi"/>
+              </w:rPr>
+              <w:t xml:space="preserve"> und</w:t>
+            </w:r>
+            <w:r>
+              <w:rPr>
+                <w:rFonts w:ascii="Courier New" w:hAnsi="Courier New" w:cs="Courier New"/>
+              </w:rPr>
+              <w:t xml:space="preserve">         </w:t>
+            </w:r>
+          </w:p>
+          <w:p>
             <w:proofErr w:type="spellStart"/>
-            <w:proofErr w:type="gramStart"/>
             <w:r>
               <w:rPr>
                 <w:rFonts w:ascii="Courier New" w:hAnsi="Courier New" w:cs="Courier New"/>
@@ -39064,7 +37886,6 @@
               <w:t>self.image</w:t>
             </w:r>
             <w:proofErr w:type="spellEnd"/>
-            <w:proofErr w:type="gramEnd"/>
             <w:r>
               <w:rPr>
                 <w:rFonts w:ascii="Courier New" w:hAnsi="Courier New" w:cs="Courier New"/>
@@ -39072,158 +37893,11 @@
               <w:t xml:space="preserve"> = </w:t>
             </w:r>
             <w:proofErr w:type="spellStart"/>
-            <w:proofErr w:type="gramStart"/>
-            <w:r>
-              <w:rPr>
-                <w:rFonts w:ascii="Courier New" w:hAnsi="Courier New" w:cs="Courier New"/>
-              </w:rPr>
-              <w:t>self.image</w:t>
-            </w:r>
-            <w:proofErr w:type="gramEnd"/>
-            <w:r>
-              <w:rPr>
-                <w:rFonts w:ascii="Courier New" w:hAnsi="Courier New" w:cs="Courier New"/>
-              </w:rPr>
-              <w:t>_LR</w:t>
-            </w:r>
-            <w:proofErr w:type="spellEnd"/>
-          </w:p>
-          <w:p>
-            <w:pPr>
-              <w:rPr>
-                <w:rFonts w:ascii="Courier New" w:hAnsi="Courier New" w:cs="Courier New"/>
-              </w:rPr>
-            </w:pPr>
-            <w:r>
-              <w:t xml:space="preserve">Wechsle die Bilder abhängig von </w:t>
-            </w:r>
-            <w:proofErr w:type="spellStart"/>
-            <w:r>
-              <w:rPr>
-                <w:rFonts w:ascii="Courier New" w:hAnsi="Courier New" w:cs="Courier New"/>
-              </w:rPr>
-              <w:t>pressed_</w:t>
-            </w:r>
-            <w:proofErr w:type="gramStart"/>
-            <w:r>
-              <w:rPr>
-                <w:rFonts w:ascii="Courier New" w:hAnsi="Courier New" w:cs="Courier New"/>
-              </w:rPr>
-              <w:t>keys</w:t>
-            </w:r>
-            <w:proofErr w:type="spellEnd"/>
-            <w:r>
-              <w:rPr>
-                <w:rFonts w:ascii="Courier New" w:hAnsi="Courier New" w:cs="Courier New"/>
-              </w:rPr>
-              <w:t>[</w:t>
-            </w:r>
-            <w:proofErr w:type="gramEnd"/>
-            <w:r>
-              <w:rPr>
-                <w:rFonts w:ascii="Courier New" w:hAnsi="Courier New" w:cs="Courier New"/>
-              </w:rPr>
-              <w:t>]</w:t>
-            </w:r>
-            <w:r>
-              <w:rPr>
-                <w:rFonts w:ascii="Courier New" w:hAnsi="Courier New" w:cs="Courier New"/>
-              </w:rPr>
-              <w:t>:</w:t>
-            </w:r>
-            <w:r>
-              <w:br/>
-            </w:r>
-            <w:proofErr w:type="spellStart"/>
-            <w:proofErr w:type="gramStart"/>
-            <w:r>
-              <w:rPr>
-                <w:rFonts w:ascii="Courier New" w:hAnsi="Courier New" w:cs="Courier New"/>
-              </w:rPr>
-              <w:t>self.image</w:t>
-            </w:r>
-            <w:proofErr w:type="spellEnd"/>
-            <w:proofErr w:type="gramEnd"/>
-            <w:r>
-              <w:rPr>
-                <w:rFonts w:ascii="Courier New" w:hAnsi="Courier New" w:cs="Courier New"/>
-              </w:rPr>
-              <w:t xml:space="preserve"> = </w:t>
-            </w:r>
-            <w:proofErr w:type="spellStart"/>
-            <w:proofErr w:type="gramStart"/>
-            <w:r>
-              <w:rPr>
-                <w:rFonts w:ascii="Courier New" w:hAnsi="Courier New" w:cs="Courier New"/>
-              </w:rPr>
-              <w:t>self.image</w:t>
-            </w:r>
-            <w:proofErr w:type="gramEnd"/>
-            <w:r>
-              <w:rPr>
-                <w:rFonts w:ascii="Courier New" w:hAnsi="Courier New" w:cs="Courier New"/>
-              </w:rPr>
-              <w:t>_</w:t>
-            </w:r>
-            <w:proofErr w:type="gramStart"/>
-            <w:r>
-              <w:rPr>
-                <w:rFonts w:ascii="Courier New" w:hAnsi="Courier New" w:cs="Courier New"/>
-              </w:rPr>
-              <w:t>RL</w:t>
-            </w:r>
-            <w:proofErr w:type="spellEnd"/>
-            <w:r>
-              <w:rPr>
-                <w:rFonts w:ascii="Courier New" w:hAnsi="Courier New" w:cs="Courier New"/>
-              </w:rPr>
-              <w:t xml:space="preserve"> </w:t>
-            </w:r>
-            <w:r>
-              <w:rPr>
-                <w:rFonts w:cstheme="minorHAnsi"/>
-              </w:rPr>
-              <w:t xml:space="preserve"> und</w:t>
-            </w:r>
-            <w:proofErr w:type="gramEnd"/>
-            <w:r>
-              <w:rPr>
-                <w:rFonts w:ascii="Courier New" w:hAnsi="Courier New" w:cs="Courier New"/>
-              </w:rPr>
-              <w:t xml:space="preserve">         </w:t>
-            </w:r>
-          </w:p>
-          <w:p>
-            <w:proofErr w:type="spellStart"/>
-            <w:proofErr w:type="gramStart"/>
-            <w:r>
-              <w:rPr>
-                <w:rFonts w:ascii="Courier New" w:hAnsi="Courier New" w:cs="Courier New"/>
-              </w:rPr>
-              <w:t>self.image</w:t>
-            </w:r>
-            <w:proofErr w:type="spellEnd"/>
-            <w:proofErr w:type="gramEnd"/>
-            <w:r>
-              <w:rPr>
-                <w:rFonts w:ascii="Courier New" w:hAnsi="Courier New" w:cs="Courier New"/>
-              </w:rPr>
-              <w:t xml:space="preserve"> = </w:t>
-            </w:r>
-            <w:proofErr w:type="spellStart"/>
-            <w:proofErr w:type="gramStart"/>
-            <w:r>
-              <w:rPr>
-                <w:rFonts w:ascii="Courier New" w:hAnsi="Courier New" w:cs="Courier New"/>
-              </w:rPr>
-              <w:t>self.image</w:t>
-            </w:r>
-            <w:proofErr w:type="gramEnd"/>
-            <w:r>
-              <w:rPr>
-                <w:rFonts w:ascii="Courier New" w:hAnsi="Courier New" w:cs="Courier New"/>
-              </w:rPr>
-              <w:t>_LR</w:t>
+            <w:r>
+              <w:rPr>
+                <w:rFonts w:ascii="Courier New" w:hAnsi="Courier New" w:cs="Courier New"/>
+              </w:rPr>
+              <w:t>self.image_LR</w:t>
             </w:r>
             <w:proofErr w:type="spellEnd"/>
             <w:r>
@@ -39242,45 +37916,20 @@
               </w:rPr>
             </w:pPr>
             <w:proofErr w:type="spellStart"/>
-            <w:proofErr w:type="gramStart"/>
             <w:r>
               <w:rPr>
                 <w:rFonts w:ascii="Courier New" w:hAnsi="Courier New" w:cs="Courier New"/>
                 <w:lang w:val="en-US"/>
               </w:rPr>
-              <w:t>self.rect</w:t>
-            </w:r>
-            <w:proofErr w:type="gramEnd"/>
+              <w:t>self.rect.move_ip</w:t>
+            </w:r>
+            <w:proofErr w:type="spellEnd"/>
             <w:r>
               <w:rPr>
                 <w:rFonts w:ascii="Courier New" w:hAnsi="Courier New" w:cs="Courier New"/>
                 <w:lang w:val="en-US"/>
               </w:rPr>
-              <w:t>.move_</w:t>
-            </w:r>
-            <w:proofErr w:type="gramStart"/>
-            <w:r>
-              <w:rPr>
-                <w:rFonts w:ascii="Courier New" w:hAnsi="Courier New" w:cs="Courier New"/>
-                <w:lang w:val="en-US"/>
-              </w:rPr>
-              <w:t>ip</w:t>
-            </w:r>
-            <w:proofErr w:type="spellEnd"/>
-            <w:r>
-              <w:rPr>
-                <w:rFonts w:ascii="Courier New" w:hAnsi="Courier New" w:cs="Courier New"/>
-                <w:lang w:val="en-US"/>
-              </w:rPr>
-              <w:t>(</w:t>
-            </w:r>
-            <w:proofErr w:type="gramEnd"/>
-            <w:r>
-              <w:rPr>
-                <w:rFonts w:ascii="Courier New" w:hAnsi="Courier New" w:cs="Courier New"/>
-                <w:lang w:val="en-US"/>
-              </w:rPr>
-              <w:t>-10, 0)</w:t>
+              <w:t>(-10, 0)</w:t>
             </w:r>
             <w:r>
               <w:rPr>
@@ -39297,45 +37946,20 @@
               </w:rPr>
             </w:pPr>
             <w:proofErr w:type="spellStart"/>
-            <w:proofErr w:type="gramStart"/>
             <w:r>
               <w:rPr>
                 <w:rFonts w:ascii="Courier New" w:hAnsi="Courier New" w:cs="Courier New"/>
                 <w:lang w:val="en-US"/>
               </w:rPr>
-              <w:t>self.rect</w:t>
-            </w:r>
-            <w:proofErr w:type="gramEnd"/>
+              <w:t>self.rect.move_ip</w:t>
+            </w:r>
+            <w:proofErr w:type="spellEnd"/>
             <w:r>
               <w:rPr>
                 <w:rFonts w:ascii="Courier New" w:hAnsi="Courier New" w:cs="Courier New"/>
                 <w:lang w:val="en-US"/>
               </w:rPr>
-              <w:t>.move_</w:t>
-            </w:r>
-            <w:proofErr w:type="gramStart"/>
-            <w:r>
-              <w:rPr>
-                <w:rFonts w:ascii="Courier New" w:hAnsi="Courier New" w:cs="Courier New"/>
-                <w:lang w:val="en-US"/>
-              </w:rPr>
-              <w:t>ip</w:t>
-            </w:r>
-            <w:proofErr w:type="spellEnd"/>
-            <w:r>
-              <w:rPr>
-                <w:rFonts w:ascii="Courier New" w:hAnsi="Courier New" w:cs="Courier New"/>
-                <w:lang w:val="en-US"/>
-              </w:rPr>
-              <w:t>(</w:t>
-            </w:r>
-            <w:proofErr w:type="gramEnd"/>
-            <w:r>
-              <w:rPr>
-                <w:rFonts w:ascii="Courier New" w:hAnsi="Courier New" w:cs="Courier New"/>
-                <w:lang w:val="en-US"/>
-              </w:rPr>
-              <w:t>10, 0)</w:t>
+              <w:t>(10, 0)</w:t>
             </w:r>
           </w:p>
         </w:tc>
@@ -39468,19 +38092,11 @@
               <w:t xml:space="preserve"> </w:t>
             </w:r>
             <w:proofErr w:type="spellStart"/>
-            <w:proofErr w:type="gramStart"/>
-            <w:r>
-              <w:rPr>
-                <w:rFonts w:ascii="Courier New" w:hAnsi="Courier New" w:cs="Courier New"/>
-              </w:rPr>
-              <w:t>self.rect</w:t>
-            </w:r>
-            <w:proofErr w:type="gramEnd"/>
-            <w:r>
-              <w:rPr>
-                <w:rFonts w:ascii="Courier New" w:hAnsi="Courier New" w:cs="Courier New"/>
-              </w:rPr>
-              <w:t>.center</w:t>
+            <w:r>
+              <w:rPr>
+                <w:rFonts w:ascii="Courier New" w:hAnsi="Courier New" w:cs="Courier New"/>
+              </w:rPr>
+              <w:t>self.rect.center</w:t>
             </w:r>
             <w:proofErr w:type="spellEnd"/>
             <w:r>
@@ -39495,19 +38111,11 @@
           </w:p>
           <w:p>
             <w:proofErr w:type="spellStart"/>
-            <w:proofErr w:type="gramStart"/>
-            <w:r>
-              <w:rPr>
-                <w:rFonts w:ascii="Courier New" w:hAnsi="Courier New" w:cs="Courier New"/>
-              </w:rPr>
-              <w:t>self.rect</w:t>
-            </w:r>
-            <w:proofErr w:type="gramEnd"/>
-            <w:r>
-              <w:rPr>
-                <w:rFonts w:ascii="Courier New" w:hAnsi="Courier New" w:cs="Courier New"/>
-              </w:rPr>
-              <w:t>.center</w:t>
+            <w:r>
+              <w:rPr>
+                <w:rFonts w:ascii="Courier New" w:hAnsi="Courier New" w:cs="Courier New"/>
+              </w:rPr>
+              <w:t>self.rect.center</w:t>
             </w:r>
             <w:proofErr w:type="spellEnd"/>
             <w:r>
@@ -39580,27 +38188,12 @@
               <w:rPr>
                 <w:rFonts w:ascii="Courier New" w:hAnsi="Courier New" w:cs="Courier New"/>
               </w:rPr>
-              <w:t>_</w:t>
-            </w:r>
-            <w:proofErr w:type="gramStart"/>
-            <w:r>
-              <w:rPr>
-                <w:rFonts w:ascii="Courier New" w:hAnsi="Courier New" w:cs="Courier New"/>
-              </w:rPr>
-              <w:t>_(</w:t>
-            </w:r>
-            <w:proofErr w:type="gramEnd"/>
-            <w:r>
-              <w:rPr>
-                <w:rFonts w:ascii="Courier New" w:hAnsi="Courier New" w:cs="Courier New"/>
-              </w:rPr>
-              <w:t>)</w:t>
+              <w:t>__()</w:t>
             </w:r>
             <w:r>
               <w:t xml:space="preserve"> und </w:t>
             </w:r>
             <w:proofErr w:type="spellStart"/>
-            <w:proofErr w:type="gramStart"/>
             <w:r>
               <w:rPr>
                 <w:rFonts w:ascii="Courier New" w:hAnsi="Courier New" w:cs="Courier New"/>
@@ -39612,14 +38205,7 @@
               <w:rPr>
                 <w:rFonts w:ascii="Courier New" w:hAnsi="Courier New" w:cs="Courier New"/>
               </w:rPr>
-              <w:t>(</w:t>
-            </w:r>
-            <w:proofErr w:type="gramEnd"/>
-            <w:r>
-              <w:rPr>
-                <w:rFonts w:ascii="Courier New" w:hAnsi="Courier New" w:cs="Courier New"/>
-              </w:rPr>
-              <w:t>)</w:t>
+              <w:t>()</w:t>
             </w:r>
             <w:r>
               <w:rPr>
@@ -39640,19 +38226,11 @@
               <w:br/>
             </w:r>
             <w:proofErr w:type="spellStart"/>
-            <w:proofErr w:type="gramStart"/>
-            <w:r>
-              <w:rPr>
-                <w:rFonts w:ascii="Courier New" w:hAnsi="Courier New" w:cs="Courier New"/>
-              </w:rPr>
-              <w:t>self.rect</w:t>
-            </w:r>
-            <w:proofErr w:type="gramEnd"/>
-            <w:r>
-              <w:rPr>
-                <w:rFonts w:ascii="Courier New" w:hAnsi="Courier New" w:cs="Courier New"/>
-              </w:rPr>
-              <w:t>.center</w:t>
+            <w:r>
+              <w:rPr>
+                <w:rFonts w:ascii="Courier New" w:hAnsi="Courier New" w:cs="Courier New"/>
+              </w:rPr>
+              <w:t>self.rect.center</w:t>
             </w:r>
             <w:proofErr w:type="spellEnd"/>
             <w:r>
@@ -39668,7 +38246,6 @@
               <w:t>=(</w:t>
             </w:r>
             <w:proofErr w:type="spellStart"/>
-            <w:proofErr w:type="gramStart"/>
             <w:r>
               <w:rPr>
                 <w:rFonts w:ascii="Courier New" w:hAnsi="Courier New" w:cs="Courier New"/>
@@ -39676,26 +38253,11 @@
               <w:t>random.randint</w:t>
             </w:r>
             <w:proofErr w:type="spellEnd"/>
-            <w:proofErr w:type="gramEnd"/>
-            <w:r>
-              <w:rPr>
-                <w:rFonts w:ascii="Courier New" w:hAnsi="Courier New" w:cs="Courier New"/>
-              </w:rPr>
-              <w:t>(</w:t>
-            </w:r>
-            <w:proofErr w:type="gramStart"/>
-            <w:r>
-              <w:rPr>
-                <w:rFonts w:ascii="Courier New" w:hAnsi="Courier New" w:cs="Courier New"/>
-              </w:rPr>
-              <w:t>40,SCREEN</w:t>
-            </w:r>
-            <w:proofErr w:type="gramEnd"/>
-            <w:r>
-              <w:rPr>
-                <w:rFonts w:ascii="Courier New" w:hAnsi="Courier New" w:cs="Courier New"/>
-              </w:rPr>
-              <w:t>_WIDTH-40),0)</w:t>
+            <w:r>
+              <w:rPr>
+                <w:rFonts w:ascii="Courier New" w:hAnsi="Courier New" w:cs="Courier New"/>
+              </w:rPr>
+              <w:t>(40,SCREEN_WIDTH-40),0)</w:t>
             </w:r>
             <w:r>
               <w:rPr>
@@ -39714,21 +38276,28 @@
               </w:rPr>
             </w:pPr>
             <w:proofErr w:type="spellStart"/>
-            <w:proofErr w:type="gramStart"/>
             <w:r>
               <w:rPr>
                 <w:rFonts w:ascii="Courier New" w:hAnsi="Courier New" w:cs="Courier New"/>
                 <w:lang w:val="en-US"/>
               </w:rPr>
-              <w:t>self.rect</w:t>
-            </w:r>
-            <w:proofErr w:type="gramEnd"/>
+              <w:t>self.rect.center</w:t>
+            </w:r>
+            <w:proofErr w:type="spellEnd"/>
             <w:r>
               <w:rPr>
                 <w:rFonts w:ascii="Courier New" w:hAnsi="Courier New" w:cs="Courier New"/>
                 <w:lang w:val="en-US"/>
               </w:rPr>
-              <w:t>.center</w:t>
+              <w:t>=(</w:t>
+            </w:r>
+            <w:proofErr w:type="spellStart"/>
+            <w:r>
+              <w:rPr>
+                <w:rFonts w:ascii="Courier New" w:hAnsi="Courier New" w:cs="Courier New"/>
+                <w:lang w:val="en-US"/>
+              </w:rPr>
+              <w:t>random.randint</w:t>
             </w:r>
             <w:proofErr w:type="spellEnd"/>
             <w:r>
@@ -39736,41 +38305,7 @@
                 <w:rFonts w:ascii="Courier New" w:hAnsi="Courier New" w:cs="Courier New"/>
                 <w:lang w:val="en-US"/>
               </w:rPr>
-              <w:t>=(</w:t>
-            </w:r>
-            <w:proofErr w:type="spellStart"/>
-            <w:proofErr w:type="gramStart"/>
-            <w:r>
-              <w:rPr>
-                <w:rFonts w:ascii="Courier New" w:hAnsi="Courier New" w:cs="Courier New"/>
-                <w:lang w:val="en-US"/>
-              </w:rPr>
-              <w:t>random.randint</w:t>
-            </w:r>
-            <w:proofErr w:type="spellEnd"/>
-            <w:proofErr w:type="gramEnd"/>
-            <w:r>
-              <w:rPr>
-                <w:rFonts w:ascii="Courier New" w:hAnsi="Courier New" w:cs="Courier New"/>
-                <w:lang w:val="en-US"/>
-              </w:rPr>
-              <w:t>(</w:t>
-            </w:r>
-            <w:proofErr w:type="gramStart"/>
-            <w:r>
-              <w:rPr>
-                <w:rFonts w:ascii="Courier New" w:hAnsi="Courier New" w:cs="Courier New"/>
-                <w:lang w:val="en-US"/>
-              </w:rPr>
-              <w:t>150,SCREEN</w:t>
-            </w:r>
-            <w:proofErr w:type="gramEnd"/>
-            <w:r>
-              <w:rPr>
-                <w:rFonts w:ascii="Courier New" w:hAnsi="Courier New" w:cs="Courier New"/>
-                <w:lang w:val="en-US"/>
-              </w:rPr>
-              <w:t>_WIDTH-150),0)</w:t>
+              <w:t>(150,SCREEN_WIDTH-150),0)</w:t>
             </w:r>
           </w:p>
         </w:tc>
@@ -39869,21 +38404,7 @@
               <w:rPr>
                 <w:rFonts w:ascii="Courier New" w:hAnsi="Courier New" w:cs="Courier New"/>
               </w:rPr>
-              <w:t>_</w:t>
-            </w:r>
-            <w:proofErr w:type="gramStart"/>
-            <w:r>
-              <w:rPr>
-                <w:rFonts w:ascii="Courier New" w:hAnsi="Courier New" w:cs="Courier New"/>
-              </w:rPr>
-              <w:t>_(</w:t>
-            </w:r>
-            <w:proofErr w:type="gramEnd"/>
-            <w:r>
-              <w:rPr>
-                <w:rFonts w:ascii="Courier New" w:hAnsi="Courier New" w:cs="Courier New"/>
-              </w:rPr>
-              <w:t>)</w:t>
+              <w:t>__()</w:t>
             </w:r>
             <w:r>
               <w:rPr>
@@ -39924,7 +38445,6 @@
               </w:rPr>
             </w:pPr>
             <w:proofErr w:type="spellStart"/>
-            <w:proofErr w:type="gramStart"/>
             <w:r>
               <w:rPr>
                 <w:rFonts w:ascii="Courier New" w:hAnsi="Courier New" w:cs="Courier New"/>
@@ -39933,7 +38453,6 @@
               <w:t>self.direction</w:t>
             </w:r>
             <w:proofErr w:type="spellEnd"/>
-            <w:proofErr w:type="gramEnd"/>
             <w:r>
               <w:rPr>
                 <w:rFonts w:ascii="Courier New" w:hAnsi="Courier New" w:cs="Courier New"/>
@@ -39958,7 +38477,6 @@
               </w:rPr>
             </w:pPr>
             <w:proofErr w:type="spellStart"/>
-            <w:proofErr w:type="gramStart"/>
             <w:r>
               <w:rPr>
                 <w:rFonts w:ascii="Courier New" w:hAnsi="Courier New" w:cs="Courier New"/>
@@ -39967,7 +38485,6 @@
               <w:t>self.score</w:t>
             </w:r>
             <w:proofErr w:type="spellEnd"/>
-            <w:proofErr w:type="gramEnd"/>
             <w:r>
               <w:rPr>
                 <w:rFonts w:ascii="Courier New" w:hAnsi="Courier New" w:cs="Courier New"/>
@@ -39986,7 +38503,6 @@
               <w:t xml:space="preserve">In der Methode </w:t>
             </w:r>
             <w:proofErr w:type="spellStart"/>
-            <w:proofErr w:type="gramStart"/>
             <w:r>
               <w:rPr>
                 <w:rFonts w:ascii="Courier New" w:hAnsi="Courier New" w:cs="Courier New"/>
@@ -39998,14 +38514,7 @@
               <w:rPr>
                 <w:rFonts w:ascii="Courier New" w:hAnsi="Courier New" w:cs="Courier New"/>
               </w:rPr>
-              <w:t>(</w:t>
-            </w:r>
-            <w:proofErr w:type="gramEnd"/>
-            <w:r>
-              <w:rPr>
-                <w:rFonts w:ascii="Courier New" w:hAnsi="Courier New" w:cs="Courier New"/>
-              </w:rPr>
-              <w:t>)</w:t>
+              <w:t>()</w:t>
             </w:r>
             <w:r>
               <w:t xml:space="preserve"> der Spieler-Klasse werden zwei neue Bedingungen geprüft:</w:t>
@@ -40091,82 +38600,57 @@
                 <w:rFonts w:ascii="Courier New" w:hAnsi="Courier New" w:cs="Courier New"/>
                 <w:lang w:val="en-US"/>
               </w:rPr>
-              <w:t>_</w:t>
-            </w:r>
-            <w:proofErr w:type="gramStart"/>
+              <w:t>_score</w:t>
+            </w:r>
+            <w:proofErr w:type="spellEnd"/>
             <w:r>
               <w:rPr>
                 <w:rFonts w:ascii="Courier New" w:hAnsi="Courier New" w:cs="Courier New"/>
                 <w:lang w:val="en-US"/>
               </w:rPr>
-              <w:t>score</w:t>
+              <w:t>()</w:t>
+            </w:r>
+            <w:r>
+              <w:rPr>
+                <w:lang w:val="en-US"/>
+              </w:rPr>
+              <w:t xml:space="preserve"> </w:t>
+            </w:r>
+            <w:proofErr w:type="spellStart"/>
+            <w:r>
+              <w:rPr>
+                <w:lang w:val="en-US"/>
+              </w:rPr>
+              <w:t>wird</w:t>
             </w:r>
             <w:proofErr w:type="spellEnd"/>
             <w:r>
               <w:rPr>
-                <w:rFonts w:ascii="Courier New" w:hAnsi="Courier New" w:cs="Courier New"/>
                 <w:lang w:val="en-US"/>
               </w:rPr>
-              <w:t>(</w:t>
-            </w:r>
-            <w:proofErr w:type="gramEnd"/>
-            <w:r>
-              <w:rPr>
-                <w:rFonts w:ascii="Courier New" w:hAnsi="Courier New" w:cs="Courier New"/>
+              <w:t xml:space="preserve"> </w:t>
+            </w:r>
+            <w:proofErr w:type="spellStart"/>
+            <w:r>
+              <w:rPr>
                 <w:lang w:val="en-US"/>
               </w:rPr>
-              <w:t>)</w:t>
-            </w:r>
+              <w:t>aus</w:t>
+            </w:r>
+            <w:proofErr w:type="spellEnd"/>
             <w:r>
               <w:rPr>
                 <w:lang w:val="en-US"/>
               </w:rPr>
               <w:t xml:space="preserve"> </w:t>
             </w:r>
-            <w:proofErr w:type="spellStart"/>
-            <w:r>
-              <w:rPr>
+            <w:r>
+              <w:rPr>
+                <w:rFonts w:ascii="Courier New" w:hAnsi="Courier New" w:cs="Courier New"/>
                 <w:lang w:val="en-US"/>
               </w:rPr>
-              <w:t>wird</w:t>
-            </w:r>
-            <w:proofErr w:type="spellEnd"/>
-            <w:r>
-              <w:rPr>
-                <w:lang w:val="en-US"/>
-              </w:rPr>
-              <w:t xml:space="preserve"> </w:t>
-            </w:r>
-            <w:proofErr w:type="spellStart"/>
-            <w:r>
-              <w:rPr>
-                <w:lang w:val="en-US"/>
-              </w:rPr>
-              <w:t>aus</w:t>
-            </w:r>
-            <w:proofErr w:type="spellEnd"/>
-            <w:r>
-              <w:rPr>
-                <w:lang w:val="en-US"/>
-              </w:rPr>
-              <w:t xml:space="preserve"> </w:t>
-            </w:r>
-            <w:r>
-              <w:rPr>
-                <w:rFonts w:ascii="Courier New" w:hAnsi="Courier New" w:cs="Courier New"/>
-                <w:lang w:val="en-US"/>
-              </w:rPr>
-              <w:t>P</w:t>
-            </w:r>
-            <w:proofErr w:type="gramStart"/>
-            <w:r>
-              <w:rPr>
-                <w:rFonts w:ascii="Courier New" w:hAnsi="Courier New" w:cs="Courier New"/>
-                <w:lang w:val="en-US"/>
-              </w:rPr>
-              <w:t>1.score</w:t>
-            </w:r>
-            <w:proofErr w:type="gramEnd"/>
+              <w:t>P1.score</w:t>
+            </w:r>
             <w:r>
               <w:rPr>
                 <w:lang w:val="en-US"/>
@@ -40217,40 +38701,15 @@
                 <w:rFonts w:ascii="Courier New" w:hAnsi="Courier New" w:cs="Courier New"/>
                 <w:lang w:val="en-US"/>
               </w:rPr>
-              <w:t>font_</w:t>
-            </w:r>
-            <w:proofErr w:type="gramStart"/>
+              <w:t>font_small.render</w:t>
+            </w:r>
+            <w:proofErr w:type="spellEnd"/>
             <w:r>
               <w:rPr>
                 <w:rFonts w:ascii="Courier New" w:hAnsi="Courier New" w:cs="Courier New"/>
                 <w:lang w:val="en-US"/>
               </w:rPr>
-              <w:t>small.render</w:t>
-            </w:r>
-            <w:proofErr w:type="spellEnd"/>
-            <w:proofErr w:type="gramEnd"/>
-            <w:r>
-              <w:rPr>
-                <w:rFonts w:ascii="Courier New" w:hAnsi="Courier New" w:cs="Courier New"/>
-                <w:lang w:val="en-US"/>
-              </w:rPr>
-              <w:t>(str(P</w:t>
-            </w:r>
-            <w:proofErr w:type="gramStart"/>
-            <w:r>
-              <w:rPr>
-                <w:rFonts w:ascii="Courier New" w:hAnsi="Courier New" w:cs="Courier New"/>
-                <w:lang w:val="en-US"/>
-              </w:rPr>
-              <w:t>1.score</w:t>
-            </w:r>
-            <w:proofErr w:type="gramEnd"/>
-            <w:r>
-              <w:rPr>
-                <w:rFonts w:ascii="Courier New" w:hAnsi="Courier New" w:cs="Courier New"/>
-                <w:lang w:val="en-US"/>
-              </w:rPr>
-              <w:t>), True, BLACK)</w:t>
+              <w:t>(str(P1.score), True, BLACK)</w:t>
             </w:r>
           </w:p>
         </w:tc>

</xml_diff>

<commit_message>
Kapitel 23: Vorsichtsmaßnahmen korrigiert
</commit_message>
<xml_diff>
--- a/Doc/Arbeitsblaetter_2026.docx
+++ b/Doc/Arbeitsblaetter_2026.docx
@@ -12290,49 +12290,7 @@
                         <w:rPr>
                           <w:rFonts w:ascii="Courier New" w:hAnsi="Courier New" w:cs="Courier New"/>
                         </w:rPr>
-                        <w:t>{'</w:t>
-                      </w:r>
-                      <w:proofErr w:type="spellStart"/>
-                      <w:r>
-                        <w:rPr>
-                          <w:rFonts w:ascii="Courier New" w:hAnsi="Courier New" w:cs="Courier New"/>
-                        </w:rPr>
-                        <w:t>cat</w:t>
-                      </w:r>
-                      <w:proofErr w:type="spellEnd"/>
-                      <w:r>
-                        <w:rPr>
-                          <w:rFonts w:ascii="Courier New" w:hAnsi="Courier New" w:cs="Courier New"/>
-                        </w:rPr>
-                        <w:t>': 'Katze', '</w:t>
-                      </w:r>
-                      <w:proofErr w:type="spellStart"/>
-                      <w:r>
-                        <w:rPr>
-                          <w:rFonts w:ascii="Courier New" w:hAnsi="Courier New" w:cs="Courier New"/>
-                        </w:rPr>
-                        <w:t>dog</w:t>
-                      </w:r>
-                      <w:proofErr w:type="spellEnd"/>
-                      <w:r>
-                        <w:rPr>
-                          <w:rFonts w:ascii="Courier New" w:hAnsi="Courier New" w:cs="Courier New"/>
-                        </w:rPr>
-                        <w:t>': 'Hund', '</w:t>
-                      </w:r>
-                      <w:proofErr w:type="spellStart"/>
-                      <w:r>
-                        <w:rPr>
-                          <w:rFonts w:ascii="Courier New" w:hAnsi="Courier New" w:cs="Courier New"/>
-                        </w:rPr>
-                        <w:t>cow</w:t>
-                      </w:r>
-                      <w:proofErr w:type="spellEnd"/>
-                      <w:r>
-                        <w:rPr>
-                          <w:rFonts w:ascii="Courier New" w:hAnsi="Courier New" w:cs="Courier New"/>
-                        </w:rPr>
-                        <w:t>': 'Kuh'}</w:t>
+                        <w:t>{'cat': 'Katze', 'dog': 'Hund', 'cow': 'Kuh'}</w:t>
                       </w:r>
                     </w:p>
                     <w:p>
@@ -12346,16 +12304,8 @@
                         <w:rPr>
                           <w:rFonts w:ascii="Courier New" w:hAnsi="Courier New" w:cs="Courier New"/>
                         </w:rPr>
-                        <w:t xml:space="preserve">Gib ein englisches Wort an: </w:t>
+                        <w:t>Gib ein englisches Wort an: bird</w:t>
                       </w:r>
-                      <w:proofErr w:type="spellStart"/>
-                      <w:r>
-                        <w:rPr>
-                          <w:rFonts w:ascii="Courier New" w:hAnsi="Courier New" w:cs="Courier New"/>
-                        </w:rPr>
-                        <w:t>bird</w:t>
-                      </w:r>
-                      <w:proofErr w:type="spellEnd"/>
                     </w:p>
                     <w:p>
                       <w:pPr>
@@ -12382,63 +12332,7 @@
                         <w:rPr>
                           <w:rFonts w:ascii="Courier New" w:hAnsi="Courier New" w:cs="Courier New"/>
                         </w:rPr>
-                        <w:t>{'</w:t>
-                      </w:r>
-                      <w:proofErr w:type="spellStart"/>
-                      <w:r>
-                        <w:rPr>
-                          <w:rFonts w:ascii="Courier New" w:hAnsi="Courier New" w:cs="Courier New"/>
-                        </w:rPr>
-                        <w:t>cat</w:t>
-                      </w:r>
-                      <w:proofErr w:type="spellEnd"/>
-                      <w:r>
-                        <w:rPr>
-                          <w:rFonts w:ascii="Courier New" w:hAnsi="Courier New" w:cs="Courier New"/>
-                        </w:rPr>
-                        <w:t>': 'Katze', '</w:t>
-                      </w:r>
-                      <w:proofErr w:type="spellStart"/>
-                      <w:r>
-                        <w:rPr>
-                          <w:rFonts w:ascii="Courier New" w:hAnsi="Courier New" w:cs="Courier New"/>
-                        </w:rPr>
-                        <w:t>dog</w:t>
-                      </w:r>
-                      <w:proofErr w:type="spellEnd"/>
-                      <w:r>
-                        <w:rPr>
-                          <w:rFonts w:ascii="Courier New" w:hAnsi="Courier New" w:cs="Courier New"/>
-                        </w:rPr>
-                        <w:t>': 'Hund', '</w:t>
-                      </w:r>
-                      <w:proofErr w:type="spellStart"/>
-                      <w:r>
-                        <w:rPr>
-                          <w:rFonts w:ascii="Courier New" w:hAnsi="Courier New" w:cs="Courier New"/>
-                        </w:rPr>
-                        <w:t>cow</w:t>
-                      </w:r>
-                      <w:proofErr w:type="spellEnd"/>
-                      <w:r>
-                        <w:rPr>
-                          <w:rFonts w:ascii="Courier New" w:hAnsi="Courier New" w:cs="Courier New"/>
-                        </w:rPr>
-                        <w:t>': 'Kuh', '</w:t>
-                      </w:r>
-                      <w:proofErr w:type="spellStart"/>
-                      <w:r>
-                        <w:rPr>
-                          <w:rFonts w:ascii="Courier New" w:hAnsi="Courier New" w:cs="Courier New"/>
-                        </w:rPr>
-                        <w:t>bird</w:t>
-                      </w:r>
-                      <w:proofErr w:type="spellEnd"/>
-                      <w:r>
-                        <w:rPr>
-                          <w:rFonts w:ascii="Courier New" w:hAnsi="Courier New" w:cs="Courier New"/>
-                        </w:rPr>
-                        <w:t>': 'Vogel'}</w:t>
+                        <w:t>{'cat': 'Katze', 'dog': 'Hund', 'cow': 'Kuh', 'bird': 'Vogel'}</w:t>
                       </w:r>
                     </w:p>
                   </w:txbxContent>
@@ -14378,11 +14272,11 @@
         <w:t xml:space="preserve"> </w:t>
       </w:r>
     </w:p>
-    <w:bookmarkStart w:id="123" w:name="_Toc236424307"/>
     <w:p>
       <w:pPr>
         <w:pStyle w:val="berschrift1"/>
       </w:pPr>
+      <w:bookmarkStart w:id="123" w:name="_Toc236424307"/>
       <w:r>
         <w:rPr>
           <w:noProof/>
@@ -15840,11 +15734,11 @@
         <w:br w:type="page"/>
       </w:r>
     </w:p>
-    <w:bookmarkStart w:id="124" w:name="_Toc236424308"/>
     <w:p>
       <w:pPr>
         <w:pStyle w:val="berschrift1"/>
       </w:pPr>
+      <w:bookmarkStart w:id="124" w:name="_Toc236424308"/>
       <w:r>
         <w:rPr>
           <w:noProof/>
@@ -16513,30 +16407,8 @@
                         <w:rPr>
                           <w:rFonts w:ascii="Courier New" w:hAnsi="Courier New" w:cs="Courier New"/>
                         </w:rPr>
-                        <w:t xml:space="preserve">Denke dir eine Zahl </w:t>
+                        <w:t>Denke dir eine Zahl zwischen  1  und  100</w:t>
                       </w:r>
-                      <w:proofErr w:type="gramStart"/>
-                      <w:r>
-                        <w:rPr>
-                          <w:rFonts w:ascii="Courier New" w:hAnsi="Courier New" w:cs="Courier New"/>
-                        </w:rPr>
-                        <w:t>zwischen  1</w:t>
-                      </w:r>
-                      <w:proofErr w:type="gramEnd"/>
-                      <w:r>
-                        <w:rPr>
-                          <w:rFonts w:ascii="Courier New" w:hAnsi="Courier New" w:cs="Courier New"/>
-                        </w:rPr>
-                        <w:t xml:space="preserve">  </w:t>
-                      </w:r>
-                      <w:proofErr w:type="gramStart"/>
-                      <w:r>
-                        <w:rPr>
-                          <w:rFonts w:ascii="Courier New" w:hAnsi="Courier New" w:cs="Courier New"/>
-                        </w:rPr>
-                        <w:t>und  100</w:t>
-                      </w:r>
-                      <w:proofErr w:type="gramEnd"/>
                     </w:p>
                     <w:p>
                       <w:pPr>
@@ -16561,70 +16433,7 @@
                         <w:rPr>
                           <w:rFonts w:ascii="Courier New" w:hAnsi="Courier New" w:cs="Courier New"/>
                         </w:rPr>
-                        <w:t xml:space="preserve">Der Computer </w:t>
-                      </w:r>
-                      <w:proofErr w:type="gramStart"/>
-                      <w:r>
-                        <w:rPr>
-                          <w:rFonts w:ascii="Courier New" w:hAnsi="Courier New" w:cs="Courier New"/>
-                        </w:rPr>
-                        <w:t>rät  50</w:t>
-                      </w:r>
-                      <w:proofErr w:type="gramEnd"/>
-                    </w:p>
-                    <w:p>
-                      <w:pPr>
-                        <w:rPr>
-                          <w:rFonts w:ascii="Courier New" w:hAnsi="Courier New" w:cs="Courier New"/>
-                        </w:rPr>
-                      </w:pPr>
-                      <w:r>
-                        <w:rPr>
-                          <w:rFonts w:ascii="Courier New" w:hAnsi="Courier New" w:cs="Courier New"/>
-                        </w:rPr>
-                        <w:t>Ist deine Zahl g(</w:t>
-                      </w:r>
-                      <w:proofErr w:type="spellStart"/>
-                      <w:r>
-                        <w:rPr>
-                          <w:rFonts w:ascii="Courier New" w:hAnsi="Courier New" w:cs="Courier New"/>
-                        </w:rPr>
-                        <w:t>rößer</w:t>
-                      </w:r>
-                      <w:proofErr w:type="spellEnd"/>
-                      <w:r>
-                        <w:rPr>
-                          <w:rFonts w:ascii="Courier New" w:hAnsi="Courier New" w:cs="Courier New"/>
-                        </w:rPr>
-                        <w:t>), k(</w:t>
-                      </w:r>
-                      <w:proofErr w:type="spellStart"/>
-                      <w:r>
-                        <w:rPr>
-                          <w:rFonts w:ascii="Courier New" w:hAnsi="Courier New" w:cs="Courier New"/>
-                        </w:rPr>
-                        <w:t>leiner</w:t>
-                      </w:r>
-                      <w:proofErr w:type="spellEnd"/>
-                      <w:r>
-                        <w:rPr>
-                          <w:rFonts w:ascii="Courier New" w:hAnsi="Courier New" w:cs="Courier New"/>
-                        </w:rPr>
-                        <w:t>), e(</w:t>
-                      </w:r>
-                      <w:proofErr w:type="spellStart"/>
-                      <w:r>
-                        <w:rPr>
-                          <w:rFonts w:ascii="Courier New" w:hAnsi="Courier New" w:cs="Courier New"/>
-                        </w:rPr>
-                        <w:t>rraten</w:t>
-                      </w:r>
-                      <w:proofErr w:type="spellEnd"/>
-                      <w:r>
-                        <w:rPr>
-                          <w:rFonts w:ascii="Courier New" w:hAnsi="Courier New" w:cs="Courier New"/>
-                        </w:rPr>
-                        <w:t>)?  g</w:t>
+                        <w:t>Der Computer rät  50</w:t>
                       </w:r>
                     </w:p>
                     <w:p>
@@ -16637,70 +16446,7 @@
                         <w:rPr>
                           <w:rFonts w:ascii="Courier New" w:hAnsi="Courier New" w:cs="Courier New"/>
                         </w:rPr>
-                        <w:t xml:space="preserve">Der Computer </w:t>
-                      </w:r>
-                      <w:proofErr w:type="gramStart"/>
-                      <w:r>
-                        <w:rPr>
-                          <w:rFonts w:ascii="Courier New" w:hAnsi="Courier New" w:cs="Courier New"/>
-                        </w:rPr>
-                        <w:t>rät  75</w:t>
-                      </w:r>
-                      <w:proofErr w:type="gramEnd"/>
-                    </w:p>
-                    <w:p>
-                      <w:pPr>
-                        <w:rPr>
-                          <w:rFonts w:ascii="Courier New" w:hAnsi="Courier New" w:cs="Courier New"/>
-                        </w:rPr>
-                      </w:pPr>
-                      <w:r>
-                        <w:rPr>
-                          <w:rFonts w:ascii="Courier New" w:hAnsi="Courier New" w:cs="Courier New"/>
-                        </w:rPr>
-                        <w:t>Ist deine Zahl g(</w:t>
-                      </w:r>
-                      <w:proofErr w:type="spellStart"/>
-                      <w:r>
-                        <w:rPr>
-                          <w:rFonts w:ascii="Courier New" w:hAnsi="Courier New" w:cs="Courier New"/>
-                        </w:rPr>
-                        <w:t>rößer</w:t>
-                      </w:r>
-                      <w:proofErr w:type="spellEnd"/>
-                      <w:r>
-                        <w:rPr>
-                          <w:rFonts w:ascii="Courier New" w:hAnsi="Courier New" w:cs="Courier New"/>
-                        </w:rPr>
-                        <w:t>), k(</w:t>
-                      </w:r>
-                      <w:proofErr w:type="spellStart"/>
-                      <w:r>
-                        <w:rPr>
-                          <w:rFonts w:ascii="Courier New" w:hAnsi="Courier New" w:cs="Courier New"/>
-                        </w:rPr>
-                        <w:t>leiner</w:t>
-                      </w:r>
-                      <w:proofErr w:type="spellEnd"/>
-                      <w:r>
-                        <w:rPr>
-                          <w:rFonts w:ascii="Courier New" w:hAnsi="Courier New" w:cs="Courier New"/>
-                        </w:rPr>
-                        <w:t>), e(</w:t>
-                      </w:r>
-                      <w:proofErr w:type="spellStart"/>
-                      <w:r>
-                        <w:rPr>
-                          <w:rFonts w:ascii="Courier New" w:hAnsi="Courier New" w:cs="Courier New"/>
-                        </w:rPr>
-                        <w:t>rraten</w:t>
-                      </w:r>
-                      <w:proofErr w:type="spellEnd"/>
-                      <w:r>
-                        <w:rPr>
-                          <w:rFonts w:ascii="Courier New" w:hAnsi="Courier New" w:cs="Courier New"/>
-                        </w:rPr>
-                        <w:t>)?  g</w:t>
+                        <w:t>Ist deine Zahl g(rößer), k(leiner), e(rraten)?  g</w:t>
                       </w:r>
                     </w:p>
                     <w:p>
@@ -16713,70 +16459,7 @@
                         <w:rPr>
                           <w:rFonts w:ascii="Courier New" w:hAnsi="Courier New" w:cs="Courier New"/>
                         </w:rPr>
-                        <w:t xml:space="preserve">Der Computer </w:t>
-                      </w:r>
-                      <w:proofErr w:type="gramStart"/>
-                      <w:r>
-                        <w:rPr>
-                          <w:rFonts w:ascii="Courier New" w:hAnsi="Courier New" w:cs="Courier New"/>
-                        </w:rPr>
-                        <w:t>rät  88</w:t>
-                      </w:r>
-                      <w:proofErr w:type="gramEnd"/>
-                    </w:p>
-                    <w:p>
-                      <w:pPr>
-                        <w:rPr>
-                          <w:rFonts w:ascii="Courier New" w:hAnsi="Courier New" w:cs="Courier New"/>
-                        </w:rPr>
-                      </w:pPr>
-                      <w:r>
-                        <w:rPr>
-                          <w:rFonts w:ascii="Courier New" w:hAnsi="Courier New" w:cs="Courier New"/>
-                        </w:rPr>
-                        <w:t>Ist deine Zahl g(</w:t>
-                      </w:r>
-                      <w:proofErr w:type="spellStart"/>
-                      <w:r>
-                        <w:rPr>
-                          <w:rFonts w:ascii="Courier New" w:hAnsi="Courier New" w:cs="Courier New"/>
-                        </w:rPr>
-                        <w:t>rößer</w:t>
-                      </w:r>
-                      <w:proofErr w:type="spellEnd"/>
-                      <w:r>
-                        <w:rPr>
-                          <w:rFonts w:ascii="Courier New" w:hAnsi="Courier New" w:cs="Courier New"/>
-                        </w:rPr>
-                        <w:t>), k(</w:t>
-                      </w:r>
-                      <w:proofErr w:type="spellStart"/>
-                      <w:r>
-                        <w:rPr>
-                          <w:rFonts w:ascii="Courier New" w:hAnsi="Courier New" w:cs="Courier New"/>
-                        </w:rPr>
-                        <w:t>leiner</w:t>
-                      </w:r>
-                      <w:proofErr w:type="spellEnd"/>
-                      <w:r>
-                        <w:rPr>
-                          <w:rFonts w:ascii="Courier New" w:hAnsi="Courier New" w:cs="Courier New"/>
-                        </w:rPr>
-                        <w:t>), e(</w:t>
-                      </w:r>
-                      <w:proofErr w:type="spellStart"/>
-                      <w:r>
-                        <w:rPr>
-                          <w:rFonts w:ascii="Courier New" w:hAnsi="Courier New" w:cs="Courier New"/>
-                        </w:rPr>
-                        <w:t>rraten</w:t>
-                      </w:r>
-                      <w:proofErr w:type="spellEnd"/>
-                      <w:r>
-                        <w:rPr>
-                          <w:rFonts w:ascii="Courier New" w:hAnsi="Courier New" w:cs="Courier New"/>
-                        </w:rPr>
-                        <w:t>)?  k</w:t>
+                        <w:t>Der Computer rät  75</w:t>
                       </w:r>
                     </w:p>
                     <w:p>
@@ -16789,70 +16472,7 @@
                         <w:rPr>
                           <w:rFonts w:ascii="Courier New" w:hAnsi="Courier New" w:cs="Courier New"/>
                         </w:rPr>
-                        <w:t xml:space="preserve">Der Computer </w:t>
-                      </w:r>
-                      <w:proofErr w:type="gramStart"/>
-                      <w:r>
-                        <w:rPr>
-                          <w:rFonts w:ascii="Courier New" w:hAnsi="Courier New" w:cs="Courier New"/>
-                        </w:rPr>
-                        <w:t>rät  81</w:t>
-                      </w:r>
-                      <w:proofErr w:type="gramEnd"/>
-                    </w:p>
-                    <w:p>
-                      <w:pPr>
-                        <w:rPr>
-                          <w:rFonts w:ascii="Courier New" w:hAnsi="Courier New" w:cs="Courier New"/>
-                        </w:rPr>
-                      </w:pPr>
-                      <w:r>
-                        <w:rPr>
-                          <w:rFonts w:ascii="Courier New" w:hAnsi="Courier New" w:cs="Courier New"/>
-                        </w:rPr>
-                        <w:t>Ist deine Zahl g(</w:t>
-                      </w:r>
-                      <w:proofErr w:type="spellStart"/>
-                      <w:r>
-                        <w:rPr>
-                          <w:rFonts w:ascii="Courier New" w:hAnsi="Courier New" w:cs="Courier New"/>
-                        </w:rPr>
-                        <w:t>rößer</w:t>
-                      </w:r>
-                      <w:proofErr w:type="spellEnd"/>
-                      <w:r>
-                        <w:rPr>
-                          <w:rFonts w:ascii="Courier New" w:hAnsi="Courier New" w:cs="Courier New"/>
-                        </w:rPr>
-                        <w:t>), k(</w:t>
-                      </w:r>
-                      <w:proofErr w:type="spellStart"/>
-                      <w:r>
-                        <w:rPr>
-                          <w:rFonts w:ascii="Courier New" w:hAnsi="Courier New" w:cs="Courier New"/>
-                        </w:rPr>
-                        <w:t>leiner</w:t>
-                      </w:r>
-                      <w:proofErr w:type="spellEnd"/>
-                      <w:r>
-                        <w:rPr>
-                          <w:rFonts w:ascii="Courier New" w:hAnsi="Courier New" w:cs="Courier New"/>
-                        </w:rPr>
-                        <w:t>), e(</w:t>
-                      </w:r>
-                      <w:proofErr w:type="spellStart"/>
-                      <w:r>
-                        <w:rPr>
-                          <w:rFonts w:ascii="Courier New" w:hAnsi="Courier New" w:cs="Courier New"/>
-                        </w:rPr>
-                        <w:t>rraten</w:t>
-                      </w:r>
-                      <w:proofErr w:type="spellEnd"/>
-                      <w:r>
-                        <w:rPr>
-                          <w:rFonts w:ascii="Courier New" w:hAnsi="Courier New" w:cs="Courier New"/>
-                        </w:rPr>
-                        <w:t>)?  k</w:t>
+                        <w:t>Ist deine Zahl g(rößer), k(leiner), e(rraten)?  g</w:t>
                       </w:r>
                     </w:p>
                     <w:p>
@@ -16865,70 +16485,7 @@
                         <w:rPr>
                           <w:rFonts w:ascii="Courier New" w:hAnsi="Courier New" w:cs="Courier New"/>
                         </w:rPr>
-                        <w:t xml:space="preserve">Der Computer </w:t>
-                      </w:r>
-                      <w:proofErr w:type="gramStart"/>
-                      <w:r>
-                        <w:rPr>
-                          <w:rFonts w:ascii="Courier New" w:hAnsi="Courier New" w:cs="Courier New"/>
-                        </w:rPr>
-                        <w:t>rät  78</w:t>
-                      </w:r>
-                      <w:proofErr w:type="gramEnd"/>
-                    </w:p>
-                    <w:p>
-                      <w:pPr>
-                        <w:rPr>
-                          <w:rFonts w:ascii="Courier New" w:hAnsi="Courier New" w:cs="Courier New"/>
-                        </w:rPr>
-                      </w:pPr>
-                      <w:r>
-                        <w:rPr>
-                          <w:rFonts w:ascii="Courier New" w:hAnsi="Courier New" w:cs="Courier New"/>
-                        </w:rPr>
-                        <w:t>Ist deine Zahl g(</w:t>
-                      </w:r>
-                      <w:proofErr w:type="spellStart"/>
-                      <w:r>
-                        <w:rPr>
-                          <w:rFonts w:ascii="Courier New" w:hAnsi="Courier New" w:cs="Courier New"/>
-                        </w:rPr>
-                        <w:t>rößer</w:t>
-                      </w:r>
-                      <w:proofErr w:type="spellEnd"/>
-                      <w:r>
-                        <w:rPr>
-                          <w:rFonts w:ascii="Courier New" w:hAnsi="Courier New" w:cs="Courier New"/>
-                        </w:rPr>
-                        <w:t>), k(</w:t>
-                      </w:r>
-                      <w:proofErr w:type="spellStart"/>
-                      <w:r>
-                        <w:rPr>
-                          <w:rFonts w:ascii="Courier New" w:hAnsi="Courier New" w:cs="Courier New"/>
-                        </w:rPr>
-                        <w:t>leiner</w:t>
-                      </w:r>
-                      <w:proofErr w:type="spellEnd"/>
-                      <w:r>
-                        <w:rPr>
-                          <w:rFonts w:ascii="Courier New" w:hAnsi="Courier New" w:cs="Courier New"/>
-                        </w:rPr>
-                        <w:t>), e(</w:t>
-                      </w:r>
-                      <w:proofErr w:type="spellStart"/>
-                      <w:r>
-                        <w:rPr>
-                          <w:rFonts w:ascii="Courier New" w:hAnsi="Courier New" w:cs="Courier New"/>
-                        </w:rPr>
-                        <w:t>rraten</w:t>
-                      </w:r>
-                      <w:proofErr w:type="spellEnd"/>
-                      <w:r>
-                        <w:rPr>
-                          <w:rFonts w:ascii="Courier New" w:hAnsi="Courier New" w:cs="Courier New"/>
-                        </w:rPr>
-                        <w:t>)?  k</w:t>
+                        <w:t>Der Computer rät  88</w:t>
                       </w:r>
                     </w:p>
                     <w:p>
@@ -16941,16 +16498,8 @@
                         <w:rPr>
                           <w:rFonts w:ascii="Courier New" w:hAnsi="Courier New" w:cs="Courier New"/>
                         </w:rPr>
-                        <w:t xml:space="preserve">Der Computer </w:t>
+                        <w:t>Ist deine Zahl g(rößer), k(leiner), e(rraten)?  k</w:t>
                       </w:r>
-                      <w:proofErr w:type="gramStart"/>
-                      <w:r>
-                        <w:rPr>
-                          <w:rFonts w:ascii="Courier New" w:hAnsi="Courier New" w:cs="Courier New"/>
-                        </w:rPr>
-                        <w:t>rät  76</w:t>
-                      </w:r>
-                      <w:proofErr w:type="gramEnd"/>
                     </w:p>
                     <w:p>
                       <w:pPr>
@@ -16962,49 +16511,72 @@
                         <w:rPr>
                           <w:rFonts w:ascii="Courier New" w:hAnsi="Courier New" w:cs="Courier New"/>
                         </w:rPr>
-                        <w:t>Ist deine Zahl g(</w:t>
+                        <w:t>Der Computer rät  81</w:t>
                       </w:r>
-                      <w:proofErr w:type="spellStart"/>
+                    </w:p>
+                    <w:p>
+                      <w:pPr>
+                        <w:rPr>
+                          <w:rFonts w:ascii="Courier New" w:hAnsi="Courier New" w:cs="Courier New"/>
+                        </w:rPr>
+                      </w:pPr>
                       <w:r>
                         <w:rPr>
                           <w:rFonts w:ascii="Courier New" w:hAnsi="Courier New" w:cs="Courier New"/>
                         </w:rPr>
-                        <w:t>rößer</w:t>
+                        <w:t>Ist deine Zahl g(rößer), k(leiner), e(rraten)?  k</w:t>
                       </w:r>
-                      <w:proofErr w:type="spellEnd"/>
+                    </w:p>
+                    <w:p>
+                      <w:pPr>
+                        <w:rPr>
+                          <w:rFonts w:ascii="Courier New" w:hAnsi="Courier New" w:cs="Courier New"/>
+                        </w:rPr>
+                      </w:pPr>
                       <w:r>
                         <w:rPr>
                           <w:rFonts w:ascii="Courier New" w:hAnsi="Courier New" w:cs="Courier New"/>
                         </w:rPr>
-                        <w:t>), k(</w:t>
+                        <w:t>Der Computer rät  78</w:t>
                       </w:r>
-                      <w:proofErr w:type="spellStart"/>
+                    </w:p>
+                    <w:p>
+                      <w:pPr>
+                        <w:rPr>
+                          <w:rFonts w:ascii="Courier New" w:hAnsi="Courier New" w:cs="Courier New"/>
+                        </w:rPr>
+                      </w:pPr>
                       <w:r>
                         <w:rPr>
                           <w:rFonts w:ascii="Courier New" w:hAnsi="Courier New" w:cs="Courier New"/>
                         </w:rPr>
-                        <w:t>leiner</w:t>
+                        <w:t>Ist deine Zahl g(rößer), k(leiner), e(rraten)?  k</w:t>
                       </w:r>
-                      <w:proofErr w:type="spellEnd"/>
+                    </w:p>
+                    <w:p>
+                      <w:pPr>
+                        <w:rPr>
+                          <w:rFonts w:ascii="Courier New" w:hAnsi="Courier New" w:cs="Courier New"/>
+                        </w:rPr>
+                      </w:pPr>
                       <w:r>
                         <w:rPr>
                           <w:rFonts w:ascii="Courier New" w:hAnsi="Courier New" w:cs="Courier New"/>
                         </w:rPr>
-                        <w:t>), e(</w:t>
+                        <w:t>Der Computer rät  76</w:t>
                       </w:r>
-                      <w:proofErr w:type="spellStart"/>
+                    </w:p>
+                    <w:p>
+                      <w:pPr>
+                        <w:rPr>
+                          <w:rFonts w:ascii="Courier New" w:hAnsi="Courier New" w:cs="Courier New"/>
+                        </w:rPr>
+                      </w:pPr>
                       <w:r>
                         <w:rPr>
                           <w:rFonts w:ascii="Courier New" w:hAnsi="Courier New" w:cs="Courier New"/>
                         </w:rPr>
-                        <w:t>rraten</w:t>
-                      </w:r>
-                      <w:proofErr w:type="spellEnd"/>
-                      <w:r>
-                        <w:rPr>
-                          <w:rFonts w:ascii="Courier New" w:hAnsi="Courier New" w:cs="Courier New"/>
-                        </w:rPr>
-                        <w:t>)?  e</w:t>
+                        <w:t>Ist deine Zahl g(rößer), k(leiner), e(rraten)?  e</w:t>
                       </w:r>
                     </w:p>
                     <w:p>
@@ -17749,7 +17321,6 @@
                           <w:color w:val="000000" w:themeColor="text1"/>
                         </w:rPr>
                       </w:pPr>
-                      <w:proofErr w:type="spellStart"/>
                       <w:r>
                         <w:rPr>
                           <w:color w:val="000000" w:themeColor="text1"/>
@@ -17762,7 +17333,6 @@
                         </w:rPr>
                         <w:t>t</w:t>
                       </w:r>
-                      <w:proofErr w:type="spellEnd"/>
                     </w:p>
                   </w:txbxContent>
                 </v:textbox>
@@ -18013,7 +17583,6 @@
                           <w:color w:val="000000" w:themeColor="text1"/>
                         </w:rPr>
                       </w:pPr>
-                      <w:proofErr w:type="spellStart"/>
                       <w:r>
                         <w:rPr>
                           <w:color w:val="000000" w:themeColor="text1"/>
@@ -18026,7 +17595,6 @@
                         </w:rPr>
                         <w:t>t</w:t>
                       </w:r>
-                      <w:proofErr w:type="spellEnd"/>
                     </w:p>
                   </w:txbxContent>
                 </v:textbox>
@@ -19428,14 +18996,12 @@
                           <w:color w:val="000000" w:themeColor="text1"/>
                         </w:rPr>
                       </w:pPr>
-                      <w:proofErr w:type="spellStart"/>
                       <w:r>
                         <w:rPr>
                           <w:color w:val="000000" w:themeColor="text1"/>
                         </w:rPr>
                         <w:t>tuple</w:t>
                       </w:r>
-                      <w:proofErr w:type="spellEnd"/>
                     </w:p>
                   </w:txbxContent>
                 </v:textbox>
@@ -20048,14 +19614,12 @@
                           <w:color w:val="000000" w:themeColor="text1"/>
                         </w:rPr>
                       </w:pPr>
-                      <w:proofErr w:type="spellStart"/>
                       <w:r>
                         <w:rPr>
                           <w:color w:val="000000" w:themeColor="text1"/>
                         </w:rPr>
                         <w:t>list</w:t>
                       </w:r>
-                      <w:proofErr w:type="spellEnd"/>
                     </w:p>
                   </w:txbxContent>
                 </v:textbox>
@@ -24146,11 +23710,11 @@
         <w:br w:type="page"/>
       </w:r>
     </w:p>
-    <w:bookmarkStart w:id="131" w:name="_Toc236424315"/>
     <w:p>
       <w:pPr>
         <w:pStyle w:val="berschrift1"/>
       </w:pPr>
+      <w:bookmarkStart w:id="131" w:name="_Toc236424315"/>
       <w:r>
         <w:rPr>
           <w:noProof/>
@@ -27180,11 +26744,11 @@
     </w:p>
     <w:p/>
     <w:p/>
-    <w:bookmarkStart w:id="135" w:name="_Toc236424319"/>
     <w:p>
       <w:pPr>
         <w:pStyle w:val="berschrift1"/>
       </w:pPr>
+      <w:bookmarkStart w:id="135" w:name="_Toc236424319"/>
       <w:r>
         <w:rPr>
           <w:noProof/>
@@ -30094,15 +29658,9 @@
             </w:r>
           </w:p>
           <w:p>
-            <w:pPr>
-              <w:rPr>
-                <w:lang w:val="en-US"/>
-              </w:rPr>
-            </w:pPr>
-            <w:r>
-              <w:rPr>
-                <w:rFonts w:ascii="Courier New" w:hAnsi="Courier New" w:cs="Courier New"/>
-                <w:lang w:val="en-US"/>
+            <w:r>
+              <w:rPr>
+                <w:rFonts w:ascii="Courier New" w:hAnsi="Courier New" w:cs="Courier New"/>
               </w:rPr>
               <w:t>maze.update_position(start_row - 2, start_col)</w:t>
             </w:r>
@@ -30112,23 +29670,11 @@
           <w:tcPr>
             <w:tcW w:w="3827" w:type="dxa"/>
           </w:tcPr>
-          <w:p>
-            <w:pPr>
-              <w:rPr>
-                <w:lang w:val="en-US"/>
-              </w:rPr>
-            </w:pPr>
-          </w:p>
+          <w:p/>
         </w:tc>
       </w:tr>
     </w:tbl>
-    <w:p>
-      <w:pPr>
-        <w:rPr>
-          <w:lang w:val="en-US"/>
-        </w:rPr>
-      </w:pPr>
-    </w:p>
+    <w:p/>
     <w:p>
       <w:r>
         <w:rPr>
@@ -34361,16 +33907,7 @@
         <w:t xml:space="preserve">Die Löcher des Steckbretts sind entlang der gelben Linien miteinander verbunden. </w:t>
       </w:r>
     </w:p>
-    <w:p>
-      <w:pPr>
-        <w:pStyle w:val="Listenabsatz"/>
-        <w:numPr>
-          <w:ilvl w:val="0"/>
-          <w:numId w:val="45"/>
-        </w:numPr>
-        <w:spacing w:before="240"/>
-      </w:pPr>
-    </w:p>
+    <w:p/>
     <w:p>
       <w:pPr>
         <w:spacing w:before="120"/>
@@ -34469,7 +34006,16 @@
         <w:t>trennen</w:t>
       </w:r>
       <w:r>
-        <w:t xml:space="preserve">, dann Bauteile und Schaltdrähte in das Steckbrett stecken. </w:t>
+        <w:t xml:space="preserve">, dann </w:t>
+      </w:r>
+      <w:r>
+        <w:t xml:space="preserve">Erweiterungsboard, Steckbrett und </w:t>
+      </w:r>
+      <w:r>
+        <w:t xml:space="preserve">Bauteile </w:t>
+      </w:r>
+      <w:r>
+        <w:t>verdrahten.</w:t>
       </w:r>
     </w:p>
     <w:p>
@@ -34528,7 +34074,13 @@
         <w:t>Kein Kurzschluss!</w:t>
       </w:r>
       <w:r>
-        <w:t xml:space="preserve"> Beim Kurzschluss fließt ein hoher Strom, der GPIOs, Dioden und Transistoren zerstört.</w:t>
+        <w:t xml:space="preserve"> Bei</w:t>
+      </w:r>
+      <w:r>
+        <w:t xml:space="preserve"> einem</w:t>
+      </w:r>
+      <w:r>
+        <w:t xml:space="preserve"> Kurzschluss fließt ein hoher Strom, der GPIOs, Dioden und Transistoren zerstört.</w:t>
       </w:r>
     </w:p>
     <w:p>

</xml_diff>

<commit_message>
Kapitel 9: Definition einer Funktion korrigiert
</commit_message>
<xml_diff>
--- a/Doc/Arbeitsblaetter_2026.docx
+++ b/Doc/Arbeitsblaetter_2026.docx
@@ -14272,11 +14272,11 @@
         <w:t xml:space="preserve"> </w:t>
       </w:r>
     </w:p>
+    <w:bookmarkStart w:id="123" w:name="_Toc236424307"/>
     <w:p>
       <w:pPr>
         <w:pStyle w:val="berschrift1"/>
       </w:pPr>
-      <w:bookmarkStart w:id="123" w:name="_Toc236424307"/>
       <w:r>
         <w:rPr>
           <w:noProof/>
@@ -15734,11 +15734,11 @@
         <w:br w:type="page"/>
       </w:r>
     </w:p>
+    <w:bookmarkStart w:id="124" w:name="_Toc236424308"/>
     <w:p>
       <w:pPr>
         <w:pStyle w:val="berschrift1"/>
       </w:pPr>
-      <w:bookmarkStart w:id="124" w:name="_Toc236424308"/>
       <w:r>
         <w:rPr>
           <w:noProof/>
@@ -19970,7 +19970,7 @@
               <w:rPr>
                 <w:rFonts w:ascii="Courier New" w:hAnsi="Courier New" w:cs="Courier New"/>
               </w:rPr>
-              <w:t>:[</w:t>
+              <w:t>:</w:t>
             </w:r>
             <w:r>
               <w:rPr>
@@ -19982,7 +19982,7 @@
               <w:rPr>
                 <w:rFonts w:ascii="Courier New" w:hAnsi="Courier New" w:cs="Courier New"/>
               </w:rPr>
-              <w:t>]):</w:t>
+              <w:t>):</w:t>
             </w:r>
           </w:p>
         </w:tc>
@@ -23710,11 +23710,11 @@
         <w:br w:type="page"/>
       </w:r>
     </w:p>
+    <w:bookmarkStart w:id="131" w:name="_Toc236424315"/>
     <w:p>
       <w:pPr>
         <w:pStyle w:val="berschrift1"/>
       </w:pPr>
-      <w:bookmarkStart w:id="131" w:name="_Toc236424315"/>
       <w:r>
         <w:rPr>
           <w:noProof/>
@@ -26744,11 +26744,11 @@
     </w:p>
     <w:p/>
     <w:p/>
+    <w:bookmarkStart w:id="135" w:name="_Toc236424319"/>
     <w:p>
       <w:pPr>
         <w:pStyle w:val="berschrift1"/>
       </w:pPr>
-      <w:bookmarkStart w:id="135" w:name="_Toc236424319"/>
       <w:r>
         <w:rPr>
           <w:noProof/>

</xml_diff>